<commit_message>
[not] ActiFlot MOA user manuel review
</commit_message>
<xml_diff>
--- a/projects/activity-calendar/doc/Guide_utilisateur_OPUS_enquete_activite.docx
+++ b/projects/activity-calendar/doc/Guide_utilisateur_OPUS_enquete_activite.docx
@@ -94,6 +94,8 @@
         <w:t>Sommaire</w:t>
       </w:r>
     </w:p>
+    <w:commentRangeStart w:id="1"/>
+    <w:commentRangeStart w:id="2"/>
     <w:p>
       <w:pPr>
         <w:numPr>
@@ -109,19 +111,37 @@
           <w:lang w:eastAsia="fr-FR"/>
         </w:rPr>
       </w:pPr>
-      <w:hyperlink w:anchor="pr%C3%A9requis" w:history="1">
-        <w:r>
-          <w:rPr>
-            <w:rFonts w:ascii="Times New Roman" w:eastAsia="Times New Roman" w:hAnsi="Times New Roman" w:cs="Times New Roman"/>
-            <w:color w:val="0000FF"/>
-            <w:sz w:val="24"/>
-            <w:szCs w:val="24"/>
-            <w:u w:val="single"/>
-            <w:lang w:eastAsia="fr-FR"/>
-          </w:rPr>
-          <w:t>Prérequis</w:t>
-        </w:r>
-      </w:hyperlink>
+      <w:r>
+        <w:fldChar w:fldCharType="begin"/>
+      </w:r>
+      <w:r>
+        <w:instrText xml:space="preserve"> HYPERLINK \l "pr%C3%A9requis" </w:instrText>
+      </w:r>
+      <w:r>
+        <w:fldChar w:fldCharType="separate"/>
+      </w:r>
+      <w:r>
+        <w:rPr>
+          <w:rFonts w:ascii="Times New Roman" w:eastAsia="Times New Roman" w:hAnsi="Times New Roman" w:cs="Times New Roman"/>
+          <w:color w:val="0000FF"/>
+          <w:sz w:val="24"/>
+          <w:szCs w:val="24"/>
+          <w:u w:val="single"/>
+          <w:lang w:eastAsia="fr-FR"/>
+        </w:rPr>
+        <w:t>Prérequis</w:t>
+      </w:r>
+      <w:r>
+        <w:rPr>
+          <w:rFonts w:ascii="Times New Roman" w:eastAsia="Times New Roman" w:hAnsi="Times New Roman" w:cs="Times New Roman"/>
+          <w:color w:val="0000FF"/>
+          <w:sz w:val="24"/>
+          <w:szCs w:val="24"/>
+          <w:u w:val="single"/>
+          <w:lang w:eastAsia="fr-FR"/>
+        </w:rPr>
+        <w:fldChar w:fldCharType="end"/>
+      </w:r>
     </w:p>
     <w:p>
       <w:pPr>
@@ -239,6 +259,7 @@
         </w:r>
       </w:hyperlink>
     </w:p>
+    <w:commentRangeStart w:id="3"/>
     <w:p>
       <w:pPr>
         <w:numPr>
@@ -254,19 +275,44 @@
           <w:lang w:eastAsia="fr-FR"/>
         </w:rPr>
       </w:pPr>
-      <w:hyperlink w:anchor="s%C3%A9lectionner-des-cellules-des-lign" w:history="1">
-        <w:r>
-          <w:rPr>
-            <w:rFonts w:ascii="Times New Roman" w:eastAsia="Times New Roman" w:hAnsi="Times New Roman" w:cs="Times New Roman"/>
-            <w:color w:val="0000FF"/>
-            <w:sz w:val="24"/>
-            <w:szCs w:val="24"/>
-            <w:u w:val="single"/>
-            <w:lang w:eastAsia="fr-FR"/>
-          </w:rPr>
-          <w:t>Sélectionner des cellules, des lignes et des colonnes</w:t>
-        </w:r>
-      </w:hyperlink>
+      <w:r>
+        <w:fldChar w:fldCharType="begin"/>
+      </w:r>
+      <w:r>
+        <w:instrText xml:space="preserve"> HYPERLINK \l "s%C3%A9lectionner-des-cellules-des-lign" </w:instrText>
+      </w:r>
+      <w:r>
+        <w:fldChar w:fldCharType="separate"/>
+      </w:r>
+      <w:r>
+        <w:rPr>
+          <w:rFonts w:ascii="Times New Roman" w:eastAsia="Times New Roman" w:hAnsi="Times New Roman" w:cs="Times New Roman"/>
+          <w:color w:val="0000FF"/>
+          <w:sz w:val="24"/>
+          <w:szCs w:val="24"/>
+          <w:u w:val="single"/>
+          <w:lang w:eastAsia="fr-FR"/>
+        </w:rPr>
+        <w:t>Sélectionner des cellules, des lignes et des colonnes</w:t>
+      </w:r>
+      <w:r>
+        <w:rPr>
+          <w:rFonts w:ascii="Times New Roman" w:eastAsia="Times New Roman" w:hAnsi="Times New Roman" w:cs="Times New Roman"/>
+          <w:color w:val="0000FF"/>
+          <w:sz w:val="24"/>
+          <w:szCs w:val="24"/>
+          <w:u w:val="single"/>
+          <w:lang w:eastAsia="fr-FR"/>
+        </w:rPr>
+        <w:fldChar w:fldCharType="end"/>
+      </w:r>
+      <w:commentRangeEnd w:id="3"/>
+      <w:r>
+        <w:rPr>
+          <w:rStyle w:val="Marquedecommentaire"/>
+        </w:rPr>
+        <w:commentReference w:id="3"/>
+      </w:r>
     </w:p>
     <w:p>
       <w:pPr>
@@ -550,6 +596,13 @@
           <w:t>Générer les formulaires et rapports</w:t>
         </w:r>
       </w:hyperlink>
+      <w:commentRangeEnd w:id="1"/>
+      <w:r>
+        <w:rPr>
+          <w:rStyle w:val="Marquedecommentaire"/>
+        </w:rPr>
+        <w:commentReference w:id="1"/>
+      </w:r>
     </w:p>
     <w:p>
       <w:pPr>
@@ -599,6 +652,13 @@
           <w:lang w:eastAsia="fr-FR"/>
         </w:rPr>
         <w:t>Remonter un bug informatique</w:t>
+      </w:r>
+      <w:commentRangeEnd w:id="2"/>
+      <w:r>
+        <w:rPr>
+          <w:rStyle w:val="Marquedecommentaire"/>
+        </w:rPr>
+        <w:commentReference w:id="2"/>
       </w:r>
     </w:p>
     <w:p>
@@ -1017,7 +1077,7 @@
                     <pic:cNvPicPr/>
                   </pic:nvPicPr>
                   <pic:blipFill>
-                    <a:blip r:embed="rId6" cstate="print">
+                    <a:blip r:embed="rId10" cstate="print">
                       <a:extLst>
                         <a:ext uri="{28A0092B-C50C-407E-A947-70E740481C1C}">
                           <a14:useLocalDpi xmlns:a14="http://schemas.microsoft.com/office/drawing/2010/main" val="0"/>
@@ -1286,7 +1346,7 @@
                     <pic:cNvPicPr/>
                   </pic:nvPicPr>
                   <pic:blipFill>
-                    <a:blip r:embed="rId7">
+                    <a:blip r:embed="rId11">
                       <a:extLst>
                         <a:ext uri="{28A0092B-C50C-407E-A947-70E740481C1C}">
                           <a14:useLocalDpi xmlns:a14="http://schemas.microsoft.com/office/drawing/2010/main" val="0"/>
@@ -1355,8 +1415,8 @@
           <w:lang w:eastAsia="fr-FR"/>
         </w:rPr>
       </w:pPr>
-      <w:bookmarkStart w:id="1" w:name="_Hlk187246293"/>
-      <w:bookmarkStart w:id="2" w:name="_Hlk187910202"/>
+      <w:bookmarkStart w:id="4" w:name="_Hlk187246293"/>
+      <w:bookmarkStart w:id="5" w:name="_Hlk187910202"/>
     </w:p>
     <w:p>
       <w:pPr>
@@ -1500,7 +1560,7 @@
         </w:rPr>
         <w:t>aramètres</w:t>
       </w:r>
-      <w:bookmarkEnd w:id="1"/>
+      <w:bookmarkEnd w:id="4"/>
       <w:r>
         <w:rPr>
           <w:rFonts w:ascii="Times New Roman" w:eastAsia="Times New Roman" w:hAnsi="Times New Roman" w:cs="Times New Roman"/>
@@ -1725,6 +1785,7 @@
         </w:rPr>
         <w:t xml:space="preserve"> </w:t>
       </w:r>
+      <w:commentRangeStart w:id="6"/>
       <w:r>
         <w:rPr>
           <w:rFonts w:ascii="Times New Roman" w:hAnsi="Times New Roman" w:cs="Times New Roman"/>
@@ -1769,6 +1830,13 @@
           <w:lang w:eastAsia="fr-FR"/>
         </w:rPr>
         <w:t>.</w:t>
+      </w:r>
+      <w:commentRangeEnd w:id="6"/>
+      <w:r>
+        <w:rPr>
+          <w:rStyle w:val="Marquedecommentaire"/>
+        </w:rPr>
+        <w:commentReference w:id="6"/>
       </w:r>
     </w:p>
     <w:p>
@@ -1816,7 +1884,7 @@
                     <pic:cNvPicPr/>
                   </pic:nvPicPr>
                   <pic:blipFill>
-                    <a:blip r:embed="rId8" cstate="print">
+                    <a:blip r:embed="rId12" cstate="print">
                       <a:extLst>
                         <a:ext uri="{28A0092B-C50C-407E-A947-70E740481C1C}">
                           <a14:useLocalDpi xmlns:a14="http://schemas.microsoft.com/office/drawing/2010/main" val="0"/>
@@ -1865,7 +1933,7 @@
         </w:rPr>
       </w:pPr>
     </w:p>
-    <w:bookmarkEnd w:id="2"/>
+    <w:bookmarkEnd w:id="5"/>
     <w:p>
       <w:pPr>
         <w:spacing w:before="100" w:beforeAutospacing="1" w:after="100" w:afterAutospacing="1" w:line="240" w:lineRule="auto"/>
@@ -1914,7 +1982,7 @@
                           </pic:cNvPicPr>
                         </pic:nvPicPr>
                         <pic:blipFill>
-                          <a:blip r:embed="rId9">
+                          <a:blip r:embed="rId13">
                             <a:extLst>
                               <a:ext uri="{28A0092B-C50C-407E-A947-70E740481C1C}">
                                 <a14:useLocalDpi xmlns:a14="http://schemas.microsoft.com/office/drawing/2010/main" val="0"/>
@@ -2012,7 +2080,7 @@
                   <o:lock v:ext="edit" aspectratio="t"/>
                 </v:shapetype>
                 <v:shape id="Image 67" o:spid="_x0000_s1027" type="#_x0000_t75" style="position:absolute;left:409;width:36519;height:14751;visibility:visible;mso-wrap-style:square" o:gfxdata="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" stroked="t" strokecolor="#4472c4 [3204]">
-                  <v:imagedata r:id="rId10" o:title=""/>
+                  <v:imagedata r:id="rId14" o:title=""/>
                   <v:path arrowok="t"/>
                 </v:shape>
                 <v:roundrect id="Rectangle : coins arrondis 49" o:spid="_x0000_s1028" style="position:absolute;top:7574;width:7574;height:2047;visibility:visible;mso-wrap-style:square;v-text-anchor:middle" arcsize="10923f" o:gfxdata="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" filled="f" strokecolor="red" strokeweight="1pt">
@@ -2024,7 +2092,7 @@
           </mc:Fallback>
         </mc:AlternateContent>
       </w:r>
-      <w:bookmarkStart w:id="3" w:name="_Hlk187910941"/>
+      <w:bookmarkStart w:id="7" w:name="_Hlk187910941"/>
     </w:p>
     <w:p>
       <w:pPr>
@@ -2067,7 +2135,7 @@
                     <pic:cNvPicPr/>
                   </pic:nvPicPr>
                   <pic:blipFill>
-                    <a:blip r:embed="rId11" cstate="print">
+                    <a:blip r:embed="rId15" cstate="print">
                       <a:extLst>
                         <a:ext uri="{28A0092B-C50C-407E-A947-70E740481C1C}">
                           <a14:useLocalDpi xmlns:a14="http://schemas.microsoft.com/office/drawing/2010/main" val="0"/>
@@ -2226,7 +2294,7 @@
         <w:t>.</w:t>
       </w:r>
     </w:p>
-    <w:bookmarkEnd w:id="3"/>
+    <w:bookmarkEnd w:id="7"/>
     <w:p>
       <w:pPr>
         <w:pStyle w:val="Paragraphedeliste"/>
@@ -2462,7 +2530,7 @@
                     </pic:cNvPicPr>
                   </pic:nvPicPr>
                   <pic:blipFill>
-                    <a:blip r:embed="rId12">
+                    <a:blip r:embed="rId16">
                       <a:extLst>
                         <a:ext uri="{28A0092B-C50C-407E-A947-70E740481C1C}">
                           <a14:useLocalDpi xmlns:a14="http://schemas.microsoft.com/office/drawing/2010/main" val="0"/>
@@ -2583,7 +2651,7 @@
                     </pic:cNvPicPr>
                   </pic:nvPicPr>
                   <pic:blipFill>
-                    <a:blip r:embed="rId13">
+                    <a:blip r:embed="rId17">
                       <a:extLst>
                         <a:ext uri="{28A0092B-C50C-407E-A947-70E740481C1C}">
                           <a14:useLocalDpi xmlns:a14="http://schemas.microsoft.com/office/drawing/2010/main" val="0"/>
@@ -2643,6 +2711,7 @@
         </w:rPr>
         <w:t xml:space="preserve"> </w:t>
       </w:r>
+      <w:commentRangeStart w:id="8"/>
       <w:r>
         <w:rPr>
           <w:rFonts w:ascii="Times New Roman" w:eastAsia="Times New Roman" w:hAnsi="Times New Roman" w:cs="Times New Roman"/>
@@ -2660,6 +2729,13 @@
           <w:lang w:eastAsia="fr-FR"/>
         </w:rPr>
         <w:t>Utiliser les préférences de mon compte utilisateur</w:t>
+      </w:r>
+      <w:commentRangeEnd w:id="8"/>
+      <w:r>
+        <w:rPr>
+          <w:rStyle w:val="Marquedecommentaire"/>
+        </w:rPr>
+        <w:commentReference w:id="8"/>
       </w:r>
       <w:r>
         <w:rPr>
@@ -2743,7 +2819,7 @@
                     </pic:cNvPicPr>
                   </pic:nvPicPr>
                   <pic:blipFill>
-                    <a:blip r:embed="rId14">
+                    <a:blip r:embed="rId18">
                       <a:extLst>
                         <a:ext uri="{28A0092B-C50C-407E-A947-70E740481C1C}">
                           <a14:useLocalDpi xmlns:a14="http://schemas.microsoft.com/office/drawing/2010/main" val="0"/>
@@ -3025,7 +3101,7 @@
                     <pic:cNvPicPr/>
                   </pic:nvPicPr>
                   <pic:blipFill>
-                    <a:blip r:embed="rId15" cstate="print">
+                    <a:blip r:embed="rId19" cstate="print">
                       <a:extLst>
                         <a:ext uri="{28A0092B-C50C-407E-A947-70E740481C1C}">
                           <a14:useLocalDpi xmlns:a14="http://schemas.microsoft.com/office/drawing/2010/main" val="0"/>
@@ -3535,7 +3611,7 @@
                     <pic:cNvPicPr/>
                   </pic:nvPicPr>
                   <pic:blipFill>
-                    <a:blip r:embed="rId16" cstate="print">
+                    <a:blip r:embed="rId20" cstate="print">
                       <a:extLst>
                         <a:ext uri="{28A0092B-C50C-407E-A947-70E740481C1C}">
                           <a14:useLocalDpi xmlns:a14="http://schemas.microsoft.com/office/drawing/2010/main" val="0"/>
@@ -3637,7 +3713,7 @@
                     </pic:cNvPicPr>
                   </pic:nvPicPr>
                   <pic:blipFill>
-                    <a:blip r:embed="rId17" cstate="print">
+                    <a:blip r:embed="rId21" cstate="print">
                       <a:extLst>
                         <a:ext uri="{28A0092B-C50C-407E-A947-70E740481C1C}">
                           <a14:useLocalDpi xmlns:a14="http://schemas.microsoft.com/office/drawing/2010/main" val="0"/>
@@ -3981,7 +4057,7 @@
                     <pic:cNvPicPr/>
                   </pic:nvPicPr>
                   <pic:blipFill>
-                    <a:blip r:embed="rId18" cstate="print">
+                    <a:blip r:embed="rId22" cstate="print">
                       <a:extLst>
                         <a:ext uri="{28A0092B-C50C-407E-A947-70E740481C1C}">
                           <a14:useLocalDpi xmlns:a14="http://schemas.microsoft.com/office/drawing/2010/main" val="0"/>
@@ -4058,7 +4134,7 @@
                     </pic:cNvPicPr>
                   </pic:nvPicPr>
                   <pic:blipFill>
-                    <a:blip r:embed="rId19">
+                    <a:blip r:embed="rId23">
                       <a:extLst>
                         <a:ext uri="{28A0092B-C50C-407E-A947-70E740481C1C}">
                           <a14:useLocalDpi xmlns:a14="http://schemas.microsoft.com/office/drawing/2010/main" val="0"/>
@@ -4382,7 +4458,27 @@
           <w:szCs w:val="24"/>
           <w:lang w:eastAsia="fr-FR"/>
         </w:rPr>
-        <w:t xml:space="preserve"> de l’année de saisie</w:t>
+        <w:t xml:space="preserve"> </w:t>
+      </w:r>
+      <w:del w:id="9" w:author="Vincent FACHERO, Ifremer Brest PDG-IRSI-ISI, 02 " w:date="2025-02-07T09:17:00Z">
+        <w:r>
+          <w:rPr>
+            <w:rFonts w:ascii="Times New Roman" w:hAnsi="Times New Roman" w:cs="Times New Roman"/>
+            <w:sz w:val="24"/>
+            <w:szCs w:val="24"/>
+            <w:lang w:eastAsia="fr-FR"/>
+          </w:rPr>
+          <w:delText xml:space="preserve">de </w:delText>
+        </w:r>
+      </w:del>
+      <w:r>
+        <w:rPr>
+          <w:rFonts w:ascii="Times New Roman" w:hAnsi="Times New Roman" w:cs="Times New Roman"/>
+          <w:sz w:val="24"/>
+          <w:szCs w:val="24"/>
+          <w:lang w:eastAsia="fr-FR"/>
+        </w:rPr>
+        <w:t>l’année de saisie</w:t>
       </w:r>
       <w:r>
         <w:rPr>
@@ -4435,7 +4531,7 @@
                     </pic:cNvPicPr>
                   </pic:nvPicPr>
                   <pic:blipFill>
-                    <a:blip r:embed="rId20" cstate="print">
+                    <a:blip r:embed="rId24" cstate="print">
                       <a:extLst>
                         <a:ext uri="{28A0092B-C50C-407E-A947-70E740481C1C}">
                           <a14:useLocalDpi xmlns:a14="http://schemas.microsoft.com/office/drawing/2010/main" val="0"/>
@@ -4742,7 +4838,7 @@
                     </pic:cNvPicPr>
                   </pic:nvPicPr>
                   <pic:blipFill>
-                    <a:blip r:embed="rId21" cstate="print">
+                    <a:blip r:embed="rId25" cstate="print">
                       <a:extLst>
                         <a:ext uri="{28A0092B-C50C-407E-A947-70E740481C1C}">
                           <a14:useLocalDpi xmlns:a14="http://schemas.microsoft.com/office/drawing/2010/main" val="0"/>
@@ -4829,7 +4925,7 @@
                     </pic:cNvPicPr>
                   </pic:nvPicPr>
                   <pic:blipFill>
-                    <a:blip r:embed="rId22">
+                    <a:blip r:embed="rId26">
                       <a:extLst>
                         <a:ext uri="{28A0092B-C50C-407E-A947-70E740481C1C}">
                           <a14:useLocalDpi xmlns:a14="http://schemas.microsoft.com/office/drawing/2010/main" val="0"/>
@@ -5011,7 +5107,6 @@
           <w:lang w:eastAsia="fr-FR"/>
         </w:rPr>
       </w:pPr>
-      <w:proofErr w:type="gramStart"/>
       <w:r>
         <w:rPr>
           <w:rFonts w:ascii="Times New Roman" w:hAnsi="Times New Roman" w:cs="Times New Roman"/>
@@ -5019,17 +5114,7 @@
           <w:szCs w:val="24"/>
           <w:lang w:eastAsia="fr-FR"/>
         </w:rPr>
-        <w:t>car</w:t>
-      </w:r>
-      <w:proofErr w:type="gramEnd"/>
-      <w:r>
-        <w:rPr>
-          <w:rFonts w:ascii="Times New Roman" w:hAnsi="Times New Roman" w:cs="Times New Roman"/>
-          <w:sz w:val="24"/>
-          <w:szCs w:val="24"/>
-          <w:lang w:eastAsia="fr-FR"/>
-        </w:rPr>
-        <w:t xml:space="preserve"> il est le seul</w:t>
+        <w:t>car il est le seul</w:t>
       </w:r>
       <w:r>
         <w:rPr>
@@ -5190,7 +5275,7 @@
                     </pic:cNvPicPr>
                   </pic:nvPicPr>
                   <pic:blipFill>
-                    <a:blip r:embed="rId23">
+                    <a:blip r:embed="rId27">
                       <a:extLst>
                         <a:ext uri="{28A0092B-C50C-407E-A947-70E740481C1C}">
                           <a14:useLocalDpi xmlns:a14="http://schemas.microsoft.com/office/drawing/2010/main" val="0"/>
@@ -5313,6 +5398,7 @@
           <w:lang w:eastAsia="fr-FR"/>
         </w:rPr>
       </w:pPr>
+      <w:commentRangeStart w:id="10"/>
       <w:r>
         <w:rPr>
           <w:rFonts w:ascii="Times New Roman" w:eastAsia="Times New Roman" w:hAnsi="Times New Roman" w:cs="Times New Roman"/>
@@ -5367,7 +5453,23 @@
           <w:szCs w:val="24"/>
           <w:lang w:eastAsia="fr-FR"/>
         </w:rPr>
-        <w:t>: Liste exhaustive des navires de la zone de compétence choisie.</w:t>
+        <w:t>: Liste exhaustive des navires de la zone de compétence choisie</w:t>
+      </w:r>
+      <w:commentRangeEnd w:id="10"/>
+      <w:r>
+        <w:rPr>
+          <w:rStyle w:val="Marquedecommentaire"/>
+        </w:rPr>
+        <w:commentReference w:id="10"/>
+      </w:r>
+      <w:r>
+        <w:rPr>
+          <w:rFonts w:ascii="Times New Roman" w:hAnsi="Times New Roman" w:cs="Times New Roman"/>
+          <w:sz w:val="24"/>
+          <w:szCs w:val="24"/>
+          <w:lang w:eastAsia="fr-FR"/>
+        </w:rPr>
+        <w:t>.</w:t>
       </w:r>
       <w:r>
         <w:rPr>
@@ -5573,7 +5675,7 @@
                     </pic:cNvPicPr>
                   </pic:nvPicPr>
                   <pic:blipFill>
-                    <a:blip r:embed="rId24">
+                    <a:blip r:embed="rId28">
                       <a:extLst>
                         <a:ext uri="{28A0092B-C50C-407E-A947-70E740481C1C}">
                           <a14:useLocalDpi xmlns:a14="http://schemas.microsoft.com/office/drawing/2010/main" val="0"/>
@@ -6058,6 +6160,7 @@
         </w:rPr>
         <w:t xml:space="preserve"> </w:t>
       </w:r>
+      <w:commentRangeStart w:id="11"/>
       <w:r>
         <w:rPr>
           <w:rFonts w:ascii="Times New Roman" w:hAnsi="Times New Roman" w:cs="Times New Roman"/>
@@ -6065,7 +6168,23 @@
           <w:szCs w:val="24"/>
           <w:lang w:eastAsia="fr-FR"/>
         </w:rPr>
-        <w:t xml:space="preserve">cercles à cocher </w:t>
+        <w:t xml:space="preserve">cercles </w:t>
+      </w:r>
+      <w:commentRangeEnd w:id="11"/>
+      <w:r>
+        <w:rPr>
+          <w:rStyle w:val="Marquedecommentaire"/>
+        </w:rPr>
+        <w:commentReference w:id="11"/>
+      </w:r>
+      <w:r>
+        <w:rPr>
+          <w:rFonts w:ascii="Times New Roman" w:hAnsi="Times New Roman" w:cs="Times New Roman"/>
+          <w:sz w:val="24"/>
+          <w:szCs w:val="24"/>
+          <w:lang w:eastAsia="fr-FR"/>
+        </w:rPr>
+        <w:t xml:space="preserve">à cocher </w:t>
       </w:r>
       <w:r>
         <w:rPr>
@@ -6253,7 +6372,7 @@
                     <pic:cNvPicPr/>
                   </pic:nvPicPr>
                   <pic:blipFill rotWithShape="1">
-                    <a:blip r:embed="rId25" cstate="print">
+                    <a:blip r:embed="rId29" cstate="print">
                       <a:extLst>
                         <a:ext uri="{28A0092B-C50C-407E-A947-70E740481C1C}">
                           <a14:useLocalDpi xmlns:a14="http://schemas.microsoft.com/office/drawing/2010/main" val="0"/>
@@ -6328,7 +6447,7 @@
           <w:lang w:eastAsia="fr-FR"/>
         </w:rPr>
       </w:pPr>
-      <w:bookmarkStart w:id="4" w:name="_Hlk188530029"/>
+      <w:bookmarkStart w:id="12" w:name="_Hlk188530029"/>
       <w:r>
         <w:rPr>
           <w:rFonts w:ascii="Times New Roman" w:eastAsia="Times New Roman" w:hAnsi="Times New Roman" w:cs="Times New Roman"/>
@@ -6361,7 +6480,7 @@
         </w:rPr>
         <w:t xml:space="preserve">Il est possible d'épingler un calendrier ou l'onglet d'un calendrier afin de le conserver dans le </w:t>
       </w:r>
-      <w:bookmarkEnd w:id="4"/>
+      <w:bookmarkEnd w:id="12"/>
       <w:r>
         <w:rPr>
           <w:rFonts w:ascii="Times New Roman" w:eastAsia="Times New Roman" w:hAnsi="Times New Roman" w:cs="Times New Roman"/>
@@ -6513,7 +6632,7 @@
           <w:lang w:eastAsia="fr-FR"/>
         </w:rPr>
       </w:pPr>
-      <w:bookmarkStart w:id="5" w:name="_Hlk187911468"/>
+      <w:bookmarkStart w:id="13" w:name="_Hlk187911468"/>
       <w:r>
         <w:rPr>
           <w:rFonts w:ascii="Times New Roman" w:eastAsia="Times New Roman" w:hAnsi="Times New Roman" w:cs="Times New Roman"/>
@@ -6547,7 +6666,7 @@
                     <pic:cNvPicPr/>
                   </pic:nvPicPr>
                   <pic:blipFill>
-                    <a:blip r:embed="rId26" cstate="print">
+                    <a:blip r:embed="rId30" cstate="print">
                       <a:extLst>
                         <a:ext uri="{28A0092B-C50C-407E-A947-70E740481C1C}">
                           <a14:useLocalDpi xmlns:a14="http://schemas.microsoft.com/office/drawing/2010/main" val="0"/>
@@ -6602,6 +6721,7 @@
         </w:rPr>
         <w:t xml:space="preserve"> </w:t>
       </w:r>
+      <w:commentRangeStart w:id="14"/>
       <w:r>
         <w:rPr>
           <w:rFonts w:ascii="Times New Roman" w:eastAsia="Times New Roman" w:hAnsi="Times New Roman" w:cs="Times New Roman"/>
@@ -6686,7 +6806,14 @@
         </w:rPr>
         <w:t>s’appliquer systématiquement.</w:t>
       </w:r>
-      <w:bookmarkEnd w:id="5"/>
+      <w:bookmarkEnd w:id="13"/>
+      <w:commentRangeEnd w:id="14"/>
+      <w:r>
+        <w:rPr>
+          <w:rStyle w:val="Marquedecommentaire"/>
+        </w:rPr>
+        <w:commentReference w:id="14"/>
+      </w:r>
     </w:p>
     <w:p>
       <w:pPr>
@@ -7080,7 +7207,33 @@
           <w:szCs w:val="24"/>
           <w:lang w:eastAsia="fr-FR"/>
         </w:rPr>
-        <w:t xml:space="preserve"> le plus possible grâce</w:t>
+        <w:t xml:space="preserve"> </w:t>
+      </w:r>
+      <w:commentRangeStart w:id="15"/>
+      <w:r>
+        <w:rPr>
+          <w:rFonts w:ascii="Times New Roman" w:eastAsia="Times New Roman" w:hAnsi="Times New Roman" w:cs="Times New Roman"/>
+          <w:sz w:val="24"/>
+          <w:szCs w:val="24"/>
+          <w:lang w:eastAsia="fr-FR"/>
+        </w:rPr>
+        <w:t xml:space="preserve">le plus possible </w:t>
+      </w:r>
+      <w:commentRangeEnd w:id="15"/>
+      <w:r>
+        <w:rPr>
+          <w:rStyle w:val="Marquedecommentaire"/>
+        </w:rPr>
+        <w:commentReference w:id="15"/>
+      </w:r>
+      <w:r>
+        <w:rPr>
+          <w:rFonts w:ascii="Times New Roman" w:eastAsia="Times New Roman" w:hAnsi="Times New Roman" w:cs="Times New Roman"/>
+          <w:sz w:val="24"/>
+          <w:szCs w:val="24"/>
+          <w:lang w:eastAsia="fr-FR"/>
+        </w:rPr>
+        <w:t>grâce</w:t>
       </w:r>
       <w:r>
         <w:rPr>
@@ -7143,7 +7296,7 @@
                     </pic:cNvPicPr>
                   </pic:nvPicPr>
                   <pic:blipFill>
-                    <a:blip r:embed="rId27" cstate="print">
+                    <a:blip r:embed="rId31" cstate="print">
                       <a:extLst>
                         <a:ext uri="{28A0092B-C50C-407E-A947-70E740481C1C}">
                           <a14:useLocalDpi xmlns:a14="http://schemas.microsoft.com/office/drawing/2010/main" val="0"/>
@@ -7424,7 +7577,7 @@
                     </pic:cNvPicPr>
                   </pic:nvPicPr>
                   <pic:blipFill>
-                    <a:blip r:embed="rId28">
+                    <a:blip r:embed="rId32">
                       <a:extLst>
                         <a:ext uri="{28A0092B-C50C-407E-A947-70E740481C1C}">
                           <a14:useLocalDpi xmlns:a14="http://schemas.microsoft.com/office/drawing/2010/main" val="0"/>
@@ -7501,7 +7654,7 @@
                     </pic:cNvPicPr>
                   </pic:nvPicPr>
                   <pic:blipFill>
-                    <a:blip r:embed="rId29">
+                    <a:blip r:embed="rId33">
                       <a:extLst>
                         <a:ext uri="{28A0092B-C50C-407E-A947-70E740481C1C}">
                           <a14:useLocalDpi xmlns:a14="http://schemas.microsoft.com/office/drawing/2010/main" val="0"/>
@@ -7973,7 +8126,7 @@
                     </pic:cNvPicPr>
                   </pic:nvPicPr>
                   <pic:blipFill>
-                    <a:blip r:embed="rId30">
+                    <a:blip r:embed="rId34">
                       <a:extLst>
                         <a:ext uri="{28A0092B-C50C-407E-A947-70E740481C1C}">
                           <a14:useLocalDpi xmlns:a14="http://schemas.microsoft.com/office/drawing/2010/main" val="0"/>
@@ -8137,7 +8290,7 @@
                     </pic:cNvPicPr>
                   </pic:nvPicPr>
                   <pic:blipFill>
-                    <a:blip r:embed="rId31">
+                    <a:blip r:embed="rId35">
                       <a:extLst>
                         <a:ext uri="{28A0092B-C50C-407E-A947-70E740481C1C}">
                           <a14:useLocalDpi xmlns:a14="http://schemas.microsoft.com/office/drawing/2010/main" val="0"/>
@@ -8316,7 +8469,7 @@
                     </pic:cNvPicPr>
                   </pic:nvPicPr>
                   <pic:blipFill>
-                    <a:blip r:embed="rId32">
+                    <a:blip r:embed="rId36">
                       <a:extLst>
                         <a:ext uri="{28A0092B-C50C-407E-A947-70E740481C1C}">
                           <a14:useLocalDpi xmlns:a14="http://schemas.microsoft.com/office/drawing/2010/main" val="0"/>
@@ -8387,7 +8540,7 @@
                     </pic:cNvPicPr>
                   </pic:nvPicPr>
                   <pic:blipFill>
-                    <a:blip r:embed="rId33">
+                    <a:blip r:embed="rId37">
                       <a:extLst>
                         <a:ext uri="{28A0092B-C50C-407E-A947-70E740481C1C}">
                           <a14:useLocalDpi xmlns:a14="http://schemas.microsoft.com/office/drawing/2010/main" val="0"/>
@@ -8863,7 +9016,7 @@
                     </pic:cNvPicPr>
                   </pic:nvPicPr>
                   <pic:blipFill>
-                    <a:blip r:embed="rId34" cstate="print">
+                    <a:blip r:embed="rId38" cstate="print">
                       <a:extLst>
                         <a:ext uri="{28A0092B-C50C-407E-A947-70E740481C1C}">
                           <a14:useLocalDpi xmlns:a14="http://schemas.microsoft.com/office/drawing/2010/main" val="0"/>
@@ -8958,7 +9111,7 @@
                     </pic:cNvPicPr>
                   </pic:nvPicPr>
                   <pic:blipFill>
-                    <a:blip r:embed="rId35" cstate="print">
+                    <a:blip r:embed="rId39" cstate="print">
                       <a:extLst>
                         <a:ext uri="{28A0092B-C50C-407E-A947-70E740481C1C}">
                           <a14:useLocalDpi xmlns:a14="http://schemas.microsoft.com/office/drawing/2010/main" val="0"/>
@@ -9180,7 +9333,7 @@
                     </pic:cNvPicPr>
                   </pic:nvPicPr>
                   <pic:blipFill>
-                    <a:blip r:embed="rId36">
+                    <a:blip r:embed="rId40">
                       <a:extLst>
                         <a:ext uri="{28A0092B-C50C-407E-A947-70E740481C1C}">
                           <a14:useLocalDpi xmlns:a14="http://schemas.microsoft.com/office/drawing/2010/main" val="0"/>
@@ -9524,7 +9677,7 @@
                     </pic:cNvPicPr>
                   </pic:nvPicPr>
                   <pic:blipFill>
-                    <a:blip r:embed="rId37">
+                    <a:blip r:embed="rId41">
                       <a:extLst>
                         <a:ext uri="{28A0092B-C50C-407E-A947-70E740481C1C}">
                           <a14:useLocalDpi xmlns:a14="http://schemas.microsoft.com/office/drawing/2010/main" val="0"/>
@@ -9871,6 +10024,7 @@
           <w:lang w:eastAsia="fr-FR"/>
         </w:rPr>
       </w:pPr>
+      <w:commentRangeStart w:id="16"/>
       <w:r>
         <w:rPr>
           <w:rFonts w:ascii="Times New Roman" w:eastAsia="Times New Roman" w:hAnsi="Times New Roman" w:cs="Times New Roman"/>
@@ -9914,6 +10068,13 @@
           <w:lang w:eastAsia="fr-FR"/>
         </w:rPr>
         <w:t xml:space="preserve"> n’apparaîtra. Idem concernant un nombre excessif de personnes à bord.</w:t>
+      </w:r>
+      <w:commentRangeEnd w:id="16"/>
+      <w:r>
+        <w:rPr>
+          <w:rStyle w:val="Marquedecommentaire"/>
+        </w:rPr>
+        <w:commentReference w:id="16"/>
       </w:r>
     </w:p>
     <w:p>
@@ -9967,7 +10128,7 @@
                     </pic:cNvPicPr>
                   </pic:nvPicPr>
                   <pic:blipFill>
-                    <a:blip r:embed="rId38">
+                    <a:blip r:embed="rId42">
                       <a:extLst>
                         <a:ext uri="{28A0092B-C50C-407E-A947-70E740481C1C}">
                           <a14:useLocalDpi xmlns:a14="http://schemas.microsoft.com/office/drawing/2010/main" val="0"/>
@@ -10254,7 +10415,7 @@
                     </pic:cNvPicPr>
                   </pic:nvPicPr>
                   <pic:blipFill>
-                    <a:blip r:embed="rId39">
+                    <a:blip r:embed="rId43">
                       <a:extLst>
                         <a:ext uri="{28A0092B-C50C-407E-A947-70E740481C1C}">
                           <a14:useLocalDpi xmlns:a14="http://schemas.microsoft.com/office/drawing/2010/main" val="0"/>
@@ -10354,7 +10515,7 @@
                     </pic:cNvPicPr>
                   </pic:nvPicPr>
                   <pic:blipFill>
-                    <a:blip r:embed="rId40">
+                    <a:blip r:embed="rId44">
                       <a:extLst>
                         <a:ext uri="{28A0092B-C50C-407E-A947-70E740481C1C}">
                           <a14:useLocalDpi xmlns:a14="http://schemas.microsoft.com/office/drawing/2010/main" val="0"/>
@@ -10584,7 +10745,7 @@
                     </pic:cNvPicPr>
                   </pic:nvPicPr>
                   <pic:blipFill>
-                    <a:blip r:embed="rId41">
+                    <a:blip r:embed="rId45">
                       <a:extLst>
                         <a:ext uri="{28A0092B-C50C-407E-A947-70E740481C1C}">
                           <a14:useLocalDpi xmlns:a14="http://schemas.microsoft.com/office/drawing/2010/main" val="0"/>
@@ -10655,7 +10816,7 @@
                     </pic:cNvPicPr>
                   </pic:nvPicPr>
                   <pic:blipFill>
-                    <a:blip r:embed="rId42">
+                    <a:blip r:embed="rId46">
                       <a:extLst>
                         <a:ext uri="{28A0092B-C50C-407E-A947-70E740481C1C}">
                           <a14:useLocalDpi xmlns:a14="http://schemas.microsoft.com/office/drawing/2010/main" val="0"/>
@@ -10949,7 +11110,7 @@
                     </pic:cNvPicPr>
                   </pic:nvPicPr>
                   <pic:blipFill>
-                    <a:blip r:embed="rId43">
+                    <a:blip r:embed="rId47">
                       <a:extLst>
                         <a:ext uri="{28A0092B-C50C-407E-A947-70E740481C1C}">
                           <a14:useLocalDpi xmlns:a14="http://schemas.microsoft.com/office/drawing/2010/main" val="0"/>
@@ -11038,6 +11199,7 @@
           <w:lang w:eastAsia="fr-FR"/>
         </w:rPr>
       </w:pPr>
+      <w:commentRangeStart w:id="17"/>
       <w:r>
         <w:rPr>
           <w:rFonts w:ascii="Times New Roman" w:eastAsia="Times New Roman" w:hAnsi="Times New Roman" w:cs="Times New Roman"/>
@@ -11047,7 +11209,25 @@
           <w:szCs w:val="24"/>
           <w:lang w:eastAsia="fr-FR"/>
         </w:rPr>
-        <w:t>N.B. : afin de mettre à jour les différents gradients du rectangle ou sous-rectangle statistique sélectionner, veuillez cliquer sur une cellule hors de la colonne active, puis resélectionner la cellule de gradient et faire votre choix dans la liste déroulante.</w:t>
+        <w:t>N.B. : afin de mettre à jour les différents gradients du rectangle ou sous-rectangle statistique sélectionner, veuillez cliquer sur une cellule hors de la colonne active, puis resélectionner la cellule de gradient et faire votre choix dans la liste déroulante</w:t>
+      </w:r>
+      <w:commentRangeEnd w:id="17"/>
+      <w:r>
+        <w:rPr>
+          <w:rStyle w:val="Marquedecommentaire"/>
+        </w:rPr>
+        <w:commentReference w:id="17"/>
+      </w:r>
+      <w:r>
+        <w:rPr>
+          <w:rFonts w:ascii="Times New Roman" w:eastAsia="Times New Roman" w:hAnsi="Times New Roman" w:cs="Times New Roman"/>
+          <w:i/>
+          <w:iCs/>
+          <w:sz w:val="24"/>
+          <w:szCs w:val="24"/>
+          <w:lang w:eastAsia="fr-FR"/>
+        </w:rPr>
+        <w:t>.</w:t>
       </w:r>
     </w:p>
     <w:p>
@@ -11234,6 +11414,7 @@
           <w:noProof/>
         </w:rPr>
       </w:pPr>
+      <w:commentRangeStart w:id="18"/>
       <w:r>
         <w:rPr>
           <w:noProof/>
@@ -11272,7 +11453,7 @@
                     </pic:cNvPicPr>
                   </pic:nvPicPr>
                   <pic:blipFill>
-                    <a:blip r:embed="rId44">
+                    <a:blip r:embed="rId48">
                       <a:extLst>
                         <a:ext uri="{28A0092B-C50C-407E-A947-70E740481C1C}">
                           <a14:useLocalDpi xmlns:a14="http://schemas.microsoft.com/office/drawing/2010/main" val="0"/>
@@ -11343,7 +11524,7 @@
                     </pic:cNvPicPr>
                   </pic:nvPicPr>
                   <pic:blipFill>
-                    <a:blip r:embed="rId45">
+                    <a:blip r:embed="rId49">
                       <a:extLst>
                         <a:ext uri="{28A0092B-C50C-407E-A947-70E740481C1C}">
                           <a14:useLocalDpi xmlns:a14="http://schemas.microsoft.com/office/drawing/2010/main" val="0"/>
@@ -11406,7 +11587,7 @@
                     </pic:cNvPicPr>
                   </pic:nvPicPr>
                   <pic:blipFill>
-                    <a:blip r:embed="rId46">
+                    <a:blip r:embed="rId50">
                       <a:extLst>
                         <a:ext uri="{28A0092B-C50C-407E-A947-70E740481C1C}">
                           <a14:useLocalDpi xmlns:a14="http://schemas.microsoft.com/office/drawing/2010/main" val="0"/>
@@ -11744,6 +11925,13 @@
         </w:rPr>
         <w:t>.</w:t>
       </w:r>
+      <w:commentRangeEnd w:id="18"/>
+      <w:r>
+        <w:rPr>
+          <w:rStyle w:val="Marquedecommentaire"/>
+        </w:rPr>
+        <w:commentReference w:id="18"/>
+      </w:r>
     </w:p>
     <w:p>
       <w:pPr>
@@ -11768,6 +11956,7 @@
           <w:noProof/>
         </w:rPr>
       </w:pPr>
+      <w:commentRangeStart w:id="19"/>
       <w:r>
         <w:rPr>
           <w:rFonts w:ascii="Times New Roman" w:eastAsia="Times New Roman" w:hAnsi="Times New Roman" w:cs="Times New Roman"/>
@@ -12103,6 +12292,13 @@
           <w:lang w:eastAsia="fr-FR"/>
         </w:rPr>
         <w:t>"</w:t>
+      </w:r>
+      <w:commentRangeEnd w:id="19"/>
+      <w:r>
+        <w:rPr>
+          <w:rStyle w:val="Marquedecommentaire"/>
+        </w:rPr>
+        <w:commentReference w:id="19"/>
       </w:r>
       <w:r>
         <w:rPr>
@@ -12424,7 +12620,7 @@
                     </pic:cNvPicPr>
                   </pic:nvPicPr>
                   <pic:blipFill>
-                    <a:blip r:embed="rId47">
+                    <a:blip r:embed="rId51">
                       <a:extLst>
                         <a:ext uri="{28A0092B-C50C-407E-A947-70E740481C1C}">
                           <a14:useLocalDpi xmlns:a14="http://schemas.microsoft.com/office/drawing/2010/main" val="0"/>
@@ -12809,7 +13005,7 @@
                     </pic:cNvPicPr>
                   </pic:nvPicPr>
                   <pic:blipFill>
-                    <a:blip r:embed="rId48">
+                    <a:blip r:embed="rId52">
                       <a:extLst>
                         <a:ext uri="{28A0092B-C50C-407E-A947-70E740481C1C}">
                           <a14:useLocalDpi xmlns:a14="http://schemas.microsoft.com/office/drawing/2010/main" val="0"/>
@@ -12876,7 +13072,7 @@
                     </pic:cNvPicPr>
                   </pic:nvPicPr>
                   <pic:blipFill>
-                    <a:blip r:embed="rId49">
+                    <a:blip r:embed="rId53">
                       <a:extLst>
                         <a:ext uri="{28A0092B-C50C-407E-A947-70E740481C1C}">
                           <a14:useLocalDpi xmlns:a14="http://schemas.microsoft.com/office/drawing/2010/main" val="0"/>
@@ -13016,7 +13212,6 @@
         </w:rPr>
         <w:t xml:space="preserve"> et </w:t>
       </w:r>
-      <w:proofErr w:type="spellStart"/>
       <w:r>
         <w:rPr>
           <w:rFonts w:ascii="Times New Roman" w:eastAsia="Times New Roman" w:hAnsi="Times New Roman" w:cs="Times New Roman"/>
@@ -13028,37 +13223,15 @@
         </w:rPr>
         <w:t>Shift+Tab</w:t>
       </w:r>
-      <w:proofErr w:type="spellEnd"/>
-      <w:r>
-        <w:rPr>
-          <w:rFonts w:ascii="Times New Roman" w:eastAsia="Times New Roman" w:hAnsi="Times New Roman" w:cs="Times New Roman"/>
-          <w:sz w:val="24"/>
-          <w:szCs w:val="24"/>
-          <w:lang w:eastAsia="fr-FR"/>
-        </w:rPr>
-        <w:t xml:space="preserve"> </w:t>
-      </w:r>
-      <w:proofErr w:type="gramStart"/>
-      <w:r>
-        <w:rPr>
-          <w:rFonts w:ascii="Times New Roman" w:eastAsia="Times New Roman" w:hAnsi="Times New Roman" w:cs="Times New Roman"/>
-          <w:sz w:val="24"/>
-          <w:szCs w:val="24"/>
-          <w:lang w:eastAsia="fr-FR"/>
-        </w:rPr>
-        <w:t>permettent</w:t>
-      </w:r>
-      <w:proofErr w:type="gramEnd"/>
-      <w:r>
-        <w:rPr>
-          <w:rFonts w:ascii="Times New Roman" w:eastAsia="Times New Roman" w:hAnsi="Times New Roman" w:cs="Times New Roman"/>
-          <w:sz w:val="24"/>
-          <w:szCs w:val="24"/>
-          <w:lang w:eastAsia="fr-FR"/>
-        </w:rPr>
-        <w:t xml:space="preserve"> respectivement de passer à la cellule au-dessous ou au-dessus. En fin de mois, il est également possible de passer au mois suivant avec la touche </w:t>
-      </w:r>
-      <w:proofErr w:type="spellStart"/>
+      <w:r>
+        <w:rPr>
+          <w:rFonts w:ascii="Times New Roman" w:eastAsia="Times New Roman" w:hAnsi="Times New Roman" w:cs="Times New Roman"/>
+          <w:sz w:val="24"/>
+          <w:szCs w:val="24"/>
+          <w:lang w:eastAsia="fr-FR"/>
+        </w:rPr>
+        <w:t xml:space="preserve"> permettent respectivement de passer à la cellule au-dessous ou au-dessus. En fin de mois, il est également possible de passer au mois suivant avec la touche </w:t>
+      </w:r>
       <w:r>
         <w:rPr>
           <w:rFonts w:ascii="Times New Roman" w:eastAsia="Times New Roman" w:hAnsi="Times New Roman" w:cs="Times New Roman"/>
@@ -13079,7 +13252,6 @@
         </w:rPr>
         <w:t>.</w:t>
       </w:r>
-      <w:proofErr w:type="spellEnd"/>
     </w:p>
     <w:p>
       <w:pPr>
@@ -13304,7 +13476,7 @@
                     <pic:cNvPicPr/>
                   </pic:nvPicPr>
                   <pic:blipFill>
-                    <a:blip r:embed="rId50" cstate="print">
+                    <a:blip r:embed="rId54" cstate="print">
                       <a:extLst>
                         <a:ext uri="{28A0092B-C50C-407E-A947-70E740481C1C}">
                           <a14:useLocalDpi xmlns:a14="http://schemas.microsoft.com/office/drawing/2010/main" val="0"/>
@@ -13420,7 +13592,6 @@
         </w:rPr>
         <w:t>(</w:t>
       </w:r>
-      <w:proofErr w:type="spellStart"/>
       <w:r>
         <w:rPr>
           <w:rFonts w:ascii="Times New Roman" w:eastAsia="Times New Roman" w:hAnsi="Times New Roman" w:cs="Times New Roman"/>
@@ -13432,7 +13603,6 @@
         </w:rPr>
         <w:t>ctrl+c</w:t>
       </w:r>
-      <w:proofErr w:type="spellEnd"/>
       <w:r>
         <w:rPr>
           <w:rFonts w:ascii="Times New Roman" w:eastAsia="Times New Roman" w:hAnsi="Times New Roman" w:cs="Times New Roman"/>
@@ -13442,7 +13612,6 @@
         </w:rPr>
         <w:t>/</w:t>
       </w:r>
-      <w:proofErr w:type="spellStart"/>
       <w:r>
         <w:rPr>
           <w:rFonts w:ascii="Times New Roman" w:eastAsia="Times New Roman" w:hAnsi="Times New Roman" w:cs="Times New Roman"/>
@@ -13454,7 +13623,6 @@
         </w:rPr>
         <w:t>ctrl+v</w:t>
       </w:r>
-      <w:proofErr w:type="spellEnd"/>
       <w:r>
         <w:rPr>
           <w:rFonts w:ascii="Times New Roman" w:eastAsia="Times New Roman" w:hAnsi="Times New Roman" w:cs="Times New Roman"/>
@@ -13512,7 +13680,7 @@
                     <pic:cNvPicPr/>
                   </pic:nvPicPr>
                   <pic:blipFill>
-                    <a:blip r:embed="rId51" cstate="print">
+                    <a:blip r:embed="rId55" cstate="print">
                       <a:extLst>
                         <a:ext uri="{28A0092B-C50C-407E-A947-70E740481C1C}">
                           <a14:useLocalDpi xmlns:a14="http://schemas.microsoft.com/office/drawing/2010/main" val="0"/>
@@ -13769,7 +13937,7 @@
                     </pic:cNvPicPr>
                   </pic:nvPicPr>
                   <pic:blipFill>
-                    <a:blip r:embed="rId52" cstate="print">
+                    <a:blip r:embed="rId56" cstate="print">
                       <a:extLst>
                         <a:ext uri="{28A0092B-C50C-407E-A947-70E740481C1C}">
                           <a14:useLocalDpi xmlns:a14="http://schemas.microsoft.com/office/drawing/2010/main" val="0"/>
@@ -13983,6 +14151,8 @@
           <w:lang w:eastAsia="fr-FR"/>
         </w:rPr>
       </w:pPr>
+      <w:commentRangeStart w:id="20"/>
+      <w:commentRangeStart w:id="21"/>
       <w:r>
         <w:rPr>
           <w:rFonts w:ascii="Times New Roman" w:eastAsia="Times New Roman" w:hAnsi="Times New Roman" w:cs="Times New Roman"/>
@@ -14016,7 +14186,7 @@
                     <pic:cNvPicPr/>
                   </pic:nvPicPr>
                   <pic:blipFill rotWithShape="1">
-                    <a:blip r:embed="rId53" cstate="print">
+                    <a:blip r:embed="rId57" cstate="print">
                       <a:extLst>
                         <a:ext uri="{28A0092B-C50C-407E-A947-70E740481C1C}">
                           <a14:useLocalDpi xmlns:a14="http://schemas.microsoft.com/office/drawing/2010/main" val="0"/>
@@ -14076,6 +14246,13 @@
           </wp:anchor>
         </w:drawing>
       </w:r>
+      <w:commentRangeEnd w:id="20"/>
+      <w:r>
+        <w:rPr>
+          <w:rStyle w:val="Marquedecommentaire"/>
+        </w:rPr>
+        <w:commentReference w:id="20"/>
+      </w:r>
       <w:r>
         <w:rPr>
           <w:rFonts w:ascii="Times New Roman" w:eastAsia="Times New Roman" w:hAnsi="Times New Roman" w:cs="Times New Roman"/>
@@ -14085,7 +14262,7 @@
         </w:rPr>
         <w:t xml:space="preserve">Lorsqu'il y a une erreur de saisie, </w:t>
       </w:r>
-      <w:bookmarkStart w:id="6" w:name="_Hlk188605195"/>
+      <w:bookmarkStart w:id="22" w:name="_Hlk188605195"/>
       <w:r>
         <w:rPr>
           <w:rFonts w:ascii="Times New Roman" w:eastAsia="Times New Roman" w:hAnsi="Times New Roman" w:cs="Times New Roman"/>
@@ -14131,7 +14308,7 @@
         </w:rPr>
         <w:t xml:space="preserve"> </w:t>
       </w:r>
-      <w:bookmarkEnd w:id="6"/>
+      <w:bookmarkEnd w:id="22"/>
       <w:r>
         <w:rPr>
           <w:rFonts w:ascii="Times New Roman" w:eastAsia="Times New Roman" w:hAnsi="Times New Roman" w:cs="Times New Roman"/>
@@ -14167,6 +14344,13 @@
           <w:lang w:eastAsia="fr-FR"/>
         </w:rPr>
         <w:t xml:space="preserve">, comme par exemple l’absence du port d’exploitation, de métiers et/ou de zones de pêche lorsque le navire a été déclaré actif. </w:t>
+      </w:r>
+      <w:commentRangeEnd w:id="21"/>
+      <w:r>
+        <w:rPr>
+          <w:rStyle w:val="Marquedecommentaire"/>
+        </w:rPr>
+        <w:commentReference w:id="21"/>
       </w:r>
     </w:p>
     <w:p>
@@ -14218,7 +14402,7 @@
                     </pic:cNvPicPr>
                   </pic:nvPicPr>
                   <pic:blipFill>
-                    <a:blip r:embed="rId54" cstate="print">
+                    <a:blip r:embed="rId58" cstate="print">
                       <a:extLst>
                         <a:ext uri="{28A0092B-C50C-407E-A947-70E740481C1C}">
                           <a14:useLocalDpi xmlns:a14="http://schemas.microsoft.com/office/drawing/2010/main" val="0"/>
@@ -14457,7 +14641,7 @@
                     <pic:cNvPicPr/>
                   </pic:nvPicPr>
                   <pic:blipFill>
-                    <a:blip r:embed="rId55" cstate="print">
+                    <a:blip r:embed="rId59" cstate="print">
                       <a:extLst>
                         <a:ext uri="{28A0092B-C50C-407E-A947-70E740481C1C}">
                           <a14:useLocalDpi xmlns:a14="http://schemas.microsoft.com/office/drawing/2010/main" val="0"/>
@@ -14504,7 +14688,7 @@
                 <wp:extent cx="304800" cy="304800"/>
                 <wp:effectExtent l="0" t="0" r="0" b="0"/>
                 <wp:docPr id="42" name="AutoShape 85" descr="deplier">
-                  <a:hlinkClick xmlns:a="http://schemas.openxmlformats.org/drawingml/2006/main" r:id="rId56" tgtFrame="&quot;_blank&quot;"/>
+                  <a:hlinkClick xmlns:a="http://schemas.openxmlformats.org/drawingml/2006/main" r:id="rId60" tgtFrame="&quot;_blank&quot;"/>
                 </wp:docPr>
                 <wp:cNvGraphicFramePr>
                   <a:graphicFrameLocks xmlns:a="http://schemas.openxmlformats.org/drawingml/2006/main" noChangeAspect="1"/>
@@ -14678,7 +14862,7 @@
                     <pic:cNvPicPr/>
                   </pic:nvPicPr>
                   <pic:blipFill>
-                    <a:blip r:embed="rId57" cstate="print">
+                    <a:blip r:embed="rId61" cstate="print">
                       <a:extLst>
                         <a:ext uri="{28A0092B-C50C-407E-A947-70E740481C1C}">
                           <a14:useLocalDpi xmlns:a14="http://schemas.microsoft.com/office/drawing/2010/main" val="0"/>
@@ -14785,7 +14969,7 @@
                     <pic:cNvPicPr/>
                   </pic:nvPicPr>
                   <pic:blipFill>
-                    <a:blip r:embed="rId58">
+                    <a:blip r:embed="rId62">
                       <a:extLst>
                         <a:ext uri="{28A0092B-C50C-407E-A947-70E740481C1C}">
                           <a14:useLocalDpi xmlns:a14="http://schemas.microsoft.com/office/drawing/2010/main" val="0"/>
@@ -14985,27 +15169,7 @@
           <w:szCs w:val="24"/>
           <w:lang w:eastAsia="fr-FR"/>
         </w:rPr>
-        <w:t xml:space="preserve"> tout comme le calendrier issu de </w:t>
-      </w:r>
-      <w:proofErr w:type="spellStart"/>
-      <w:r>
-        <w:rPr>
-          <w:rFonts w:ascii="Times New Roman" w:eastAsia="Times New Roman" w:hAnsi="Times New Roman" w:cs="Times New Roman"/>
-          <w:sz w:val="24"/>
-          <w:szCs w:val="24"/>
-          <w:lang w:eastAsia="fr-FR"/>
-        </w:rPr>
-        <w:t>Sacrois-ObsDeb</w:t>
-      </w:r>
-      <w:proofErr w:type="spellEnd"/>
-      <w:r>
-        <w:rPr>
-          <w:rFonts w:ascii="Times New Roman" w:eastAsia="Times New Roman" w:hAnsi="Times New Roman" w:cs="Times New Roman"/>
-          <w:sz w:val="24"/>
-          <w:szCs w:val="24"/>
-          <w:lang w:eastAsia="fr-FR"/>
-        </w:rPr>
-        <w:t>, s'ils existent pour le navire.</w:t>
+        <w:t xml:space="preserve"> tout comme le calendrier issu de Sacrois-ObsDeb, s'ils existent pour le navire.</w:t>
       </w:r>
     </w:p>
     <w:p>
@@ -15122,7 +15286,7 @@
                     <pic:cNvPicPr/>
                   </pic:nvPicPr>
                   <pic:blipFill>
-                    <a:blip r:embed="rId59" cstate="print">
+                    <a:blip r:embed="rId63" cstate="print">
                       <a:extLst>
                         <a:ext uri="{28A0092B-C50C-407E-A947-70E740481C1C}">
                           <a14:useLocalDpi xmlns:a14="http://schemas.microsoft.com/office/drawing/2010/main" val="0"/>
@@ -15237,7 +15401,6 @@
         </w:rPr>
         <w:t>(</w:t>
       </w:r>
-      <w:proofErr w:type="spellStart"/>
       <w:r>
         <w:rPr>
           <w:rFonts w:ascii="Times New Roman" w:eastAsia="Times New Roman" w:hAnsi="Times New Roman" w:cs="Times New Roman"/>
@@ -15249,7 +15412,6 @@
         </w:rPr>
         <w:t>ctrl+c</w:t>
       </w:r>
-      <w:proofErr w:type="spellEnd"/>
       <w:r>
         <w:rPr>
           <w:rFonts w:ascii="Times New Roman" w:eastAsia="Times New Roman" w:hAnsi="Times New Roman" w:cs="Times New Roman"/>
@@ -15259,7 +15421,6 @@
         </w:rPr>
         <w:t>/</w:t>
       </w:r>
-      <w:proofErr w:type="spellStart"/>
       <w:r>
         <w:rPr>
           <w:rFonts w:ascii="Times New Roman" w:eastAsia="Times New Roman" w:hAnsi="Times New Roman" w:cs="Times New Roman"/>
@@ -15271,7 +15432,6 @@
         </w:rPr>
         <w:t>ctrl+v</w:t>
       </w:r>
-      <w:proofErr w:type="spellEnd"/>
       <w:r>
         <w:rPr>
           <w:rFonts w:ascii="Times New Roman" w:eastAsia="Times New Roman" w:hAnsi="Times New Roman" w:cs="Times New Roman"/>
@@ -15391,19 +15551,8 @@
           <w:szCs w:val="24"/>
           <w:lang w:eastAsia="fr-FR"/>
         </w:rPr>
-        <w:t xml:space="preserve">la source Enquête N-1 ou </w:t>
-      </w:r>
-      <w:proofErr w:type="spellStart"/>
-      <w:r>
-        <w:rPr>
-          <w:rFonts w:ascii="Times New Roman" w:eastAsia="Times New Roman" w:hAnsi="Times New Roman" w:cs="Times New Roman"/>
-          <w:sz w:val="24"/>
-          <w:szCs w:val="24"/>
-          <w:lang w:eastAsia="fr-FR"/>
-        </w:rPr>
-        <w:t>Sacrois-Obsdeb</w:t>
-      </w:r>
-      <w:proofErr w:type="spellEnd"/>
+        <w:t>la source Enquête N-1 ou Sacrois-Obsdeb</w:t>
+      </w:r>
       <w:r>
         <w:rPr>
           <w:rFonts w:ascii="Times New Roman" w:eastAsia="Times New Roman" w:hAnsi="Times New Roman" w:cs="Times New Roman"/>
@@ -15547,7 +15696,7 @@
                     <pic:cNvPicPr/>
                   </pic:nvPicPr>
                   <pic:blipFill>
-                    <a:blip r:embed="rId60" cstate="print">
+                    <a:blip r:embed="rId64" cstate="print">
                       <a:extLst>
                         <a:ext uri="{28A0092B-C50C-407E-A947-70E740481C1C}">
                           <a14:useLocalDpi xmlns:a14="http://schemas.microsoft.com/office/drawing/2010/main" val="0"/>
@@ -15950,7 +16099,7 @@
                     </pic:cNvPicPr>
                   </pic:nvPicPr>
                   <pic:blipFill>
-                    <a:blip r:embed="rId61">
+                    <a:blip r:embed="rId65">
                       <a:extLst>
                         <a:ext uri="{28A0092B-C50C-407E-A947-70E740481C1C}">
                           <a14:useLocalDpi xmlns:a14="http://schemas.microsoft.com/office/drawing/2010/main" val="0"/>
@@ -16175,7 +16324,7 @@
                     </pic:cNvPicPr>
                   </pic:nvPicPr>
                   <pic:blipFill>
-                    <a:blip r:embed="rId62">
+                    <a:blip r:embed="rId66">
                       <a:extLst>
                         <a:ext uri="{28A0092B-C50C-407E-A947-70E740481C1C}">
                           <a14:useLocalDpi xmlns:a14="http://schemas.microsoft.com/office/drawing/2010/main" val="0"/>
@@ -16302,7 +16451,7 @@
                     </pic:cNvPicPr>
                   </pic:nvPicPr>
                   <pic:blipFill>
-                    <a:blip r:embed="rId63">
+                    <a:blip r:embed="rId67">
                       <a:extLst>
                         <a:ext uri="{28A0092B-C50C-407E-A947-70E740481C1C}">
                           <a14:useLocalDpi xmlns:a14="http://schemas.microsoft.com/office/drawing/2010/main" val="0"/>
@@ -16420,7 +16569,7 @@
                     </pic:cNvPicPr>
                   </pic:nvPicPr>
                   <pic:blipFill>
-                    <a:blip r:embed="rId64">
+                    <a:blip r:embed="rId68">
                       <a:extLst>
                         <a:ext uri="{28A0092B-C50C-407E-A947-70E740481C1C}">
                           <a14:useLocalDpi xmlns:a14="http://schemas.microsoft.com/office/drawing/2010/main" val="0"/>
@@ -16679,7 +16828,7 @@
                     <pic:cNvPicPr/>
                   </pic:nvPicPr>
                   <pic:blipFill>
-                    <a:blip r:embed="rId65" cstate="print">
+                    <a:blip r:embed="rId69" cstate="print">
                       <a:extLst>
                         <a:ext uri="{28A0092B-C50C-407E-A947-70E740481C1C}">
                           <a14:useLocalDpi xmlns:a14="http://schemas.microsoft.com/office/drawing/2010/main" val="0"/>
@@ -16821,7 +16970,7 @@
                     </pic:cNvPicPr>
                   </pic:nvPicPr>
                   <pic:blipFill>
-                    <a:blip r:embed="rId66">
+                    <a:blip r:embed="rId70">
                       <a:extLst>
                         <a:ext uri="{28A0092B-C50C-407E-A947-70E740481C1C}">
                           <a14:useLocalDpi xmlns:a14="http://schemas.microsoft.com/office/drawing/2010/main" val="0"/>
@@ -16961,7 +17110,7 @@
                     </pic:cNvPicPr>
                   </pic:nvPicPr>
                   <pic:blipFill>
-                    <a:blip r:embed="rId67">
+                    <a:blip r:embed="rId71">
                       <a:extLst>
                         <a:ext uri="{28A0092B-C50C-407E-A947-70E740481C1C}">
                           <a14:useLocalDpi xmlns:a14="http://schemas.microsoft.com/office/drawing/2010/main" val="0"/>
@@ -17134,7 +17283,7 @@
                     </pic:cNvPicPr>
                   </pic:nvPicPr>
                   <pic:blipFill>
-                    <a:blip r:embed="rId68">
+                    <a:blip r:embed="rId72">
                       <a:extLst>
                         <a:ext uri="{28A0092B-C50C-407E-A947-70E740481C1C}">
                           <a14:useLocalDpi xmlns:a14="http://schemas.microsoft.com/office/drawing/2010/main" val="0"/>
@@ -17300,7 +17449,7 @@
                     </pic:cNvPicPr>
                   </pic:nvPicPr>
                   <pic:blipFill>
-                    <a:blip r:embed="rId69">
+                    <a:blip r:embed="rId73">
                       <a:extLst>
                         <a:ext uri="{28A0092B-C50C-407E-A947-70E740481C1C}">
                           <a14:useLocalDpi xmlns:a14="http://schemas.microsoft.com/office/drawing/2010/main" val="0"/>
@@ -17412,27 +17561,7 @@
           <w:szCs w:val="24"/>
           <w:lang w:eastAsia="fr-FR"/>
         </w:rPr>
-        <w:t xml:space="preserve">en </w:t>
-      </w:r>
-      <w:proofErr w:type="spellStart"/>
-      <w:r>
-        <w:rPr>
-          <w:rFonts w:ascii="Times New Roman" w:eastAsia="Times New Roman" w:hAnsi="Times New Roman" w:cs="Times New Roman"/>
-          <w:sz w:val="24"/>
-          <w:szCs w:val="24"/>
-          <w:lang w:eastAsia="fr-FR"/>
-        </w:rPr>
-        <w:t>pdf</w:t>
-      </w:r>
-      <w:proofErr w:type="spellEnd"/>
-      <w:r>
-        <w:rPr>
-          <w:rFonts w:ascii="Times New Roman" w:eastAsia="Times New Roman" w:hAnsi="Times New Roman" w:cs="Times New Roman"/>
-          <w:sz w:val="24"/>
-          <w:szCs w:val="24"/>
-          <w:lang w:eastAsia="fr-FR"/>
-        </w:rPr>
-        <w:t xml:space="preserve"> </w:t>
+        <w:t xml:space="preserve">en pdf </w:t>
       </w:r>
       <w:r>
         <w:rPr>
@@ -17602,7 +17731,7 @@
                     </pic:cNvPicPr>
                   </pic:nvPicPr>
                   <pic:blipFill>
-                    <a:blip r:embed="rId70">
+                    <a:blip r:embed="rId74">
                       <a:extLst>
                         <a:ext uri="{28A0092B-C50C-407E-A947-70E740481C1C}">
                           <a14:useLocalDpi xmlns:a14="http://schemas.microsoft.com/office/drawing/2010/main" val="0"/>
@@ -17663,7 +17792,7 @@
                     </pic:cNvPicPr>
                   </pic:nvPicPr>
                   <pic:blipFill>
-                    <a:blip r:embed="rId71">
+                    <a:blip r:embed="rId75">
                       <a:extLst>
                         <a:ext uri="{28A0092B-C50C-407E-A947-70E740481C1C}">
                           <a14:useLocalDpi xmlns:a14="http://schemas.microsoft.com/office/drawing/2010/main" val="0"/>
@@ -17727,7 +17856,7 @@
                     </pic:cNvPicPr>
                   </pic:nvPicPr>
                   <pic:blipFill>
-                    <a:blip r:embed="rId72">
+                    <a:blip r:embed="rId76">
                       <a:extLst>
                         <a:ext uri="{28A0092B-C50C-407E-A947-70E740481C1C}">
                           <a14:useLocalDpi xmlns:a14="http://schemas.microsoft.com/office/drawing/2010/main" val="0"/>
@@ -17787,7 +17916,7 @@
           <w:lang w:eastAsia="fr-FR"/>
         </w:rPr>
       </w:pPr>
-      <w:bookmarkStart w:id="7" w:name="_Hlk189575735"/>
+      <w:bookmarkStart w:id="23" w:name="_Hlk189575735"/>
       <w:r>
         <w:rPr>
           <w:rFonts w:ascii="Times New Roman" w:eastAsia="Times New Roman" w:hAnsi="Times New Roman" w:cs="Times New Roman"/>
@@ -17800,7 +17929,7 @@
         <w:t>Coupures du réseau</w:t>
       </w:r>
     </w:p>
-    <w:bookmarkEnd w:id="7"/>
+    <w:bookmarkEnd w:id="23"/>
     <w:p>
       <w:pPr>
         <w:spacing w:before="100" w:beforeAutospacing="1" w:after="100" w:afterAutospacing="1" w:line="240" w:lineRule="auto"/>
@@ -17812,6 +17941,7 @@
           <w:lang w:eastAsia="fr-FR"/>
         </w:rPr>
       </w:pPr>
+      <w:commentRangeStart w:id="24"/>
       <w:r>
         <w:rPr>
           <w:rFonts w:ascii="Times New Roman" w:eastAsia="Times New Roman" w:hAnsi="Times New Roman" w:cs="Times New Roman"/>
@@ -17950,7 +18080,7 @@
                     </pic:cNvPicPr>
                   </pic:nvPicPr>
                   <pic:blipFill>
-                    <a:blip r:embed="rId73">
+                    <a:blip r:embed="rId77">
                       <a:extLst>
                         <a:ext uri="{28A0092B-C50C-407E-A947-70E740481C1C}">
                           <a14:useLocalDpi xmlns:a14="http://schemas.microsoft.com/office/drawing/2010/main" val="0"/>
@@ -18088,6 +18218,13 @@
         </w:rPr>
         <w:t xml:space="preserve">de consultation des calendriers apparaitra, filtres appliqués si sélectionnés en amont. </w:t>
       </w:r>
+      <w:commentRangeEnd w:id="24"/>
+      <w:r>
+        <w:rPr>
+          <w:rStyle w:val="Marquedecommentaire"/>
+        </w:rPr>
+        <w:commentReference w:id="24"/>
+      </w:r>
     </w:p>
     <w:p>
       <w:pPr>
@@ -18115,7 +18252,7 @@
           <w:lang w:eastAsia="fr-FR"/>
         </w:rPr>
       </w:pPr>
-      <w:bookmarkStart w:id="8" w:name="_Hlk189575978"/>
+      <w:bookmarkStart w:id="25" w:name="_Hlk189575978"/>
       <w:r>
         <w:rPr>
           <w:rFonts w:ascii="Times New Roman" w:eastAsia="Times New Roman" w:hAnsi="Times New Roman" w:cs="Times New Roman"/>
@@ -18139,8 +18276,8 @@
           <w:lang w:eastAsia="fr-FR"/>
         </w:rPr>
       </w:pPr>
-      <w:bookmarkStart w:id="9" w:name="_Hlk188880800"/>
-      <w:bookmarkEnd w:id="8"/>
+      <w:bookmarkStart w:id="26" w:name="_Hlk188880800"/>
+      <w:bookmarkEnd w:id="25"/>
       <w:r>
         <w:rPr>
           <w:rFonts w:ascii="Times New Roman" w:eastAsia="Times New Roman" w:hAnsi="Times New Roman" w:cs="Times New Roman"/>
@@ -18267,7 +18404,7 @@
         </w:rPr>
         <w:t xml:space="preserve"> </w:t>
       </w:r>
-      <w:bookmarkEnd w:id="9"/>
+      <w:bookmarkEnd w:id="26"/>
     </w:p>
     <w:p>
       <w:pPr>
@@ -18310,7 +18447,7 @@
                     </pic:cNvPicPr>
                   </pic:nvPicPr>
                   <pic:blipFill>
-                    <a:blip r:embed="rId74" cstate="print">
+                    <a:blip r:embed="rId78" cstate="print">
                       <a:extLst>
                         <a:ext uri="{28A0092B-C50C-407E-A947-70E740481C1C}">
                           <a14:useLocalDpi xmlns:a14="http://schemas.microsoft.com/office/drawing/2010/main" val="0"/>
@@ -18479,7 +18616,7 @@
                     </pic:cNvPicPr>
                   </pic:nvPicPr>
                   <pic:blipFill rotWithShape="1">
-                    <a:blip r:embed="rId75">
+                    <a:blip r:embed="rId79">
                       <a:extLst>
                         <a:ext uri="{28A0092B-C50C-407E-A947-70E740481C1C}">
                           <a14:useLocalDpi xmlns:a14="http://schemas.microsoft.com/office/drawing/2010/main" val="0"/>
@@ -18758,6 +18895,7 @@
           <w:lang w:eastAsia="fr-FR"/>
         </w:rPr>
       </w:pPr>
+      <w:commentRangeStart w:id="27"/>
       <w:r>
         <w:rPr>
           <w:rFonts w:ascii="Times New Roman" w:eastAsia="Times New Roman" w:hAnsi="Times New Roman" w:cs="Times New Roman"/>
@@ -18778,116 +18916,15 @@
           <w:szCs w:val="24"/>
           <w:lang w:eastAsia="fr-FR"/>
         </w:rPr>
-        <w:t>B. : Ce manuel est également accessible dans cette section.</w:t>
-      </w:r>
-    </w:p>
-    <w:p>
-      <w:pPr>
-        <w:spacing w:before="100" w:beforeAutospacing="1" w:after="100" w:afterAutospacing="1" w:line="240" w:lineRule="auto"/>
-        <w:jc w:val="both"/>
-        <w:rPr>
-          <w:rFonts w:ascii="Times New Roman" w:eastAsia="Times New Roman" w:hAnsi="Times New Roman" w:cs="Times New Roman"/>
-          <w:sz w:val="24"/>
-          <w:szCs w:val="24"/>
-          <w:lang w:eastAsia="fr-FR"/>
-        </w:rPr>
-      </w:pPr>
-      <w:r>
-        <w:rPr>
-          <w:rFonts w:ascii="Times New Roman" w:eastAsia="Times New Roman" w:hAnsi="Times New Roman" w:cs="Times New Roman"/>
-          <w:sz w:val="24"/>
-          <w:szCs w:val="24"/>
-          <w:lang w:eastAsia="fr-FR"/>
-        </w:rPr>
-        <w:t xml:space="preserve">Certains champs sont préremplis (Prénom et nom ; Société et Courriel ; Heure et Date du bug). </w:t>
-      </w:r>
-    </w:p>
-    <w:p>
-      <w:pPr>
-        <w:spacing w:before="100" w:beforeAutospacing="1" w:after="100" w:afterAutospacing="1" w:line="240" w:lineRule="auto"/>
-        <w:jc w:val="both"/>
-        <w:rPr>
-          <w:rFonts w:ascii="Times New Roman" w:eastAsia="Times New Roman" w:hAnsi="Times New Roman" w:cs="Times New Roman"/>
-          <w:sz w:val="24"/>
-          <w:szCs w:val="24"/>
-          <w:lang w:eastAsia="fr-FR"/>
-        </w:rPr>
-      </w:pPr>
-      <w:r>
-        <w:rPr>
-          <w:rFonts w:ascii="Times New Roman" w:eastAsia="Times New Roman" w:hAnsi="Times New Roman" w:cs="Times New Roman"/>
-          <w:sz w:val="24"/>
-          <w:szCs w:val="24"/>
-          <w:lang w:eastAsia="fr-FR"/>
-        </w:rPr>
-        <w:t xml:space="preserve">S’il s’agit d’un bug spécifique à un calendrier en particulier, il sera fortement apprécié de </w:t>
-      </w:r>
-      <w:r>
-        <w:rPr>
-          <w:rFonts w:ascii="Times New Roman" w:eastAsia="Times New Roman" w:hAnsi="Times New Roman" w:cs="Times New Roman"/>
-          <w:sz w:val="24"/>
-          <w:szCs w:val="24"/>
-          <w:lang w:eastAsia="fr-FR"/>
-        </w:rPr>
-        <w:t xml:space="preserve">renseigner la dernière série de chiffres de </w:t>
-      </w:r>
-      <w:r>
-        <w:rPr>
-          <w:rFonts w:ascii="Times New Roman" w:eastAsia="Times New Roman" w:hAnsi="Times New Roman" w:cs="Times New Roman"/>
-          <w:sz w:val="24"/>
-          <w:szCs w:val="24"/>
-          <w:lang w:eastAsia="fr-FR"/>
-        </w:rPr>
-        <w:t>l’URL du calendrier dans la section prévue à cet effet</w:t>
-      </w:r>
-      <w:r>
-        <w:rPr>
-          <w:rFonts w:ascii="Times New Roman" w:eastAsia="Times New Roman" w:hAnsi="Times New Roman" w:cs="Times New Roman"/>
-          <w:sz w:val="24"/>
-          <w:szCs w:val="24"/>
-          <w:lang w:eastAsia="fr-FR"/>
-        </w:rPr>
-        <w:t xml:space="preserve">. </w:t>
-      </w:r>
-      <w:r>
-        <w:rPr>
-          <w:rFonts w:ascii="Times New Roman" w:eastAsia="Times New Roman" w:hAnsi="Times New Roman" w:cs="Times New Roman"/>
-          <w:sz w:val="24"/>
-          <w:szCs w:val="24"/>
-          <w:lang w:eastAsia="fr-FR"/>
-        </w:rPr>
-        <w:t xml:space="preserve">Cela permettra </w:t>
-      </w:r>
-      <w:r>
-        <w:rPr>
-          <w:rFonts w:ascii="Times New Roman" w:eastAsia="Times New Roman" w:hAnsi="Times New Roman" w:cs="Times New Roman"/>
-          <w:sz w:val="24"/>
-          <w:szCs w:val="24"/>
-          <w:lang w:eastAsia="fr-FR"/>
-        </w:rPr>
-        <w:t xml:space="preserve">à l’équipe </w:t>
-      </w:r>
-      <w:r>
-        <w:rPr>
-          <w:rFonts w:ascii="Times New Roman" w:eastAsia="Times New Roman" w:hAnsi="Times New Roman" w:cs="Times New Roman"/>
-          <w:sz w:val="24"/>
-          <w:szCs w:val="24"/>
-          <w:lang w:eastAsia="fr-FR"/>
-        </w:rPr>
-        <w:t>concernée de rapidement cibler et résoudre le problème.</w:t>
-      </w:r>
-    </w:p>
-    <w:p>
-      <w:pPr>
-        <w:spacing w:before="100" w:beforeAutospacing="1" w:after="100" w:afterAutospacing="1" w:line="240" w:lineRule="auto"/>
-        <w:jc w:val="both"/>
-        <w:rPr>
-          <w:rFonts w:ascii="Times New Roman" w:eastAsia="Times New Roman" w:hAnsi="Times New Roman" w:cs="Times New Roman"/>
-          <w:sz w:val="24"/>
-          <w:szCs w:val="24"/>
-          <w:lang w:eastAsia="fr-FR"/>
-        </w:rPr>
-      </w:pPr>
+        <w:t>B. : Ce manuel est également accessible dans cette section</w:t>
+      </w:r>
+      <w:commentRangeEnd w:id="27"/>
+      <w:r>
+        <w:rPr>
+          <w:rStyle w:val="Marquedecommentaire"/>
+        </w:rPr>
+        <w:commentReference w:id="27"/>
+      </w:r>
       <w:r>
         <w:rPr>
           <w:rFonts w:ascii="Times New Roman" w:eastAsia="Times New Roman" w:hAnsi="Times New Roman" w:cs="Times New Roman"/>
@@ -18897,6 +18934,125 @@
           <w:szCs w:val="24"/>
           <w:lang w:eastAsia="fr-FR"/>
         </w:rPr>
+        <w:t>.</w:t>
+      </w:r>
+    </w:p>
+    <w:p>
+      <w:pPr>
+        <w:spacing w:before="100" w:beforeAutospacing="1" w:after="100" w:afterAutospacing="1" w:line="240" w:lineRule="auto"/>
+        <w:jc w:val="both"/>
+        <w:rPr>
+          <w:rFonts w:ascii="Times New Roman" w:eastAsia="Times New Roman" w:hAnsi="Times New Roman" w:cs="Times New Roman"/>
+          <w:sz w:val="24"/>
+          <w:szCs w:val="24"/>
+          <w:lang w:eastAsia="fr-FR"/>
+        </w:rPr>
+      </w:pPr>
+      <w:r>
+        <w:rPr>
+          <w:rFonts w:ascii="Times New Roman" w:eastAsia="Times New Roman" w:hAnsi="Times New Roman" w:cs="Times New Roman"/>
+          <w:sz w:val="24"/>
+          <w:szCs w:val="24"/>
+          <w:lang w:eastAsia="fr-FR"/>
+        </w:rPr>
+        <w:t xml:space="preserve">Certains champs sont préremplis (Prénom et nom ; Société et Courriel ; Heure et Date du bug). </w:t>
+      </w:r>
+    </w:p>
+    <w:p>
+      <w:pPr>
+        <w:spacing w:before="100" w:beforeAutospacing="1" w:after="100" w:afterAutospacing="1" w:line="240" w:lineRule="auto"/>
+        <w:jc w:val="both"/>
+        <w:rPr>
+          <w:rFonts w:ascii="Times New Roman" w:eastAsia="Times New Roman" w:hAnsi="Times New Roman" w:cs="Times New Roman"/>
+          <w:sz w:val="24"/>
+          <w:szCs w:val="24"/>
+          <w:lang w:eastAsia="fr-FR"/>
+        </w:rPr>
+      </w:pPr>
+      <w:r>
+        <w:rPr>
+          <w:rFonts w:ascii="Times New Roman" w:eastAsia="Times New Roman" w:hAnsi="Times New Roman" w:cs="Times New Roman"/>
+          <w:sz w:val="24"/>
+          <w:szCs w:val="24"/>
+          <w:lang w:eastAsia="fr-FR"/>
+        </w:rPr>
+        <w:t xml:space="preserve">S’il s’agit d’un bug spécifique à un calendrier en particulier, il sera fortement apprécié de </w:t>
+      </w:r>
+      <w:r>
+        <w:rPr>
+          <w:rFonts w:ascii="Times New Roman" w:eastAsia="Times New Roman" w:hAnsi="Times New Roman" w:cs="Times New Roman"/>
+          <w:sz w:val="24"/>
+          <w:szCs w:val="24"/>
+          <w:lang w:eastAsia="fr-FR"/>
+        </w:rPr>
+        <w:t xml:space="preserve">renseigner la dernière série de chiffres de </w:t>
+      </w:r>
+      <w:r>
+        <w:rPr>
+          <w:rFonts w:ascii="Times New Roman" w:eastAsia="Times New Roman" w:hAnsi="Times New Roman" w:cs="Times New Roman"/>
+          <w:sz w:val="24"/>
+          <w:szCs w:val="24"/>
+          <w:lang w:eastAsia="fr-FR"/>
+        </w:rPr>
+        <w:t>l’URL du calendrier dans la section prévue à cet effet</w:t>
+      </w:r>
+      <w:r>
+        <w:rPr>
+          <w:rFonts w:ascii="Times New Roman" w:eastAsia="Times New Roman" w:hAnsi="Times New Roman" w:cs="Times New Roman"/>
+          <w:sz w:val="24"/>
+          <w:szCs w:val="24"/>
+          <w:lang w:eastAsia="fr-FR"/>
+        </w:rPr>
+        <w:t xml:space="preserve">. </w:t>
+      </w:r>
+      <w:r>
+        <w:rPr>
+          <w:rFonts w:ascii="Times New Roman" w:eastAsia="Times New Roman" w:hAnsi="Times New Roman" w:cs="Times New Roman"/>
+          <w:sz w:val="24"/>
+          <w:szCs w:val="24"/>
+          <w:lang w:eastAsia="fr-FR"/>
+        </w:rPr>
+        <w:t xml:space="preserve">Cela permettra </w:t>
+      </w:r>
+      <w:r>
+        <w:rPr>
+          <w:rFonts w:ascii="Times New Roman" w:eastAsia="Times New Roman" w:hAnsi="Times New Roman" w:cs="Times New Roman"/>
+          <w:sz w:val="24"/>
+          <w:szCs w:val="24"/>
+          <w:lang w:eastAsia="fr-FR"/>
+        </w:rPr>
+        <w:t xml:space="preserve">à l’équipe </w:t>
+      </w:r>
+      <w:r>
+        <w:rPr>
+          <w:rFonts w:ascii="Times New Roman" w:eastAsia="Times New Roman" w:hAnsi="Times New Roman" w:cs="Times New Roman"/>
+          <w:sz w:val="24"/>
+          <w:szCs w:val="24"/>
+          <w:lang w:eastAsia="fr-FR"/>
+        </w:rPr>
+        <w:t>concernée de rapidement cibler et résoudre le problème.</w:t>
+      </w:r>
+    </w:p>
+    <w:p>
+      <w:pPr>
+        <w:spacing w:before="100" w:beforeAutospacing="1" w:after="100" w:afterAutospacing="1" w:line="240" w:lineRule="auto"/>
+        <w:jc w:val="both"/>
+        <w:rPr>
+          <w:rFonts w:ascii="Times New Roman" w:eastAsia="Times New Roman" w:hAnsi="Times New Roman" w:cs="Times New Roman"/>
+          <w:sz w:val="24"/>
+          <w:szCs w:val="24"/>
+          <w:lang w:eastAsia="fr-FR"/>
+        </w:rPr>
+      </w:pPr>
+      <w:r>
+        <w:rPr>
+          <w:rFonts w:ascii="Times New Roman" w:eastAsia="Times New Roman" w:hAnsi="Times New Roman" w:cs="Times New Roman"/>
+          <w:i/>
+          <w:iCs/>
+          <w:sz w:val="24"/>
+          <w:szCs w:val="24"/>
+          <w:lang w:eastAsia="fr-FR"/>
+        </w:rPr>
         <w:t>Exemple :</w:t>
       </w:r>
       <w:r>
@@ -18908,7 +19064,7 @@
         </w:rPr>
         <w:t xml:space="preserve"> Si l’adresse URL du calendrier concerné par le problème est </w:t>
       </w:r>
-      <w:hyperlink r:id="rId76" w:history="1">
+      <w:hyperlink r:id="rId80" w:history="1">
         <w:r>
           <w:rPr>
             <w:rStyle w:val="Lienhypertexte"/>
@@ -18982,7 +19138,7 @@
                     </pic:cNvPicPr>
                   </pic:nvPicPr>
                   <pic:blipFill>
-                    <a:blip r:embed="rId77">
+                    <a:blip r:embed="rId81">
                       <a:extLst>
                         <a:ext uri="{28A0092B-C50C-407E-A947-70E740481C1C}">
                           <a14:useLocalDpi xmlns:a14="http://schemas.microsoft.com/office/drawing/2010/main" val="0"/>
@@ -19026,6 +19182,396 @@
 </w:document>
 </file>
 
+<file path=word/comments.xml><?xml version="1.0" encoding="utf-8"?>
+<w:comments xmlns:wpc="http://schemas.microsoft.com/office/word/2010/wordprocessingCanvas" xmlns:cx="http://schemas.microsoft.com/office/drawing/2014/chartex" xmlns:cx1="http://schemas.microsoft.com/office/drawing/2015/9/8/chartex" xmlns:cx2="http://schemas.microsoft.com/office/drawing/2015/10/21/chartex" xmlns:cx3="http://schemas.microsoft.com/office/drawing/2016/5/9/chartex" xmlns:cx4="http://schemas.microsoft.com/office/drawing/2016/5/10/chartex" xmlns:cx5="http://schemas.microsoft.com/office/drawing/2016/5/11/chartex" xmlns:cx6="http://schemas.microsoft.com/office/drawing/2016/5/12/chartex" xmlns:cx7="http://schemas.microsoft.com/office/drawing/2016/5/13/chartex" xmlns:cx8="http://schemas.microsoft.com/office/drawing/2016/5/14/chartex" xmlns:mc="http://schemas.openxmlformats.org/markup-compatibility/2006" xmlns:aink="http://schemas.microsoft.com/office/drawing/2016/ink" xmlns:am3d="http://schemas.microsoft.com/office/drawing/2017/model3d" xmlns:o="urn:schemas-microsoft-com:office:office" xmlns:r="http://schemas.openxmlformats.org/officeDocument/2006/relationships" xmlns:m="http://schemas.openxmlformats.org/officeDocument/2006/math" xmlns:v="urn:schemas-microsoft-com:vml" xmlns:wp14="http://schemas.microsoft.com/office/word/2010/wordprocessingDrawing" xmlns:wp="http://schemas.openxmlformats.org/drawingml/2006/wordprocessingDrawing" xmlns:w10="urn:schemas-microsoft-com:office:word" xmlns:w="http://schemas.openxmlformats.org/wordprocessingml/2006/main" xmlns:w14="http://schemas.microsoft.com/office/word/2010/wordml" xmlns:w15="http://schemas.microsoft.com/office/word/2012/wordml" xmlns:w16cex="http://schemas.microsoft.com/office/word/2018/wordml/cex" xmlns:w16cid="http://schemas.microsoft.com/office/word/2016/wordml/cid" xmlns:w16="http://schemas.microsoft.com/office/word/2018/wordml" xmlns:w16sdtdh="http://schemas.microsoft.com/office/word/2020/wordml/sdtdatahash" xmlns:w16se="http://schemas.microsoft.com/office/word/2015/wordml/symex" xmlns:wpg="http://schemas.microsoft.com/office/word/2010/wordprocessingGroup" xmlns:wpi="http://schemas.microsoft.com/office/word/2010/wordprocessingInk" xmlns:wne="http://schemas.microsoft.com/office/word/2006/wordml" xmlns:wps="http://schemas.microsoft.com/office/word/2010/wordprocessingShape" mc:Ignorable="w14 w15 w16se w16cid w16 w16cex w16sdtdh wp14">
+  <w:comment w:id="3" w:author="Vincent FACHERO, Ifremer Brest PDG-IRSI-ISI, 02 " w:date="2025-02-07T10:09:00Z" w:initials="VFIBPII0">
+    <w:p>
+      <w:pPr>
+        <w:pStyle w:val="Commentaire"/>
+      </w:pPr>
+      <w:r>
+        <w:rPr>
+          <w:rStyle w:val="Marquedecommentaire"/>
+        </w:rPr>
+        <w:annotationRef/>
+      </w:r>
+      <w:r>
+        <w:t>Il manque des entêtes, pied de page et logos (voir la charte graphique avec Emilie).</w:t>
+      </w:r>
+    </w:p>
+  </w:comment>
+  <w:comment w:id="1" w:author="Vincent FACHERO, Ifremer Brest PDG-IRSI-ISI, 02 " w:date="2025-02-06T22:59:00Z" w:initials="VFIBPII0">
+    <w:p>
+      <w:pPr>
+        <w:pStyle w:val="Commentaire"/>
+      </w:pPr>
+      <w:r>
+        <w:rPr>
+          <w:rStyle w:val="Marquedecommentaire"/>
+        </w:rPr>
+        <w:annotationRef/>
+      </w:r>
+      <w:r>
+        <w:t xml:space="preserve">J’aurais </w:t>
+      </w:r>
+      <w:r>
+        <w:t>bien vu</w:t>
+      </w:r>
+      <w:r>
+        <w:t xml:space="preserve"> des chapitres avec des thématiques différentes.</w:t>
+      </w:r>
+    </w:p>
+  </w:comment>
+  <w:comment w:id="2" w:author="Vincent FACHERO, Ifremer Brest PDG-IRSI-ISI, 02 " w:date="2025-02-07T10:09:00Z" w:initials="VFIBPII0">
+    <w:p>
+      <w:pPr>
+        <w:pStyle w:val="Commentaire"/>
+      </w:pPr>
+      <w:r>
+        <w:rPr>
+          <w:rStyle w:val="Marquedecommentaire"/>
+        </w:rPr>
+        <w:annotationRef/>
+      </w:r>
+      <w:r>
+        <w:t>Les liens ne fonctionnent pas.</w:t>
+      </w:r>
+    </w:p>
+  </w:comment>
+  <w:comment w:id="6" w:author="Vincent FACHERO, Ifremer Brest PDG-IRSI-ISI, 02 " w:date="2025-02-06T22:56:00Z" w:initials="VFIBPII0">
+    <w:p>
+      <w:pPr>
+        <w:pStyle w:val="Commentaire"/>
+      </w:pPr>
+      <w:r>
+        <w:rPr>
+          <w:rStyle w:val="Marquedecommentaire"/>
+        </w:rPr>
+        <w:annotationRef/>
+      </w:r>
+      <w:r>
+        <w:t xml:space="preserve">Indiquer l’impact de l’activation de la régionalisation sur l’application. </w:t>
+      </w:r>
+    </w:p>
+    <w:p>
+      <w:pPr>
+        <w:pStyle w:val="Commentaire"/>
+      </w:pPr>
+      <w:r>
+        <w:t xml:space="preserve">Limite des valeurs de certaines listes, correspondant à la zone de compétence sélectionnée : </w:t>
+      </w:r>
+    </w:p>
+    <w:p>
+      <w:pPr>
+        <w:pStyle w:val="Commentaire"/>
+        <w:numPr>
+          <w:ilvl w:val="0"/>
+          <w:numId w:val="13"/>
+        </w:numPr>
+      </w:pPr>
+      <w:r>
+        <w:t>Port d’exploitation, Métier, Zone de pêche, gradient de côte, zone proche.</w:t>
+      </w:r>
+    </w:p>
+  </w:comment>
+  <w:comment w:id="8" w:author="Vincent FACHERO, Ifremer Brest PDG-IRSI-ISI, 02 " w:date="2025-02-06T22:58:00Z" w:initials="VFIBPII0">
+    <w:p>
+      <w:pPr>
+        <w:pStyle w:val="Commentaire"/>
+      </w:pPr>
+      <w:r>
+        <w:rPr>
+          <w:rStyle w:val="Marquedecommentaire"/>
+        </w:rPr>
+        <w:annotationRef/>
+      </w:r>
+      <w:r>
+        <w:t>Je vais reboucler avec l’équipe de développement pour voir l’impacte si on laisse l’option cochée.</w:t>
+      </w:r>
+    </w:p>
+  </w:comment>
+  <w:comment w:id="10" w:author="Vincent FACHERO, Ifremer Brest PDG-IRSI-ISI, 02 " w:date="2025-02-07T09:18:00Z" w:initials="VFIBPII0">
+    <w:p>
+      <w:pPr>
+        <w:pStyle w:val="Commentaire"/>
+      </w:pPr>
+      <w:r>
+        <w:rPr>
+          <w:rStyle w:val="Marquedecommentaire"/>
+        </w:rPr>
+        <w:annotationRef/>
+      </w:r>
+      <w:r>
+        <w:t>L’indexation ElastiSearch n’étant pas activée en exploitation (issue #</w:t>
+      </w:r>
+      <w:r>
+        <w:t>915</w:t>
+      </w:r>
+      <w:r>
+        <w:t>), la recherche de navire peut être lente.</w:t>
+      </w:r>
+    </w:p>
+  </w:comment>
+  <w:comment w:id="11" w:author="Vincent FACHERO, Ifremer Brest PDG-IRSI-ISI, 02 " w:date="2025-02-07T09:18:00Z" w:initials="VFIBPII0">
+    <w:p>
+      <w:pPr>
+        <w:pStyle w:val="Commentaire"/>
+      </w:pPr>
+      <w:r>
+        <w:rPr>
+          <w:rStyle w:val="Marquedecommentaire"/>
+        </w:rPr>
+        <w:annotationRef/>
+      </w:r>
+      <w:r>
+        <w:t>cases</w:t>
+      </w:r>
+    </w:p>
+  </w:comment>
+  <w:comment w:id="14" w:author="Vincent FACHERO, Ifremer Brest PDG-IRSI-ISI, 02 " w:date="2025-02-07T09:20:00Z" w:initials="VFIBPII0">
+    <w:p>
+      <w:pPr>
+        <w:pStyle w:val="Commentaire"/>
+      </w:pPr>
+      <w:r>
+        <w:rPr>
+          <w:rStyle w:val="Marquedecommentaire"/>
+        </w:rPr>
+        <w:annotationRef/>
+      </w:r>
+      <w:r>
+        <w:t>Normalement si. Si on vide le cache de l’application, les préférences utilisateur ne sont pas conservées.</w:t>
+      </w:r>
+    </w:p>
+  </w:comment>
+  <w:comment w:id="15" w:author="Vincent FACHERO, Ifremer Brest PDG-IRSI-ISI, 02 " w:date="2025-02-07T09:21:00Z" w:initials="VFIBPII0">
+    <w:p>
+      <w:pPr>
+        <w:pStyle w:val="Commentaire"/>
+      </w:pPr>
+      <w:r>
+        <w:rPr>
+          <w:rStyle w:val="Marquedecommentaire"/>
+        </w:rPr>
+        <w:annotationRef/>
+      </w:r>
+      <w:r>
+        <w:t>F</w:t>
+      </w:r>
+      <w:r>
+        <w:t>ormulation</w:t>
+      </w:r>
+      <w:r>
+        <w:t xml:space="preserve"> à revoir ?</w:t>
+      </w:r>
+    </w:p>
+  </w:comment>
+  <w:comment w:id="16" w:author="Vincent FACHERO, Ifremer Brest PDG-IRSI-ISI, 02 " w:date="2025-02-07T09:23:00Z" w:initials="VFIBPII0">
+    <w:p>
+      <w:pPr>
+        <w:pStyle w:val="Commentaire"/>
+      </w:pPr>
+      <w:r>
+        <w:rPr>
+          <w:rStyle w:val="Marquedecommentaire"/>
+        </w:rPr>
+        <w:annotationRef/>
+      </w:r>
+      <w:r>
+        <w:t>Un contrôle pourrait être rajouté en V2.</w:t>
+      </w:r>
+    </w:p>
+  </w:comment>
+  <w:comment w:id="17" w:author="Vincent FACHERO, Ifremer Brest PDG-IRSI-ISI, 02 " w:date="2025-02-07T09:24:00Z" w:initials="VFIBPII0">
+    <w:p>
+      <w:pPr>
+        <w:pStyle w:val="Commentaire"/>
+      </w:pPr>
+      <w:r>
+        <w:rPr>
+          <w:rStyle w:val="Marquedecommentaire"/>
+        </w:rPr>
+        <w:annotationRef/>
+      </w:r>
+      <w:r>
+        <w:t>Plus besoin. Les listes se rafraichissent automatiquement désormais (issue #</w:t>
+      </w:r>
+      <w:r>
+        <w:t>906</w:t>
+      </w:r>
+      <w:r>
+        <w:t>)</w:t>
+      </w:r>
+    </w:p>
+  </w:comment>
+  <w:comment w:id="18" w:author="Vincent FACHERO, Ifremer Brest PDG-IRSI-ISI, 02 " w:date="2025-02-07T09:25:00Z" w:initials="VFIBPII0">
+    <w:p>
+      <w:pPr>
+        <w:pStyle w:val="Commentaire"/>
+      </w:pPr>
+      <w:r>
+        <w:rPr>
+          <w:rStyle w:val="Marquedecommentaire"/>
+        </w:rPr>
+        <w:annotationRef/>
+      </w:r>
+      <w:r>
+        <w:t>Pas régionalisée</w:t>
+      </w:r>
+    </w:p>
+  </w:comment>
+  <w:comment w:id="19" w:author="Vincent FACHERO, Ifremer Brest PDG-IRSI-ISI, 02 " w:date="2025-02-07T09:25:00Z" w:initials="VFIBPII0">
+    <w:p>
+      <w:pPr>
+        <w:pStyle w:val="Commentaire"/>
+      </w:pPr>
+      <w:r>
+        <w:rPr>
+          <w:rStyle w:val="Marquedecommentaire"/>
+        </w:rPr>
+        <w:annotationRef/>
+      </w:r>
+      <w:r>
+        <w:t>Dépend de la zone de pêche sélectionnée</w:t>
+      </w:r>
+    </w:p>
+  </w:comment>
+  <w:comment w:id="20" w:author="Vincent FACHERO, Ifremer Brest PDG-IRSI-ISI, 02 " w:date="2025-02-07T09:28:00Z" w:initials="VFIBPII0">
+    <w:p>
+      <w:pPr>
+        <w:pStyle w:val="Commentaire"/>
+      </w:pPr>
+      <w:r>
+        <w:rPr>
+          <w:rStyle w:val="Marquedecommentaire"/>
+        </w:rPr>
+        <w:annotationRef/>
+      </w:r>
+      <w:r>
+        <w:t>Introduire le rôle de l’étoile en bas d’un mois : permet d’annuler les modifications sur le mois saisi</w:t>
+      </w:r>
+    </w:p>
+  </w:comment>
+  <w:comment w:id="21" w:author="Vincent FACHERO, Ifremer Brest PDG-IRSI-ISI, 02 " w:date="2025-02-07T09:29:00Z" w:initials="VFIBPII0">
+    <w:p>
+      <w:pPr>
+        <w:pStyle w:val="Commentaire"/>
+      </w:pPr>
+      <w:r>
+        <w:rPr>
+          <w:rStyle w:val="Marquedecommentaire"/>
+        </w:rPr>
+        <w:annotationRef/>
+      </w:r>
+      <w:r>
+        <w:t>Mentionner aussi le fait de pouvoir vider un mois avec l’icône poubelle sous un mois</w:t>
+      </w:r>
+    </w:p>
+  </w:comment>
+  <w:comment w:id="24" w:author="Vincent FACHERO, Ifremer Brest PDG-IRSI-ISI, 02 " w:date="2025-02-07T10:01:00Z" w:initials="VFIBPII0">
+    <w:p>
+      <w:pPr>
+        <w:pStyle w:val="Commentaire"/>
+      </w:pPr>
+      <w:r>
+        <w:rPr>
+          <w:rStyle w:val="Marquedecommentaire"/>
+        </w:rPr>
+        <w:annotationRef/>
+      </w:r>
+      <w:r>
+        <w:t>Indiquer qu’il s’agit d’un mode de travail déconnecté (mode terrain) qui n’est pas encore implémenté dans la V1.</w:t>
+      </w:r>
+    </w:p>
+  </w:comment>
+  <w:comment w:id="27" w:author="Vincent FACHERO, Ifremer Brest PDG-IRSI-ISI, 02 " w:date="2025-02-07T10:02:00Z" w:initials="VFIBPII0">
+    <w:p>
+      <w:pPr>
+        <w:pStyle w:val="Commentaire"/>
+      </w:pPr>
+      <w:r>
+        <w:rPr>
+          <w:rStyle w:val="Marquedecommentaire"/>
+        </w:rPr>
+        <w:annotationRef/>
+      </w:r>
+      <w:r>
+        <w:t>Indiquer ou télécharger</w:t>
+      </w:r>
+      <w:r>
+        <w:t xml:space="preserve"> ce document</w:t>
+      </w:r>
+    </w:p>
+  </w:comment>
+</w:comments>
+</file>
+
+<file path=word/commentsExtended.xml><?xml version="1.0" encoding="utf-8"?>
+<w15:commentsEx xmlns:wpc="http://schemas.microsoft.com/office/word/2010/wordprocessingCanvas" xmlns:cx="http://schemas.microsoft.com/office/drawing/2014/chartex" xmlns:cx1="http://schemas.microsoft.com/office/drawing/2015/9/8/chartex" xmlns:cx2="http://schemas.microsoft.com/office/drawing/2015/10/21/chartex" xmlns:cx3="http://schemas.microsoft.com/office/drawing/2016/5/9/chartex" xmlns:cx4="http://schemas.microsoft.com/office/drawing/2016/5/10/chartex" xmlns:cx5="http://schemas.microsoft.com/office/drawing/2016/5/11/chartex" xmlns:cx6="http://schemas.microsoft.com/office/drawing/2016/5/12/chartex" xmlns:cx7="http://schemas.microsoft.com/office/drawing/2016/5/13/chartex" xmlns:cx8="http://schemas.microsoft.com/office/drawing/2016/5/14/chartex" xmlns:mc="http://schemas.openxmlformats.org/markup-compatibility/2006" xmlns:aink="http://schemas.microsoft.com/office/drawing/2016/ink" xmlns:am3d="http://schemas.microsoft.com/office/drawing/2017/model3d" xmlns:o="urn:schemas-microsoft-com:office:office" xmlns:r="http://schemas.openxmlformats.org/officeDocument/2006/relationships" xmlns:m="http://schemas.openxmlformats.org/officeDocument/2006/math" xmlns:v="urn:schemas-microsoft-com:vml" xmlns:wp14="http://schemas.microsoft.com/office/word/2010/wordprocessingDrawing" xmlns:wp="http://schemas.openxmlformats.org/drawingml/2006/wordprocessingDrawing" xmlns:w10="urn:schemas-microsoft-com:office:word" xmlns:w="http://schemas.openxmlformats.org/wordprocessingml/2006/main" xmlns:w14="http://schemas.microsoft.com/office/word/2010/wordml" xmlns:w15="http://schemas.microsoft.com/office/word/2012/wordml" xmlns:w16cex="http://schemas.microsoft.com/office/word/2018/wordml/cex" xmlns:w16cid="http://schemas.microsoft.com/office/word/2016/wordml/cid" xmlns:w16="http://schemas.microsoft.com/office/word/2018/wordml" xmlns:w16sdtdh="http://schemas.microsoft.com/office/word/2020/wordml/sdtdatahash" xmlns:w16se="http://schemas.microsoft.com/office/word/2015/wordml/symex" xmlns:wpg="http://schemas.microsoft.com/office/word/2010/wordprocessingGroup" xmlns:wpi="http://schemas.microsoft.com/office/word/2010/wordprocessingInk" xmlns:wne="http://schemas.microsoft.com/office/word/2006/wordml" xmlns:wps="http://schemas.microsoft.com/office/word/2010/wordprocessingShape" mc:Ignorable="w14 w15 w16se w16cid w16 w16cex w16sdtdh wp14">
+  <w15:commentEx w15:paraId="2186DFC0" w15:done="0"/>
+  <w15:commentEx w15:paraId="2E2B66D5" w15:done="0"/>
+  <w15:commentEx w15:paraId="24BC82FA" w15:done="0"/>
+  <w15:commentEx w15:paraId="2AAC0322" w15:done="0"/>
+  <w15:commentEx w15:paraId="57662F23" w15:done="0"/>
+  <w15:commentEx w15:paraId="63FD4970" w15:done="0"/>
+  <w15:commentEx w15:paraId="7A9F92F1" w15:done="0"/>
+  <w15:commentEx w15:paraId="0BDC8BB4" w15:done="0"/>
+  <w15:commentEx w15:paraId="45A440FE" w15:done="0"/>
+  <w15:commentEx w15:paraId="0EB43BE7" w15:done="0"/>
+  <w15:commentEx w15:paraId="33A7585B" w15:done="0"/>
+  <w15:commentEx w15:paraId="316FF6F4" w15:done="0"/>
+  <w15:commentEx w15:paraId="0CC720C1" w15:done="0"/>
+  <w15:commentEx w15:paraId="2A71FA73" w15:done="0"/>
+  <w15:commentEx w15:paraId="7B1894BE" w15:done="0"/>
+  <w15:commentEx w15:paraId="4D17FF50" w15:done="0"/>
+  <w15:commentEx w15:paraId="19EFE7A2" w15:done="0"/>
+</w15:commentsEx>
+</file>
+
+<file path=word/commentsExtensible.xml><?xml version="1.0" encoding="utf-8"?>
+<w16cex:commentsExtensible xmlns:wpc="http://schemas.microsoft.com/office/word/2010/wordprocessingCanvas" xmlns:cx="http://schemas.microsoft.com/office/drawing/2014/chartex" xmlns:cx1="http://schemas.microsoft.com/office/drawing/2015/9/8/chartex" xmlns:cx2="http://schemas.microsoft.com/office/drawing/2015/10/21/chartex" xmlns:cx3="http://schemas.microsoft.com/office/drawing/2016/5/9/chartex" xmlns:cx4="http://schemas.microsoft.com/office/drawing/2016/5/10/chartex" xmlns:cx5="http://schemas.microsoft.com/office/drawing/2016/5/11/chartex" xmlns:cx6="http://schemas.microsoft.com/office/drawing/2016/5/12/chartex" xmlns:cx7="http://schemas.microsoft.com/office/drawing/2016/5/13/chartex" xmlns:cx8="http://schemas.microsoft.com/office/drawing/2016/5/14/chartex" xmlns:mc="http://schemas.openxmlformats.org/markup-compatibility/2006" xmlns:aink="http://schemas.microsoft.com/office/drawing/2016/ink" xmlns:am3d="http://schemas.microsoft.com/office/drawing/2017/model3d" xmlns:o="urn:schemas-microsoft-com:office:office" xmlns:r="http://schemas.openxmlformats.org/officeDocument/2006/relationships" xmlns:m="http://schemas.openxmlformats.org/officeDocument/2006/math" xmlns:v="urn:schemas-microsoft-com:vml" xmlns:wp14="http://schemas.microsoft.com/office/word/2010/wordprocessingDrawing" xmlns:wp="http://schemas.openxmlformats.org/drawingml/2006/wordprocessingDrawing" xmlns:w10="urn:schemas-microsoft-com:office:word" xmlns:w="http://schemas.openxmlformats.org/wordprocessingml/2006/main" xmlns:w14="http://schemas.microsoft.com/office/word/2010/wordml" xmlns:w15="http://schemas.microsoft.com/office/word/2012/wordml" xmlns:w16cex="http://schemas.microsoft.com/office/word/2018/wordml/cex" xmlns:w16cid="http://schemas.microsoft.com/office/word/2016/wordml/cid" xmlns:w16="http://schemas.microsoft.com/office/word/2018/wordml" xmlns:w16sdtdh="http://schemas.microsoft.com/office/word/2020/wordml/sdtdatahash" xmlns:w16se="http://schemas.microsoft.com/office/word/2015/wordml/symex" xmlns:wpg="http://schemas.microsoft.com/office/word/2010/wordprocessingGroup" xmlns:wpi="http://schemas.microsoft.com/office/word/2010/wordprocessingInk" xmlns:wne="http://schemas.microsoft.com/office/word/2006/wordml" xmlns:wps="http://schemas.microsoft.com/office/word/2010/wordprocessingShape" mc:Ignorable="w14 w15 w16se w16cid w16 w16cex w16sdtdh wp14">
+  <w16cex:commentExtensible w16cex:durableId="2B505A74" w16cex:dateUtc="2025-02-07T09:09:00Z"/>
+  <w16cex:commentExtensible w16cex:durableId="2B4FBD5D" w16cex:dateUtc="2025-02-06T21:59:00Z"/>
+  <w16cex:commentExtensible w16cex:durableId="2B505A6A" w16cex:dateUtc="2025-02-07T09:09:00Z"/>
+  <w16cex:commentExtensible w16cex:durableId="2B4FBC8A" w16cex:dateUtc="2025-02-06T21:56:00Z"/>
+  <w16cex:commentExtensible w16cex:durableId="2B4FBD2C" w16cex:dateUtc="2025-02-06T21:58:00Z"/>
+  <w16cex:commentExtensible w16cex:durableId="2B504E5E" w16cex:dateUtc="2025-02-07T08:18:00Z"/>
+  <w16cex:commentExtensible w16cex:durableId="2B504E4A" w16cex:dateUtc="2025-02-07T08:18:00Z"/>
+  <w16cex:commentExtensible w16cex:durableId="2B504EDD" w16cex:dateUtc="2025-02-07T08:20:00Z"/>
+  <w16cex:commentExtensible w16cex:durableId="2B504F36" w16cex:dateUtc="2025-02-07T08:21:00Z"/>
+  <w16cex:commentExtensible w16cex:durableId="2B504F8E" w16cex:dateUtc="2025-02-07T08:23:00Z"/>
+  <w16cex:commentExtensible w16cex:durableId="2B504FC2" w16cex:dateUtc="2025-02-07T08:24:00Z"/>
+  <w16cex:commentExtensible w16cex:durableId="2B505018" w16cex:dateUtc="2025-02-07T08:25:00Z"/>
+  <w16cex:commentExtensible w16cex:durableId="2B505022" w16cex:dateUtc="2025-02-07T08:25:00Z"/>
+  <w16cex:commentExtensible w16cex:durableId="2B5050A1" w16cex:dateUtc="2025-02-07T08:28:00Z"/>
+  <w16cex:commentExtensible w16cex:durableId="2B5050EA" w16cex:dateUtc="2025-02-07T08:29:00Z"/>
+  <w16cex:commentExtensible w16cex:durableId="2B505882" w16cex:dateUtc="2025-02-07T09:01:00Z"/>
+  <w16cex:commentExtensible w16cex:durableId="2B5058CB" w16cex:dateUtc="2025-02-07T09:02:00Z"/>
+</w16cex:commentsExtensible>
+</file>
+
+<file path=word/commentsIds.xml><?xml version="1.0" encoding="utf-8"?>
+<w16cid:commentsIds xmlns:wpc="http://schemas.microsoft.com/office/word/2010/wordprocessingCanvas" xmlns:cx="http://schemas.microsoft.com/office/drawing/2014/chartex" xmlns:cx1="http://schemas.microsoft.com/office/drawing/2015/9/8/chartex" xmlns:cx2="http://schemas.microsoft.com/office/drawing/2015/10/21/chartex" xmlns:cx3="http://schemas.microsoft.com/office/drawing/2016/5/9/chartex" xmlns:cx4="http://schemas.microsoft.com/office/drawing/2016/5/10/chartex" xmlns:cx5="http://schemas.microsoft.com/office/drawing/2016/5/11/chartex" xmlns:cx6="http://schemas.microsoft.com/office/drawing/2016/5/12/chartex" xmlns:cx7="http://schemas.microsoft.com/office/drawing/2016/5/13/chartex" xmlns:cx8="http://schemas.microsoft.com/office/drawing/2016/5/14/chartex" xmlns:mc="http://schemas.openxmlformats.org/markup-compatibility/2006" xmlns:aink="http://schemas.microsoft.com/office/drawing/2016/ink" xmlns:am3d="http://schemas.microsoft.com/office/drawing/2017/model3d" xmlns:o="urn:schemas-microsoft-com:office:office" xmlns:r="http://schemas.openxmlformats.org/officeDocument/2006/relationships" xmlns:m="http://schemas.openxmlformats.org/officeDocument/2006/math" xmlns:v="urn:schemas-microsoft-com:vml" xmlns:wp14="http://schemas.microsoft.com/office/word/2010/wordprocessingDrawing" xmlns:wp="http://schemas.openxmlformats.org/drawingml/2006/wordprocessingDrawing" xmlns:w10="urn:schemas-microsoft-com:office:word" xmlns:w="http://schemas.openxmlformats.org/wordprocessingml/2006/main" xmlns:w14="http://schemas.microsoft.com/office/word/2010/wordml" xmlns:w15="http://schemas.microsoft.com/office/word/2012/wordml" xmlns:w16cex="http://schemas.microsoft.com/office/word/2018/wordml/cex" xmlns:w16cid="http://schemas.microsoft.com/office/word/2016/wordml/cid" xmlns:w16="http://schemas.microsoft.com/office/word/2018/wordml" xmlns:w16sdtdh="http://schemas.microsoft.com/office/word/2020/wordml/sdtdatahash" xmlns:w16se="http://schemas.microsoft.com/office/word/2015/wordml/symex" xmlns:wpg="http://schemas.microsoft.com/office/word/2010/wordprocessingGroup" xmlns:wpi="http://schemas.microsoft.com/office/word/2010/wordprocessingInk" xmlns:wne="http://schemas.microsoft.com/office/word/2006/wordml" xmlns:wps="http://schemas.microsoft.com/office/word/2010/wordprocessingShape" mc:Ignorable="w14 w15 w16se w16cid w16 w16cex w16sdtdh wp14">
+  <w16cid:commentId w16cid:paraId="2186DFC0" w16cid:durableId="2B505A74"/>
+  <w16cid:commentId w16cid:paraId="2E2B66D5" w16cid:durableId="2B4FBD5D"/>
+  <w16cid:commentId w16cid:paraId="24BC82FA" w16cid:durableId="2B505A6A"/>
+  <w16cid:commentId w16cid:paraId="2AAC0322" w16cid:durableId="2B4FBC8A"/>
+  <w16cid:commentId w16cid:paraId="57662F23" w16cid:durableId="2B4FBD2C"/>
+  <w16cid:commentId w16cid:paraId="63FD4970" w16cid:durableId="2B504E5E"/>
+  <w16cid:commentId w16cid:paraId="7A9F92F1" w16cid:durableId="2B504E4A"/>
+  <w16cid:commentId w16cid:paraId="0BDC8BB4" w16cid:durableId="2B504EDD"/>
+  <w16cid:commentId w16cid:paraId="45A440FE" w16cid:durableId="2B504F36"/>
+  <w16cid:commentId w16cid:paraId="0EB43BE7" w16cid:durableId="2B504F8E"/>
+  <w16cid:commentId w16cid:paraId="33A7585B" w16cid:durableId="2B504FC2"/>
+  <w16cid:commentId w16cid:paraId="316FF6F4" w16cid:durableId="2B505018"/>
+  <w16cid:commentId w16cid:paraId="0CC720C1" w16cid:durableId="2B505022"/>
+  <w16cid:commentId w16cid:paraId="2A71FA73" w16cid:durableId="2B5050A1"/>
+  <w16cid:commentId w16cid:paraId="7B1894BE" w16cid:durableId="2B5050EA"/>
+  <w16cid:commentId w16cid:paraId="4D17FF50" w16cid:durableId="2B505882"/>
+  <w16cid:commentId w16cid:paraId="19EFE7A2" w16cid:durableId="2B5058CB"/>
+</w16cid:commentsIds>
+</file>
+
 <file path=word/numbering.xml><?xml version="1.0" encoding="utf-8"?>
 <w:numbering xmlns:wpc="http://schemas.microsoft.com/office/word/2010/wordprocessingCanvas" xmlns:cx="http://schemas.microsoft.com/office/drawing/2014/chartex" xmlns:cx1="http://schemas.microsoft.com/office/drawing/2015/9/8/chartex" xmlns:cx2="http://schemas.microsoft.com/office/drawing/2015/10/21/chartex" xmlns:cx3="http://schemas.microsoft.com/office/drawing/2016/5/9/chartex" xmlns:cx4="http://schemas.microsoft.com/office/drawing/2016/5/10/chartex" xmlns:cx5="http://schemas.microsoft.com/office/drawing/2016/5/11/chartex" xmlns:cx6="http://schemas.microsoft.com/office/drawing/2016/5/12/chartex" xmlns:cx7="http://schemas.microsoft.com/office/drawing/2016/5/13/chartex" xmlns:cx8="http://schemas.microsoft.com/office/drawing/2016/5/14/chartex" xmlns:mc="http://schemas.openxmlformats.org/markup-compatibility/2006" xmlns:aink="http://schemas.microsoft.com/office/drawing/2016/ink" xmlns:am3d="http://schemas.microsoft.com/office/drawing/2017/model3d" xmlns:o="urn:schemas-microsoft-com:office:office" xmlns:r="http://schemas.openxmlformats.org/officeDocument/2006/relationships" xmlns:m="http://schemas.openxmlformats.org/officeDocument/2006/math" xmlns:v="urn:schemas-microsoft-com:vml" xmlns:wp14="http://schemas.microsoft.com/office/word/2010/wordprocessingDrawing" xmlns:wp="http://schemas.openxmlformats.org/drawingml/2006/wordprocessingDrawing" xmlns:w10="urn:schemas-microsoft-com:office:word" xmlns:w="http://schemas.openxmlformats.org/wordprocessingml/2006/main" xmlns:w14="http://schemas.microsoft.com/office/word/2010/wordml" xmlns:w15="http://schemas.microsoft.com/office/word/2012/wordml" xmlns:w16cex="http://schemas.microsoft.com/office/word/2018/wordml/cex" xmlns:w16cid="http://schemas.microsoft.com/office/word/2016/wordml/cid" xmlns:w16="http://schemas.microsoft.com/office/word/2018/wordml" xmlns:w16sdtdh="http://schemas.microsoft.com/office/word/2020/wordml/sdtdatahash" xmlns:w16se="http://schemas.microsoft.com/office/word/2015/wordml/symex" xmlns:wpg="http://schemas.microsoft.com/office/word/2010/wordprocessingGroup" xmlns:wpi="http://schemas.microsoft.com/office/word/2010/wordprocessingInk" xmlns:wne="http://schemas.microsoft.com/office/word/2006/wordml" xmlns:wps="http://schemas.microsoft.com/office/word/2010/wordprocessingShape" mc:Ignorable="w14 w15 w16se w16cid w16 w16cex w16sdtdh wp14">
   <w:abstractNum w:abstractNumId="0" w15:restartNumberingAfterBreak="0">
@@ -19702,6 +20248,118 @@
     </w:lvl>
   </w:abstractNum>
   <w:abstractNum w:abstractNumId="5" w15:restartNumberingAfterBreak="0">
+    <w:nsid w:val="2E1B0C3E"/>
+    <w:multiLevelType w:val="hybridMultilevel"/>
+    <w:tmpl w:val="7EF60ECA"/>
+    <w:lvl w:ilvl="0" w:tplc="1BD03DAC">
+      <w:numFmt w:val="bullet"/>
+      <w:lvlText w:val="-"/>
+      <w:lvlJc w:val="left"/>
+      <w:pPr>
+        <w:ind w:left="720" w:hanging="360"/>
+      </w:pPr>
+      <w:rPr>
+        <w:rFonts w:ascii="Calibri" w:eastAsiaTheme="minorHAnsi" w:hAnsi="Calibri" w:cs="Calibri" w:hint="default"/>
+      </w:rPr>
+    </w:lvl>
+    <w:lvl w:ilvl="1" w:tplc="040C0003" w:tentative="1">
+      <w:start w:val="1"/>
+      <w:numFmt w:val="bullet"/>
+      <w:lvlText w:val="o"/>
+      <w:lvlJc w:val="left"/>
+      <w:pPr>
+        <w:ind w:left="1440" w:hanging="360"/>
+      </w:pPr>
+      <w:rPr>
+        <w:rFonts w:ascii="Courier New" w:hAnsi="Courier New" w:cs="Courier New" w:hint="default"/>
+      </w:rPr>
+    </w:lvl>
+    <w:lvl w:ilvl="2" w:tplc="040C0005" w:tentative="1">
+      <w:start w:val="1"/>
+      <w:numFmt w:val="bullet"/>
+      <w:lvlText w:val=""/>
+      <w:lvlJc w:val="left"/>
+      <w:pPr>
+        <w:ind w:left="2160" w:hanging="360"/>
+      </w:pPr>
+      <w:rPr>
+        <w:rFonts w:ascii="Wingdings" w:hAnsi="Wingdings" w:hint="default"/>
+      </w:rPr>
+    </w:lvl>
+    <w:lvl w:ilvl="3" w:tplc="040C0001" w:tentative="1">
+      <w:start w:val="1"/>
+      <w:numFmt w:val="bullet"/>
+      <w:lvlText w:val=""/>
+      <w:lvlJc w:val="left"/>
+      <w:pPr>
+        <w:ind w:left="2880" w:hanging="360"/>
+      </w:pPr>
+      <w:rPr>
+        <w:rFonts w:ascii="Symbol" w:hAnsi="Symbol" w:hint="default"/>
+      </w:rPr>
+    </w:lvl>
+    <w:lvl w:ilvl="4" w:tplc="040C0003" w:tentative="1">
+      <w:start w:val="1"/>
+      <w:numFmt w:val="bullet"/>
+      <w:lvlText w:val="o"/>
+      <w:lvlJc w:val="left"/>
+      <w:pPr>
+        <w:ind w:left="3600" w:hanging="360"/>
+      </w:pPr>
+      <w:rPr>
+        <w:rFonts w:ascii="Courier New" w:hAnsi="Courier New" w:cs="Courier New" w:hint="default"/>
+      </w:rPr>
+    </w:lvl>
+    <w:lvl w:ilvl="5" w:tplc="040C0005" w:tentative="1">
+      <w:start w:val="1"/>
+      <w:numFmt w:val="bullet"/>
+      <w:lvlText w:val=""/>
+      <w:lvlJc w:val="left"/>
+      <w:pPr>
+        <w:ind w:left="4320" w:hanging="360"/>
+      </w:pPr>
+      <w:rPr>
+        <w:rFonts w:ascii="Wingdings" w:hAnsi="Wingdings" w:hint="default"/>
+      </w:rPr>
+    </w:lvl>
+    <w:lvl w:ilvl="6" w:tplc="040C0001" w:tentative="1">
+      <w:start w:val="1"/>
+      <w:numFmt w:val="bullet"/>
+      <w:lvlText w:val=""/>
+      <w:lvlJc w:val="left"/>
+      <w:pPr>
+        <w:ind w:left="5040" w:hanging="360"/>
+      </w:pPr>
+      <w:rPr>
+        <w:rFonts w:ascii="Symbol" w:hAnsi="Symbol" w:hint="default"/>
+      </w:rPr>
+    </w:lvl>
+    <w:lvl w:ilvl="7" w:tplc="040C0003" w:tentative="1">
+      <w:start w:val="1"/>
+      <w:numFmt w:val="bullet"/>
+      <w:lvlText w:val="o"/>
+      <w:lvlJc w:val="left"/>
+      <w:pPr>
+        <w:ind w:left="5760" w:hanging="360"/>
+      </w:pPr>
+      <w:rPr>
+        <w:rFonts w:ascii="Courier New" w:hAnsi="Courier New" w:cs="Courier New" w:hint="default"/>
+      </w:rPr>
+    </w:lvl>
+    <w:lvl w:ilvl="8" w:tplc="040C0005" w:tentative="1">
+      <w:start w:val="1"/>
+      <w:numFmt w:val="bullet"/>
+      <w:lvlText w:val=""/>
+      <w:lvlJc w:val="left"/>
+      <w:pPr>
+        <w:ind w:left="6480" w:hanging="360"/>
+      </w:pPr>
+      <w:rPr>
+        <w:rFonts w:ascii="Wingdings" w:hAnsi="Wingdings" w:hint="default"/>
+      </w:rPr>
+    </w:lvl>
+  </w:abstractNum>
+  <w:abstractNum w:abstractNumId="6" w15:restartNumberingAfterBreak="0">
     <w:nsid w:val="31E2772B"/>
     <w:multiLevelType w:val="hybridMultilevel"/>
     <w:tmpl w:val="0A8260FA"/>
@@ -19814,7 +20472,7 @@
       </w:rPr>
     </w:lvl>
   </w:abstractNum>
-  <w:abstractNum w:abstractNumId="6" w15:restartNumberingAfterBreak="0">
+  <w:abstractNum w:abstractNumId="7" w15:restartNumberingAfterBreak="0">
     <w:nsid w:val="3E0630AF"/>
     <w:multiLevelType w:val="hybridMultilevel"/>
     <w:tmpl w:val="AB6A9DCA"/>
@@ -19900,7 +20558,7 @@
       </w:pPr>
     </w:lvl>
   </w:abstractNum>
-  <w:abstractNum w:abstractNumId="7" w15:restartNumberingAfterBreak="0">
+  <w:abstractNum w:abstractNumId="8" w15:restartNumberingAfterBreak="0">
     <w:nsid w:val="56C87976"/>
     <w:multiLevelType w:val="hybridMultilevel"/>
     <w:tmpl w:val="0DDE709E"/>
@@ -20013,7 +20671,7 @@
       </w:rPr>
     </w:lvl>
   </w:abstractNum>
-  <w:abstractNum w:abstractNumId="8" w15:restartNumberingAfterBreak="0">
+  <w:abstractNum w:abstractNumId="9" w15:restartNumberingAfterBreak="0">
     <w:nsid w:val="62CF739E"/>
     <w:multiLevelType w:val="hybridMultilevel"/>
     <w:tmpl w:val="7B70E2A2"/>
@@ -20126,7 +20784,7 @@
       </w:rPr>
     </w:lvl>
   </w:abstractNum>
-  <w:abstractNum w:abstractNumId="9" w15:restartNumberingAfterBreak="0">
+  <w:abstractNum w:abstractNumId="10" w15:restartNumberingAfterBreak="0">
     <w:nsid w:val="68751889"/>
     <w:multiLevelType w:val="multilevel"/>
     <w:tmpl w:val="0C78C346"/>
@@ -20275,7 +20933,7 @@
       </w:rPr>
     </w:lvl>
   </w:abstractNum>
-  <w:abstractNum w:abstractNumId="10" w15:restartNumberingAfterBreak="0">
+  <w:abstractNum w:abstractNumId="11" w15:restartNumberingAfterBreak="0">
     <w:nsid w:val="6A1D3780"/>
     <w:multiLevelType w:val="hybridMultilevel"/>
     <w:tmpl w:val="E9388C98"/>
@@ -20388,7 +21046,7 @@
       </w:rPr>
     </w:lvl>
   </w:abstractNum>
-  <w:abstractNum w:abstractNumId="11" w15:restartNumberingAfterBreak="0">
+  <w:abstractNum w:abstractNumId="12" w15:restartNumberingAfterBreak="0">
     <w:nsid w:val="789E0BC5"/>
     <w:multiLevelType w:val="multilevel"/>
     <w:tmpl w:val="B0E4C450"/>
@@ -20537,13 +21195,13 @@
     <w:abstractNumId w:val="4"/>
   </w:num>
   <w:num w:numId="2">
-    <w:abstractNumId w:val="9"/>
+    <w:abstractNumId w:val="10"/>
   </w:num>
   <w:num w:numId="3">
     <w:abstractNumId w:val="1"/>
   </w:num>
   <w:num w:numId="4">
-    <w:abstractNumId w:val="11"/>
+    <w:abstractNumId w:val="12"/>
   </w:num>
   <w:num w:numId="5">
     <w:abstractNumId w:val="2"/>
@@ -20552,24 +21210,35 @@
     <w:abstractNumId w:val="0"/>
   </w:num>
   <w:num w:numId="7">
-    <w:abstractNumId w:val="5"/>
+    <w:abstractNumId w:val="6"/>
   </w:num>
   <w:num w:numId="8">
-    <w:abstractNumId w:val="10"/>
+    <w:abstractNumId w:val="11"/>
   </w:num>
   <w:num w:numId="9">
     <w:abstractNumId w:val="3"/>
   </w:num>
   <w:num w:numId="10">
-    <w:abstractNumId w:val="6"/>
+    <w:abstractNumId w:val="7"/>
   </w:num>
   <w:num w:numId="11">
+    <w:abstractNumId w:val="9"/>
+  </w:num>
+  <w:num w:numId="12">
     <w:abstractNumId w:val="8"/>
   </w:num>
-  <w:num w:numId="12">
-    <w:abstractNumId w:val="7"/>
+  <w:num w:numId="13">
+    <w:abstractNumId w:val="5"/>
   </w:num>
 </w:numbering>
+</file>
+
+<file path=word/people.xml><?xml version="1.0" encoding="utf-8"?>
+<w15:people xmlns:wpc="http://schemas.microsoft.com/office/word/2010/wordprocessingCanvas" xmlns:cx="http://schemas.microsoft.com/office/drawing/2014/chartex" xmlns:cx1="http://schemas.microsoft.com/office/drawing/2015/9/8/chartex" xmlns:cx2="http://schemas.microsoft.com/office/drawing/2015/10/21/chartex" xmlns:cx3="http://schemas.microsoft.com/office/drawing/2016/5/9/chartex" xmlns:cx4="http://schemas.microsoft.com/office/drawing/2016/5/10/chartex" xmlns:cx5="http://schemas.microsoft.com/office/drawing/2016/5/11/chartex" xmlns:cx6="http://schemas.microsoft.com/office/drawing/2016/5/12/chartex" xmlns:cx7="http://schemas.microsoft.com/office/drawing/2016/5/13/chartex" xmlns:cx8="http://schemas.microsoft.com/office/drawing/2016/5/14/chartex" xmlns:mc="http://schemas.openxmlformats.org/markup-compatibility/2006" xmlns:aink="http://schemas.microsoft.com/office/drawing/2016/ink" xmlns:am3d="http://schemas.microsoft.com/office/drawing/2017/model3d" xmlns:o="urn:schemas-microsoft-com:office:office" xmlns:r="http://schemas.openxmlformats.org/officeDocument/2006/relationships" xmlns:m="http://schemas.openxmlformats.org/officeDocument/2006/math" xmlns:v="urn:schemas-microsoft-com:vml" xmlns:wp14="http://schemas.microsoft.com/office/word/2010/wordprocessingDrawing" xmlns:wp="http://schemas.openxmlformats.org/drawingml/2006/wordprocessingDrawing" xmlns:w10="urn:schemas-microsoft-com:office:word" xmlns:w="http://schemas.openxmlformats.org/wordprocessingml/2006/main" xmlns:w14="http://schemas.microsoft.com/office/word/2010/wordml" xmlns:w15="http://schemas.microsoft.com/office/word/2012/wordml" xmlns:w16cex="http://schemas.microsoft.com/office/word/2018/wordml/cex" xmlns:w16cid="http://schemas.microsoft.com/office/word/2016/wordml/cid" xmlns:w16="http://schemas.microsoft.com/office/word/2018/wordml" xmlns:w16sdtdh="http://schemas.microsoft.com/office/word/2020/wordml/sdtdatahash" xmlns:w16se="http://schemas.microsoft.com/office/word/2015/wordml/symex" xmlns:wpg="http://schemas.microsoft.com/office/word/2010/wordprocessingGroup" xmlns:wpi="http://schemas.microsoft.com/office/word/2010/wordprocessingInk" xmlns:wne="http://schemas.microsoft.com/office/word/2006/wordml" xmlns:wps="http://schemas.microsoft.com/office/word/2010/wordprocessingShape" mc:Ignorable="w14 w15 w16se w16cid w16 w16cex w16sdtdh wp14">
+  <w15:person w15:author="Vincent FACHERO, Ifremer Brest PDG-IRSI-ISI, 02 ">
+    <w15:presenceInfo w15:providerId="AD" w15:userId="S-1-5-21-500109986-1412980772-1848903544-3209911"/>
+  </w15:person>
+</w15:people>
 </file>
 
 <file path=word/styles.xml><?xml version="1.0" encoding="utf-8"?>
@@ -20975,6 +21644,7 @@
   <w:style w:type="character" w:default="1" w:styleId="Policepardfaut">
     <w:name w:val="Default Paragraph Font"/>
     <w:uiPriority w:val="1"/>
+    <w:semiHidden/>
     <w:unhideWhenUsed/>
   </w:style>
   <w:style w:type="table" w:default="1" w:styleId="TableauNormal">
@@ -21047,6 +21717,74 @@
     <w:rPr>
       <w:color w:val="605E5C"/>
       <w:shd w:val="clear" w:color="auto" w:fill="E1DFDD"/>
+    </w:rPr>
+  </w:style>
+  <w:style w:type="character" w:styleId="Marquedecommentaire">
+    <w:name w:val="annotation reference"/>
+    <w:basedOn w:val="Policepardfaut"/>
+    <w:uiPriority w:val="99"/>
+    <w:semiHidden/>
+    <w:unhideWhenUsed/>
+    <w:rsid w:val="00971C0C"/>
+    <w:rPr>
+      <w:sz w:val="16"/>
+      <w:szCs w:val="16"/>
+    </w:rPr>
+  </w:style>
+  <w:style w:type="paragraph" w:styleId="Commentaire">
+    <w:name w:val="annotation text"/>
+    <w:basedOn w:val="Normal"/>
+    <w:link w:val="CommentaireCar"/>
+    <w:uiPriority w:val="99"/>
+    <w:semiHidden/>
+    <w:unhideWhenUsed/>
+    <w:rsid w:val="00971C0C"/>
+    <w:pPr>
+      <w:spacing w:line="240" w:lineRule="auto"/>
+    </w:pPr>
+    <w:rPr>
+      <w:sz w:val="20"/>
+      <w:szCs w:val="20"/>
+    </w:rPr>
+  </w:style>
+  <w:style w:type="character" w:customStyle="1" w:styleId="CommentaireCar">
+    <w:name w:val="Commentaire Car"/>
+    <w:basedOn w:val="Policepardfaut"/>
+    <w:link w:val="Commentaire"/>
+    <w:uiPriority w:val="99"/>
+    <w:semiHidden/>
+    <w:rsid w:val="00971C0C"/>
+    <w:rPr>
+      <w:sz w:val="20"/>
+      <w:szCs w:val="20"/>
+    </w:rPr>
+  </w:style>
+  <w:style w:type="paragraph" w:styleId="Objetducommentaire">
+    <w:name w:val="annotation subject"/>
+    <w:basedOn w:val="Commentaire"/>
+    <w:next w:val="Commentaire"/>
+    <w:link w:val="ObjetducommentaireCar"/>
+    <w:uiPriority w:val="99"/>
+    <w:semiHidden/>
+    <w:unhideWhenUsed/>
+    <w:rsid w:val="00971C0C"/>
+    <w:rPr>
+      <w:b/>
+      <w:bCs/>
+    </w:rPr>
+  </w:style>
+  <w:style w:type="character" w:customStyle="1" w:styleId="ObjetducommentaireCar">
+    <w:name w:val="Objet du commentaire Car"/>
+    <w:basedOn w:val="CommentaireCar"/>
+    <w:link w:val="Objetducommentaire"/>
+    <w:uiPriority w:val="99"/>
+    <w:semiHidden/>
+    <w:rsid w:val="00971C0C"/>
+    <w:rPr>
+      <w:b/>
+      <w:bCs/>
+      <w:sz w:val="20"/>
+      <w:szCs w:val="20"/>
     </w:rPr>
   </w:style>
 </w:styles>

</xml_diff>

<commit_message>
[not] ActiFlot MOA other user manual review
</commit_message>
<xml_diff>
--- a/projects/activity-calendar/doc/Guide_utilisateur_OPUS_enquete_activite.docx
+++ b/projects/activity-calendar/doc/Guide_utilisateur_OPUS_enquete_activite.docx
@@ -1,6 +1,6 @@
 
 <file path=word/document.xml><?xml version="1.0" encoding="utf-8"?>
-<w:document xmlns:wpc="http://schemas.microsoft.com/office/word/2010/wordprocessingCanvas" xmlns:cx="http://schemas.microsoft.com/office/drawing/2014/chartex" xmlns:cx1="http://schemas.microsoft.com/office/drawing/2015/9/8/chartex" xmlns:cx2="http://schemas.microsoft.com/office/drawing/2015/10/21/chartex" xmlns:cx3="http://schemas.microsoft.com/office/drawing/2016/5/9/chartex" xmlns:cx4="http://schemas.microsoft.com/office/drawing/2016/5/10/chartex" xmlns:cx5="http://schemas.microsoft.com/office/drawing/2016/5/11/chartex" xmlns:cx6="http://schemas.microsoft.com/office/drawing/2016/5/12/chartex" xmlns:cx7="http://schemas.microsoft.com/office/drawing/2016/5/13/chartex" xmlns:cx8="http://schemas.microsoft.com/office/drawing/2016/5/14/chartex" xmlns:mc="http://schemas.openxmlformats.org/markup-compatibility/2006" xmlns:aink="http://schemas.microsoft.com/office/drawing/2016/ink" xmlns:am3d="http://schemas.microsoft.com/office/drawing/2017/model3d" xmlns:o="urn:schemas-microsoft-com:office:office" xmlns:r="http://schemas.openxmlformats.org/officeDocument/2006/relationships" xmlns:m="http://schemas.openxmlformats.org/officeDocument/2006/math" xmlns:v="urn:schemas-microsoft-com:vml" xmlns:wp14="http://schemas.microsoft.com/office/word/2010/wordprocessingDrawing" xmlns:wp="http://schemas.openxmlformats.org/drawingml/2006/wordprocessingDrawing" xmlns:w10="urn:schemas-microsoft-com:office:word" xmlns:w="http://schemas.openxmlformats.org/wordprocessingml/2006/main" xmlns:w14="http://schemas.microsoft.com/office/word/2010/wordml" xmlns:w15="http://schemas.microsoft.com/office/word/2012/wordml" xmlns:w16cex="http://schemas.microsoft.com/office/word/2018/wordml/cex" xmlns:w16cid="http://schemas.microsoft.com/office/word/2016/wordml/cid" xmlns:w16="http://schemas.microsoft.com/office/word/2018/wordml" xmlns:w16sdtdh="http://schemas.microsoft.com/office/word/2020/wordml/sdtdatahash" xmlns:w16se="http://schemas.microsoft.com/office/word/2015/wordml/symex" xmlns:wpg="http://schemas.microsoft.com/office/word/2010/wordprocessingGroup" xmlns:wpi="http://schemas.microsoft.com/office/word/2010/wordprocessingInk" xmlns:wne="http://schemas.microsoft.com/office/word/2006/wordml" xmlns:wps="http://schemas.microsoft.com/office/word/2010/wordprocessingShape" mc:Ignorable="w14 w15 w16se w16cid w16 w16cex w16sdtdh wp14">
+<w:document xmlns:wpc="http://schemas.microsoft.com/office/word/2010/wordprocessingCanvas" xmlns:cx="http://schemas.microsoft.com/office/drawing/2014/chartex" xmlns:cx1="http://schemas.microsoft.com/office/drawing/2015/9/8/chartex" xmlns:mc="http://schemas.openxmlformats.org/markup-compatibility/2006" xmlns:o="urn:schemas-microsoft-com:office:office" xmlns:r="http://schemas.openxmlformats.org/officeDocument/2006/relationships" xmlns:m="http://schemas.openxmlformats.org/officeDocument/2006/math" xmlns:v="urn:schemas-microsoft-com:vml" xmlns:wp14="http://schemas.microsoft.com/office/word/2010/wordprocessingDrawing" xmlns:wp="http://schemas.openxmlformats.org/drawingml/2006/wordprocessingDrawing" xmlns:w10="urn:schemas-microsoft-com:office:word" xmlns:w="http://schemas.openxmlformats.org/wordprocessingml/2006/main" xmlns:w14="http://schemas.microsoft.com/office/word/2010/wordml" xmlns:w15="http://schemas.microsoft.com/office/word/2012/wordml" xmlns:w16se="http://schemas.microsoft.com/office/word/2015/wordml/symex" xmlns:wpg="http://schemas.microsoft.com/office/word/2010/wordprocessingGroup" xmlns:wpi="http://schemas.microsoft.com/office/word/2010/wordprocessingInk" xmlns:wne="http://schemas.microsoft.com/office/word/2006/wordml" xmlns:wps="http://schemas.microsoft.com/office/word/2010/wordprocessingShape" mc:Ignorable="w14 w15 w16se wp14">
   <w:body>
     <w:p>
       <w:pPr>
@@ -19,6 +19,7 @@
       </w:pPr>
       <w:bookmarkStart w:id="0" w:name="_Hlk187330516"/>
       <w:bookmarkEnd w:id="0"/>
+      <w:commentRangeStart w:id="1"/>
       <w:r>
         <w:rPr>
           <w:rFonts w:ascii="Times New Roman" w:eastAsia="Times New Roman" w:hAnsi="Times New Roman" w:cs="Times New Roman"/>
@@ -67,6 +68,13 @@
         </w:rPr>
         <w:t>activité</w:t>
       </w:r>
+      <w:commentRangeEnd w:id="1"/>
+      <w:r>
+        <w:rPr>
+          <w:rStyle w:val="Marquedecommentaire"/>
+        </w:rPr>
+        <w:commentReference w:id="1"/>
+      </w:r>
     </w:p>
     <w:p>
       <w:pPr>
@@ -94,8 +102,8 @@
         <w:t>Sommaire</w:t>
       </w:r>
     </w:p>
-    <w:commentRangeStart w:id="1"/>
-    <w:commentRangeStart w:id="2"/>
+    <w:commentRangeStart w:id="3"/>
+    <w:commentRangeStart w:id="4"/>
     <w:p>
       <w:pPr>
         <w:numPr>
@@ -259,7 +267,7 @@
         </w:r>
       </w:hyperlink>
     </w:p>
-    <w:commentRangeStart w:id="3"/>
+    <w:commentRangeStart w:id="5"/>
     <w:p>
       <w:pPr>
         <w:numPr>
@@ -306,12 +314,12 @@
         </w:rPr>
         <w:fldChar w:fldCharType="end"/>
       </w:r>
-      <w:commentRangeEnd w:id="3"/>
+      <w:commentRangeEnd w:id="5"/>
       <w:r>
         <w:rPr>
           <w:rStyle w:val="Marquedecommentaire"/>
         </w:rPr>
-        <w:commentReference w:id="3"/>
+        <w:commentReference w:id="5"/>
       </w:r>
     </w:p>
     <w:p>
@@ -596,12 +604,12 @@
           <w:t>Générer les formulaires et rapports</w:t>
         </w:r>
       </w:hyperlink>
-      <w:commentRangeEnd w:id="1"/>
+      <w:commentRangeEnd w:id="3"/>
       <w:r>
         <w:rPr>
           <w:rStyle w:val="Marquedecommentaire"/>
         </w:rPr>
-        <w:commentReference w:id="1"/>
+        <w:commentReference w:id="3"/>
       </w:r>
     </w:p>
     <w:p>
@@ -653,12 +661,12 @@
         </w:rPr>
         <w:t>Remonter un bug informatique</w:t>
       </w:r>
-      <w:commentRangeEnd w:id="2"/>
+      <w:commentRangeEnd w:id="4"/>
       <w:r>
         <w:rPr>
           <w:rStyle w:val="Marquedecommentaire"/>
         </w:rPr>
-        <w:commentReference w:id="2"/>
+        <w:commentReference w:id="4"/>
       </w:r>
     </w:p>
     <w:p>
@@ -1077,7 +1085,7 @@
                     <pic:cNvPicPr/>
                   </pic:nvPicPr>
                   <pic:blipFill>
-                    <a:blip r:embed="rId10" cstate="print">
+                    <a:blip r:embed="rId8" cstate="print">
                       <a:extLst>
                         <a:ext uri="{28A0092B-C50C-407E-A947-70E740481C1C}">
                           <a14:useLocalDpi xmlns:a14="http://schemas.microsoft.com/office/drawing/2010/main" val="0"/>
@@ -1346,7 +1354,7 @@
                     <pic:cNvPicPr/>
                   </pic:nvPicPr>
                   <pic:blipFill>
-                    <a:blip r:embed="rId11">
+                    <a:blip r:embed="rId9">
                       <a:extLst>
                         <a:ext uri="{28A0092B-C50C-407E-A947-70E740481C1C}">
                           <a14:useLocalDpi xmlns:a14="http://schemas.microsoft.com/office/drawing/2010/main" val="0"/>
@@ -1415,8 +1423,8 @@
           <w:lang w:eastAsia="fr-FR"/>
         </w:rPr>
       </w:pPr>
-      <w:bookmarkStart w:id="4" w:name="_Hlk187246293"/>
-      <w:bookmarkStart w:id="5" w:name="_Hlk187910202"/>
+      <w:bookmarkStart w:id="6" w:name="_Hlk187246293"/>
+      <w:bookmarkStart w:id="7" w:name="_Hlk187910202"/>
     </w:p>
     <w:p>
       <w:pPr>
@@ -1560,7 +1568,7 @@
         </w:rPr>
         <w:t>aramètres</w:t>
       </w:r>
-      <w:bookmarkEnd w:id="4"/>
+      <w:bookmarkEnd w:id="6"/>
       <w:r>
         <w:rPr>
           <w:rFonts w:ascii="Times New Roman" w:eastAsia="Times New Roman" w:hAnsi="Times New Roman" w:cs="Times New Roman"/>
@@ -1785,7 +1793,7 @@
         </w:rPr>
         <w:t xml:space="preserve"> </w:t>
       </w:r>
-      <w:commentRangeStart w:id="6"/>
+      <w:commentRangeStart w:id="8"/>
       <w:r>
         <w:rPr>
           <w:rFonts w:ascii="Times New Roman" w:hAnsi="Times New Roman" w:cs="Times New Roman"/>
@@ -1831,12 +1839,12 @@
         </w:rPr>
         <w:t>.</w:t>
       </w:r>
-      <w:commentRangeEnd w:id="6"/>
+      <w:commentRangeEnd w:id="8"/>
       <w:r>
         <w:rPr>
           <w:rStyle w:val="Marquedecommentaire"/>
         </w:rPr>
-        <w:commentReference w:id="6"/>
+        <w:commentReference w:id="8"/>
       </w:r>
     </w:p>
     <w:p>
@@ -1884,7 +1892,7 @@
                     <pic:cNvPicPr/>
                   </pic:nvPicPr>
                   <pic:blipFill>
-                    <a:blip r:embed="rId12" cstate="print">
+                    <a:blip r:embed="rId10" cstate="print">
                       <a:extLst>
                         <a:ext uri="{28A0092B-C50C-407E-A947-70E740481C1C}">
                           <a14:useLocalDpi xmlns:a14="http://schemas.microsoft.com/office/drawing/2010/main" val="0"/>
@@ -1933,7 +1941,7 @@
         </w:rPr>
       </w:pPr>
     </w:p>
-    <w:bookmarkEnd w:id="5"/>
+    <w:bookmarkEnd w:id="7"/>
     <w:p>
       <w:pPr>
         <w:spacing w:before="100" w:beforeAutospacing="1" w:after="100" w:afterAutospacing="1" w:line="240" w:lineRule="auto"/>
@@ -1982,7 +1990,7 @@
                           </pic:cNvPicPr>
                         </pic:nvPicPr>
                         <pic:blipFill>
-                          <a:blip r:embed="rId13">
+                          <a:blip r:embed="rId11">
                             <a:extLst>
                               <a:ext uri="{28A0092B-C50C-407E-A947-70E740481C1C}">
                                 <a14:useLocalDpi xmlns:a14="http://schemas.microsoft.com/office/drawing/2010/main" val="0"/>
@@ -2057,7 +2065,7 @@
               </wp:inline>
             </w:drawing>
           </mc:Choice>
-          <mc:Fallback>
+          <mc:Fallback xmlns:w16sdtdh="http://schemas.microsoft.com/office/word/2020/wordml/sdtdatahash" xmlns:w16="http://schemas.microsoft.com/office/word/2018/wordml" xmlns:w16cid="http://schemas.microsoft.com/office/word/2016/wordml/cid" xmlns:w16cex="http://schemas.microsoft.com/office/word/2018/wordml/cex" xmlns:am3d="http://schemas.microsoft.com/office/drawing/2017/model3d" xmlns:aink="http://schemas.microsoft.com/office/drawing/2016/ink" xmlns:cx8="http://schemas.microsoft.com/office/drawing/2016/5/14/chartex" xmlns:cx7="http://schemas.microsoft.com/office/drawing/2016/5/13/chartex" xmlns:cx6="http://schemas.microsoft.com/office/drawing/2016/5/12/chartex" xmlns:cx5="http://schemas.microsoft.com/office/drawing/2016/5/11/chartex" xmlns:cx4="http://schemas.microsoft.com/office/drawing/2016/5/10/chartex" xmlns:cx3="http://schemas.microsoft.com/office/drawing/2016/5/9/chartex" xmlns:cx2="http://schemas.microsoft.com/office/drawing/2015/10/21/chartex">
             <w:pict>
               <v:group w14:anchorId="5288BC7D" id="Groupe 56" o:spid="_x0000_s1026" style="width:309.3pt;height:133.2pt;mso-position-horizontal-relative:char;mso-position-vertical-relative:line" coordsize="36928,14751" o:gfxdata="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">
                 <v:shapetype id="_x0000_t75" coordsize="21600,21600" o:spt="75" o:preferrelative="t" path="m@4@5l@4@11@9@11@9@5xe" filled="f" stroked="f">
@@ -2092,7 +2100,7 @@
           </mc:Fallback>
         </mc:AlternateContent>
       </w:r>
-      <w:bookmarkStart w:id="7" w:name="_Hlk187910941"/>
+      <w:bookmarkStart w:id="9" w:name="_Hlk187910941"/>
     </w:p>
     <w:p>
       <w:pPr>
@@ -2294,7 +2302,7 @@
         <w:t>.</w:t>
       </w:r>
     </w:p>
-    <w:bookmarkEnd w:id="7"/>
+    <w:bookmarkEnd w:id="9"/>
     <w:p>
       <w:pPr>
         <w:pStyle w:val="Paragraphedeliste"/>
@@ -2503,6 +2511,7 @@
       <w:r>
         <w:rPr>
           <w:noProof/>
+          <w:lang w:eastAsia="fr-FR"/>
         </w:rPr>
         <w:drawing>
           <wp:anchor distT="0" distB="0" distL="114300" distR="114300" simplePos="0" relativeHeight="251684864" behindDoc="0" locked="0" layoutInCell="1" allowOverlap="1" wp14:anchorId="6BF773B3" wp14:editId="64D2D43E">
@@ -2624,6 +2633,7 @@
       <w:r>
         <w:rPr>
           <w:noProof/>
+          <w:lang w:eastAsia="fr-FR"/>
         </w:rPr>
         <w:drawing>
           <wp:anchor distT="0" distB="0" distL="114300" distR="114300" simplePos="0" relativeHeight="251666432" behindDoc="1" locked="0" layoutInCell="1" allowOverlap="1" wp14:anchorId="0F380EC8" wp14:editId="77A6165E">
@@ -2711,7 +2721,8 @@
         </w:rPr>
         <w:t xml:space="preserve"> </w:t>
       </w:r>
-      <w:commentRangeStart w:id="8"/>
+      <w:commentRangeStart w:id="10"/>
+      <w:commentRangeStart w:id="11"/>
       <w:r>
         <w:rPr>
           <w:rFonts w:ascii="Times New Roman" w:eastAsia="Times New Roman" w:hAnsi="Times New Roman" w:cs="Times New Roman"/>
@@ -2730,12 +2741,19 @@
         </w:rPr>
         <w:t>Utiliser les préférences de mon compte utilisateur</w:t>
       </w:r>
-      <w:commentRangeEnd w:id="8"/>
+      <w:commentRangeEnd w:id="10"/>
       <w:r>
         <w:rPr>
           <w:rStyle w:val="Marquedecommentaire"/>
         </w:rPr>
-        <w:commentReference w:id="8"/>
+        <w:commentReference w:id="10"/>
+      </w:r>
+      <w:commentRangeEnd w:id="11"/>
+      <w:r>
+        <w:rPr>
+          <w:rStyle w:val="Marquedecommentaire"/>
+        </w:rPr>
+        <w:commentReference w:id="11"/>
       </w:r>
       <w:r>
         <w:rPr>
@@ -2784,6 +2802,7 @@
       <w:r>
         <w:rPr>
           <w:noProof/>
+          <w:lang w:eastAsia="fr-FR"/>
         </w:rPr>
         <w:drawing>
           <wp:anchor distT="0" distB="0" distL="114300" distR="114300" simplePos="0" relativeHeight="251657216" behindDoc="1" locked="0" layoutInCell="1" allowOverlap="1" wp14:anchorId="6A75FF05" wp14:editId="1B63A827">
@@ -2945,7 +2964,7 @@
               </wp:anchor>
             </w:drawing>
           </mc:Choice>
-          <mc:Fallback>
+          <mc:Fallback xmlns:w16sdtdh="http://schemas.microsoft.com/office/word/2020/wordml/sdtdatahash" xmlns:w16="http://schemas.microsoft.com/office/word/2018/wordml" xmlns:w16cid="http://schemas.microsoft.com/office/word/2016/wordml/cid" xmlns:w16cex="http://schemas.microsoft.com/office/word/2018/wordml/cex" xmlns:am3d="http://schemas.microsoft.com/office/drawing/2017/model3d" xmlns:aink="http://schemas.microsoft.com/office/drawing/2016/ink" xmlns:cx8="http://schemas.microsoft.com/office/drawing/2016/5/14/chartex" xmlns:cx7="http://schemas.microsoft.com/office/drawing/2016/5/13/chartex" xmlns:cx6="http://schemas.microsoft.com/office/drawing/2016/5/12/chartex" xmlns:cx5="http://schemas.microsoft.com/office/drawing/2016/5/11/chartex" xmlns:cx4="http://schemas.microsoft.com/office/drawing/2016/5/10/chartex" xmlns:cx3="http://schemas.microsoft.com/office/drawing/2016/5/9/chartex" xmlns:cx2="http://schemas.microsoft.com/office/drawing/2015/10/21/chartex">
             <w:pict>
               <v:shapetype w14:anchorId="7EEA4D8D" id="_x0000_t32" coordsize="21600,21600" o:spt="32" o:oned="t" path="m,l21600,21600e" filled="f">
                 <v:path arrowok="t" fillok="f" o:connecttype="none"/>
@@ -3678,6 +3697,7 @@
       <w:r>
         <w:rPr>
           <w:noProof/>
+          <w:lang w:eastAsia="fr-FR"/>
         </w:rPr>
         <w:drawing>
           <wp:anchor distT="0" distB="0" distL="114300" distR="114300" simplePos="0" relativeHeight="251701248" behindDoc="1" locked="0" layoutInCell="1" allowOverlap="1" wp14:anchorId="20EC995B" wp14:editId="35A110B6">
@@ -4460,7 +4480,7 @@
         </w:rPr>
         <w:t xml:space="preserve"> </w:t>
       </w:r>
-      <w:del w:id="9" w:author="Vincent FACHERO, Ifremer Brest PDG-IRSI-ISI, 02 " w:date="2025-02-07T09:17:00Z">
+      <w:del w:id="12" w:author="Vincent FACHERO, Ifremer Brest PDG-IRSI-ISI, 02" w:date="2025-02-07T09:17:00Z">
         <w:r>
           <w:rPr>
             <w:rFonts w:ascii="Times New Roman" w:hAnsi="Times New Roman" w:cs="Times New Roman"/>
@@ -4512,6 +4532,7 @@
       <w:r>
         <w:rPr>
           <w:noProof/>
+          <w:lang w:eastAsia="fr-FR"/>
         </w:rPr>
         <w:drawing>
           <wp:inline distT="0" distB="0" distL="0" distR="0" wp14:anchorId="6B9065EA" wp14:editId="18661A00">
@@ -4818,6 +4839,7 @@
       <w:r>
         <w:rPr>
           <w:noProof/>
+          <w:lang w:eastAsia="fr-FR"/>
         </w:rPr>
         <w:lastRenderedPageBreak/>
         <w:drawing>
@@ -4890,6 +4912,7 @@
       <w:r>
         <w:rPr>
           <w:noProof/>
+          <w:lang w:eastAsia="fr-FR"/>
         </w:rPr>
         <w:drawing>
           <wp:anchor distT="0" distB="0" distL="114300" distR="114300" simplePos="0" relativeHeight="251702272" behindDoc="1" locked="0" layoutInCell="1" allowOverlap="1" wp14:anchorId="784E5D7E" wp14:editId="32624EA2">
@@ -5248,6 +5271,7 @@
       <w:r>
         <w:rPr>
           <w:noProof/>
+          <w:lang w:eastAsia="fr-FR"/>
         </w:rPr>
         <w:drawing>
           <wp:anchor distT="0" distB="0" distL="114300" distR="114300" simplePos="0" relativeHeight="251688960" behindDoc="0" locked="0" layoutInCell="1" allowOverlap="1" wp14:anchorId="16105FE7" wp14:editId="41E458A5">
@@ -5398,7 +5422,7 @@
           <w:lang w:eastAsia="fr-FR"/>
         </w:rPr>
       </w:pPr>
-      <w:commentRangeStart w:id="10"/>
+      <w:commentRangeStart w:id="13"/>
       <w:r>
         <w:rPr>
           <w:rFonts w:ascii="Times New Roman" w:eastAsia="Times New Roman" w:hAnsi="Times New Roman" w:cs="Times New Roman"/>
@@ -5455,12 +5479,12 @@
         </w:rPr>
         <w:t>: Liste exhaustive des navires de la zone de compétence choisie</w:t>
       </w:r>
-      <w:commentRangeEnd w:id="10"/>
+      <w:commentRangeEnd w:id="13"/>
       <w:r>
         <w:rPr>
           <w:rStyle w:val="Marquedecommentaire"/>
         </w:rPr>
-        <w:commentReference w:id="10"/>
+        <w:commentReference w:id="13"/>
       </w:r>
       <w:r>
         <w:rPr>
@@ -5640,6 +5664,7 @@
       <w:r>
         <w:rPr>
           <w:noProof/>
+          <w:lang w:eastAsia="fr-FR"/>
         </w:rPr>
         <w:drawing>
           <wp:anchor distT="0" distB="0" distL="114300" distR="114300" simplePos="0" relativeHeight="251703296" behindDoc="1" locked="0" layoutInCell="1" allowOverlap="1" wp14:anchorId="671BE8D5" wp14:editId="34B40F67">
@@ -6160,7 +6185,7 @@
         </w:rPr>
         <w:t xml:space="preserve"> </w:t>
       </w:r>
-      <w:commentRangeStart w:id="11"/>
+      <w:commentRangeStart w:id="14"/>
       <w:r>
         <w:rPr>
           <w:rFonts w:ascii="Times New Roman" w:hAnsi="Times New Roman" w:cs="Times New Roman"/>
@@ -6170,12 +6195,12 @@
         </w:rPr>
         <w:t xml:space="preserve">cercles </w:t>
       </w:r>
-      <w:commentRangeEnd w:id="11"/>
+      <w:commentRangeEnd w:id="14"/>
       <w:r>
         <w:rPr>
           <w:rStyle w:val="Marquedecommentaire"/>
         </w:rPr>
-        <w:commentReference w:id="11"/>
+        <w:commentReference w:id="14"/>
       </w:r>
       <w:r>
         <w:rPr>
@@ -6400,7 +6425,7 @@
                       <a:tailEnd type="none" w="med" len="med"/>
                       <a:extLst>
                         <a:ext uri="{C807C97D-BFC1-408E-A445-0C87EB9F89A2}">
-                          <ask:lineSketchStyleProps xmlns:ask="http://schemas.microsoft.com/office/drawing/2018/sketchyshapes" sd="0">
+                          <ask:lineSketchStyleProps xmlns:ask="http://schemas.microsoft.com/office/drawing/2018/sketchyshapes" xmlns:w16sdtdh="http://schemas.microsoft.com/office/word/2020/wordml/sdtdatahash" xmlns:w16="http://schemas.microsoft.com/office/word/2018/wordml" xmlns:w16cid="http://schemas.microsoft.com/office/word/2016/wordml/cid" xmlns:w16cex="http://schemas.microsoft.com/office/word/2018/wordml/cex" xmlns:w="http://schemas.openxmlformats.org/wordprocessingml/2006/main" xmlns:w10="urn:schemas-microsoft-com:office:word" xmlns:v="urn:schemas-microsoft-com:vml" xmlns:o="urn:schemas-microsoft-com:office:office" xmlns:am3d="http://schemas.microsoft.com/office/drawing/2017/model3d" xmlns:aink="http://schemas.microsoft.com/office/drawing/2016/ink" xmlns:cx8="http://schemas.microsoft.com/office/drawing/2016/5/14/chartex" xmlns:cx7="http://schemas.microsoft.com/office/drawing/2016/5/13/chartex" xmlns:cx6="http://schemas.microsoft.com/office/drawing/2016/5/12/chartex" xmlns:cx5="http://schemas.microsoft.com/office/drawing/2016/5/11/chartex" xmlns:cx4="http://schemas.microsoft.com/office/drawing/2016/5/10/chartex" xmlns:cx3="http://schemas.microsoft.com/office/drawing/2016/5/9/chartex" xmlns:cx2="http://schemas.microsoft.com/office/drawing/2015/10/21/chartex" xmlns="" sd="0">
                             <a:custGeom>
                               <a:avLst/>
                               <a:gdLst/>
@@ -6447,7 +6472,7 @@
           <w:lang w:eastAsia="fr-FR"/>
         </w:rPr>
       </w:pPr>
-      <w:bookmarkStart w:id="12" w:name="_Hlk188530029"/>
+      <w:bookmarkStart w:id="15" w:name="_Hlk188530029"/>
       <w:r>
         <w:rPr>
           <w:rFonts w:ascii="Times New Roman" w:eastAsia="Times New Roman" w:hAnsi="Times New Roman" w:cs="Times New Roman"/>
@@ -6480,7 +6505,7 @@
         </w:rPr>
         <w:t xml:space="preserve">Il est possible d'épingler un calendrier ou l'onglet d'un calendrier afin de le conserver dans le </w:t>
       </w:r>
-      <w:bookmarkEnd w:id="12"/>
+      <w:bookmarkEnd w:id="15"/>
       <w:r>
         <w:rPr>
           <w:rFonts w:ascii="Times New Roman" w:eastAsia="Times New Roman" w:hAnsi="Times New Roman" w:cs="Times New Roman"/>
@@ -6632,7 +6657,7 @@
           <w:lang w:eastAsia="fr-FR"/>
         </w:rPr>
       </w:pPr>
-      <w:bookmarkStart w:id="13" w:name="_Hlk187911468"/>
+      <w:bookmarkStart w:id="16" w:name="_Hlk187911468"/>
       <w:r>
         <w:rPr>
           <w:rFonts w:ascii="Times New Roman" w:eastAsia="Times New Roman" w:hAnsi="Times New Roman" w:cs="Times New Roman"/>
@@ -6721,7 +6746,7 @@
         </w:rPr>
         <w:t xml:space="preserve"> </w:t>
       </w:r>
-      <w:commentRangeStart w:id="14"/>
+      <w:commentRangeStart w:id="17"/>
       <w:r>
         <w:rPr>
           <w:rFonts w:ascii="Times New Roman" w:eastAsia="Times New Roman" w:hAnsi="Times New Roman" w:cs="Times New Roman"/>
@@ -6806,13 +6831,13 @@
         </w:rPr>
         <w:t>s’appliquer systématiquement.</w:t>
       </w:r>
-      <w:bookmarkEnd w:id="13"/>
-      <w:commentRangeEnd w:id="14"/>
+      <w:bookmarkEnd w:id="16"/>
+      <w:commentRangeEnd w:id="17"/>
       <w:r>
         <w:rPr>
           <w:rStyle w:val="Marquedecommentaire"/>
         </w:rPr>
-        <w:commentReference w:id="14"/>
+        <w:commentReference w:id="17"/>
       </w:r>
     </w:p>
     <w:p>
@@ -7209,7 +7234,7 @@
         </w:rPr>
         <w:t xml:space="preserve"> </w:t>
       </w:r>
-      <w:commentRangeStart w:id="15"/>
+      <w:commentRangeStart w:id="18"/>
       <w:r>
         <w:rPr>
           <w:rFonts w:ascii="Times New Roman" w:eastAsia="Times New Roman" w:hAnsi="Times New Roman" w:cs="Times New Roman"/>
@@ -7219,12 +7244,12 @@
         </w:rPr>
         <w:t xml:space="preserve">le plus possible </w:t>
       </w:r>
-      <w:commentRangeEnd w:id="15"/>
+      <w:commentRangeEnd w:id="18"/>
       <w:r>
         <w:rPr>
           <w:rStyle w:val="Marquedecommentaire"/>
         </w:rPr>
-        <w:commentReference w:id="15"/>
+        <w:commentReference w:id="18"/>
       </w:r>
       <w:r>
         <w:rPr>
@@ -7277,6 +7302,7 @@
       <w:r>
         <w:rPr>
           <w:noProof/>
+          <w:lang w:eastAsia="fr-FR"/>
         </w:rPr>
         <w:drawing>
           <wp:inline distT="0" distB="0" distL="0" distR="0" wp14:anchorId="6C4B8498" wp14:editId="25C1F000">
@@ -7542,6 +7568,7 @@
       <w:r>
         <w:rPr>
           <w:noProof/>
+          <w:lang w:eastAsia="fr-FR"/>
         </w:rPr>
         <w:drawing>
           <wp:anchor distT="0" distB="0" distL="114300" distR="114300" simplePos="0" relativeHeight="251660288" behindDoc="1" locked="0" layoutInCell="1" allowOverlap="1" wp14:anchorId="3AF8B79A" wp14:editId="5EC2E4B1">
@@ -7619,6 +7646,7 @@
       <w:r>
         <w:rPr>
           <w:noProof/>
+          <w:lang w:eastAsia="fr-FR"/>
         </w:rPr>
         <w:drawing>
           <wp:anchor distT="0" distB="0" distL="114300" distR="114300" simplePos="0" relativeHeight="251659264" behindDoc="1" locked="0" layoutInCell="1" allowOverlap="1" wp14:anchorId="48B69F4E" wp14:editId="3DC252AB">
@@ -8091,6 +8119,7 @@
       <w:r>
         <w:rPr>
           <w:noProof/>
+          <w:lang w:eastAsia="fr-FR"/>
         </w:rPr>
         <w:drawing>
           <wp:anchor distT="0" distB="0" distL="114300" distR="114300" simplePos="0" relativeHeight="251671552" behindDoc="0" locked="0" layoutInCell="1" allowOverlap="1" wp14:anchorId="2E7C45F5" wp14:editId="3774828D">
@@ -8255,6 +8284,7 @@
       <w:r>
         <w:rPr>
           <w:noProof/>
+          <w:lang w:eastAsia="fr-FR"/>
         </w:rPr>
         <w:drawing>
           <wp:anchor distT="0" distB="0" distL="114300" distR="114300" simplePos="0" relativeHeight="251672576" behindDoc="0" locked="0" layoutInCell="1" allowOverlap="1" wp14:anchorId="25243744" wp14:editId="4E51D933">
@@ -8434,6 +8464,7 @@
       <w:r>
         <w:rPr>
           <w:noProof/>
+          <w:lang w:eastAsia="fr-FR"/>
         </w:rPr>
         <w:drawing>
           <wp:anchor distT="0" distB="0" distL="114300" distR="114300" simplePos="0" relativeHeight="251673600" behindDoc="0" locked="0" layoutInCell="1" allowOverlap="1" wp14:anchorId="539D6498" wp14:editId="772E68FF">
@@ -8505,6 +8536,7 @@
       <w:r>
         <w:rPr>
           <w:noProof/>
+          <w:lang w:eastAsia="fr-FR"/>
         </w:rPr>
         <w:drawing>
           <wp:anchor distT="0" distB="0" distL="114300" distR="114300" simplePos="0" relativeHeight="251674624" behindDoc="0" locked="0" layoutInCell="1" allowOverlap="1" wp14:anchorId="36B0EBC9" wp14:editId="5749EFB1">
@@ -8997,6 +9029,7 @@
       <w:r>
         <w:rPr>
           <w:noProof/>
+          <w:lang w:eastAsia="fr-FR"/>
         </w:rPr>
         <w:drawing>
           <wp:inline distT="0" distB="0" distL="0" distR="0" wp14:anchorId="68AC4B15" wp14:editId="26BE95FC">
@@ -9084,6 +9117,7 @@
       <w:r>
         <w:rPr>
           <w:noProof/>
+          <w:lang w:eastAsia="fr-FR"/>
         </w:rPr>
         <w:drawing>
           <wp:anchor distT="0" distB="0" distL="114300" distR="114300" simplePos="0" relativeHeight="251734016" behindDoc="0" locked="0" layoutInCell="1" allowOverlap="1" wp14:anchorId="072D3824" wp14:editId="2936EB4E">
@@ -9650,6 +9684,7 @@
       <w:r>
         <w:rPr>
           <w:noProof/>
+          <w:lang w:eastAsia="fr-FR"/>
         </w:rPr>
         <w:drawing>
           <wp:anchor distT="0" distB="0" distL="114300" distR="114300" simplePos="0" relativeHeight="251697152" behindDoc="0" locked="0" layoutInCell="1" allowOverlap="1" wp14:anchorId="5CC17107" wp14:editId="0584C9E9">
@@ -10024,7 +10059,7 @@
           <w:lang w:eastAsia="fr-FR"/>
         </w:rPr>
       </w:pPr>
-      <w:commentRangeStart w:id="16"/>
+      <w:commentRangeStart w:id="19"/>
       <w:r>
         <w:rPr>
           <w:rFonts w:ascii="Times New Roman" w:eastAsia="Times New Roman" w:hAnsi="Times New Roman" w:cs="Times New Roman"/>
@@ -10069,12 +10104,12 @@
         </w:rPr>
         <w:t xml:space="preserve"> n’apparaîtra. Idem concernant un nombre excessif de personnes à bord.</w:t>
       </w:r>
-      <w:commentRangeEnd w:id="16"/>
+      <w:commentRangeEnd w:id="19"/>
       <w:r>
         <w:rPr>
           <w:rStyle w:val="Marquedecommentaire"/>
         </w:rPr>
-        <w:commentReference w:id="16"/>
+        <w:commentReference w:id="19"/>
       </w:r>
     </w:p>
     <w:p>
@@ -10093,6 +10128,7 @@
       <w:r>
         <w:rPr>
           <w:noProof/>
+          <w:lang w:eastAsia="fr-FR"/>
         </w:rPr>
         <w:drawing>
           <wp:anchor distT="0" distB="0" distL="114300" distR="114300" simplePos="0" relativeHeight="251709440" behindDoc="1" locked="0" layoutInCell="1" allowOverlap="1" wp14:anchorId="05A8FC6E" wp14:editId="16FC37D9">
@@ -10320,6 +10356,7 @@
       <w:r>
         <w:rPr>
           <w:noProof/>
+          <w:lang w:eastAsia="fr-FR"/>
         </w:rPr>
         <mc:AlternateContent>
           <mc:Choice Requires="wps">
@@ -10384,7 +10421,7 @@
               </wp:anchor>
             </w:drawing>
           </mc:Choice>
-          <mc:Fallback>
+          <mc:Fallback xmlns:w16sdtdh="http://schemas.microsoft.com/office/word/2020/wordml/sdtdatahash" xmlns:w16="http://schemas.microsoft.com/office/word/2018/wordml" xmlns:w16cid="http://schemas.microsoft.com/office/word/2016/wordml/cid" xmlns:w16cex="http://schemas.microsoft.com/office/word/2018/wordml/cex" xmlns:am3d="http://schemas.microsoft.com/office/drawing/2017/model3d" xmlns:aink="http://schemas.microsoft.com/office/drawing/2016/ink" xmlns:cx8="http://schemas.microsoft.com/office/drawing/2016/5/14/chartex" xmlns:cx7="http://schemas.microsoft.com/office/drawing/2016/5/13/chartex" xmlns:cx6="http://schemas.microsoft.com/office/drawing/2016/5/12/chartex" xmlns:cx5="http://schemas.microsoft.com/office/drawing/2016/5/11/chartex" xmlns:cx4="http://schemas.microsoft.com/office/drawing/2016/5/10/chartex" xmlns:cx3="http://schemas.microsoft.com/office/drawing/2016/5/9/chartex" xmlns:cx2="http://schemas.microsoft.com/office/drawing/2015/10/21/chartex">
             <w:pict>
               <v:roundrect w14:anchorId="47C1E9FE" id="Rectangle : coins arrondis 72" o:spid="_x0000_s1026" style="position:absolute;margin-left:6.4pt;margin-top:4.05pt;width:15.75pt;height:16.5pt;z-index:251735040;visibility:visible;mso-wrap-style:square;mso-wrap-distance-left:9pt;mso-wrap-distance-top:0;mso-wrap-distance-right:9pt;mso-wrap-distance-bottom:0;mso-position-horizontal:absolute;mso-position-horizontal-relative:text;mso-position-vertical:absolute;mso-position-vertical-relative:text;v-text-anchor:middle" arcsize="10923f" o:gfxdata="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" filled="f" strokecolor="red" strokeweight="1.5pt">
                 <v:stroke joinstyle="miter"/>
@@ -10396,6 +10433,7 @@
       <w:r>
         <w:rPr>
           <w:noProof/>
+          <w:lang w:eastAsia="fr-FR"/>
         </w:rPr>
         <w:drawing>
           <wp:inline distT="0" distB="0" distL="0" distR="0" wp14:anchorId="79E53661" wp14:editId="46681748">
@@ -10487,6 +10525,7 @@
       <w:r>
         <w:rPr>
           <w:noProof/>
+          <w:lang w:eastAsia="fr-FR"/>
         </w:rPr>
         <w:lastRenderedPageBreak/>
         <w:drawing>
@@ -10710,6 +10749,7 @@
       <w:r>
         <w:rPr>
           <w:noProof/>
+          <w:lang w:eastAsia="fr-FR"/>
         </w:rPr>
         <w:drawing>
           <wp:anchor distT="0" distB="0" distL="114300" distR="114300" simplePos="0" relativeHeight="251676672" behindDoc="1" locked="0" layoutInCell="1" allowOverlap="1" wp14:anchorId="3865BCDE" wp14:editId="538B957F">
@@ -10781,6 +10821,7 @@
       <w:r>
         <w:rPr>
           <w:noProof/>
+          <w:lang w:eastAsia="fr-FR"/>
         </w:rPr>
         <w:drawing>
           <wp:anchor distT="0" distB="0" distL="114300" distR="114300" simplePos="0" relativeHeight="251677696" behindDoc="1" locked="0" layoutInCell="1" allowOverlap="1" wp14:anchorId="4C530A66" wp14:editId="2A314FAF">
@@ -11075,6 +11116,7 @@
       <w:r>
         <w:rPr>
           <w:noProof/>
+          <w:lang w:eastAsia="fr-FR"/>
         </w:rPr>
         <w:drawing>
           <wp:anchor distT="0" distB="0" distL="114300" distR="114300" simplePos="0" relativeHeight="251675648" behindDoc="1" locked="0" layoutInCell="1" allowOverlap="1" wp14:anchorId="546CDD1F" wp14:editId="327E7FE1">
@@ -11199,7 +11241,7 @@
           <w:lang w:eastAsia="fr-FR"/>
         </w:rPr>
       </w:pPr>
-      <w:commentRangeStart w:id="17"/>
+      <w:commentRangeStart w:id="20"/>
       <w:r>
         <w:rPr>
           <w:rFonts w:ascii="Times New Roman" w:eastAsia="Times New Roman" w:hAnsi="Times New Roman" w:cs="Times New Roman"/>
@@ -11211,12 +11253,12 @@
         </w:rPr>
         <w:t>N.B. : afin de mettre à jour les différents gradients du rectangle ou sous-rectangle statistique sélectionner, veuillez cliquer sur une cellule hors de la colonne active, puis resélectionner la cellule de gradient et faire votre choix dans la liste déroulante</w:t>
       </w:r>
-      <w:commentRangeEnd w:id="17"/>
+      <w:commentRangeEnd w:id="20"/>
       <w:r>
         <w:rPr>
           <w:rStyle w:val="Marquedecommentaire"/>
         </w:rPr>
-        <w:commentReference w:id="17"/>
+        <w:commentReference w:id="20"/>
       </w:r>
       <w:r>
         <w:rPr>
@@ -11414,10 +11456,11 @@
           <w:noProof/>
         </w:rPr>
       </w:pPr>
-      <w:commentRangeStart w:id="18"/>
+      <w:commentRangeStart w:id="21"/>
       <w:r>
         <w:rPr>
           <w:noProof/>
+          <w:lang w:eastAsia="fr-FR"/>
         </w:rPr>
         <w:drawing>
           <wp:anchor distT="0" distB="0" distL="114300" distR="114300" simplePos="0" relativeHeight="251694080" behindDoc="1" locked="0" layoutInCell="1" allowOverlap="1" wp14:anchorId="596F04EC" wp14:editId="477BD501">
@@ -11489,6 +11532,7 @@
       <w:r>
         <w:rPr>
           <w:noProof/>
+          <w:lang w:eastAsia="fr-FR"/>
         </w:rPr>
         <w:drawing>
           <wp:anchor distT="0" distB="0" distL="114300" distR="114300" simplePos="0" relativeHeight="251693056" behindDoc="1" locked="0" layoutInCell="1" allowOverlap="1" wp14:anchorId="4E05AE3D" wp14:editId="096DAD60">
@@ -11560,6 +11604,7 @@
       <w:r>
         <w:rPr>
           <w:noProof/>
+          <w:lang w:eastAsia="fr-FR"/>
         </w:rPr>
         <w:drawing>
           <wp:anchor distT="0" distB="0" distL="114300" distR="114300" simplePos="0" relativeHeight="251708416" behindDoc="0" locked="0" layoutInCell="1" allowOverlap="1" wp14:anchorId="3AADBD8C" wp14:editId="2291DFBC">
@@ -11925,12 +11970,12 @@
         </w:rPr>
         <w:t>.</w:t>
       </w:r>
-      <w:commentRangeEnd w:id="18"/>
+      <w:commentRangeEnd w:id="21"/>
       <w:r>
         <w:rPr>
           <w:rStyle w:val="Marquedecommentaire"/>
         </w:rPr>
-        <w:commentReference w:id="18"/>
+        <w:commentReference w:id="21"/>
       </w:r>
     </w:p>
     <w:p>
@@ -11956,7 +12001,7 @@
           <w:noProof/>
         </w:rPr>
       </w:pPr>
-      <w:commentRangeStart w:id="19"/>
+      <w:commentRangeStart w:id="22"/>
       <w:r>
         <w:rPr>
           <w:rFonts w:ascii="Times New Roman" w:eastAsia="Times New Roman" w:hAnsi="Times New Roman" w:cs="Times New Roman"/>
@@ -12293,12 +12338,12 @@
         </w:rPr>
         <w:t>"</w:t>
       </w:r>
-      <w:commentRangeEnd w:id="19"/>
+      <w:commentRangeEnd w:id="22"/>
       <w:r>
         <w:rPr>
           <w:rStyle w:val="Marquedecommentaire"/>
         </w:rPr>
-        <w:commentReference w:id="19"/>
+        <w:commentReference w:id="22"/>
       </w:r>
       <w:r>
         <w:rPr>
@@ -12601,6 +12646,7 @@
       <w:r>
         <w:rPr>
           <w:noProof/>
+          <w:lang w:eastAsia="fr-FR"/>
         </w:rPr>
         <w:drawing>
           <wp:inline distT="0" distB="0" distL="0" distR="0" wp14:anchorId="21DC5CAE" wp14:editId="6A190BB2">
@@ -12986,6 +13032,7 @@
       <w:r>
         <w:rPr>
           <w:noProof/>
+          <w:lang w:eastAsia="fr-FR"/>
         </w:rPr>
         <w:drawing>
           <wp:inline distT="0" distB="0" distL="0" distR="0" wp14:anchorId="2B6547B8" wp14:editId="6CFF850F">
@@ -13053,6 +13100,7 @@
       <w:r>
         <w:rPr>
           <w:noProof/>
+          <w:lang w:eastAsia="fr-FR"/>
         </w:rPr>
         <w:drawing>
           <wp:inline distT="0" distB="0" distL="0" distR="0" wp14:anchorId="30446F4F" wp14:editId="23C0F7B2">
@@ -13901,6 +13949,7 @@
       <w:r>
         <w:rPr>
           <w:noProof/>
+          <w:lang w:eastAsia="fr-FR"/>
         </w:rPr>
         <w:lastRenderedPageBreak/>
         <w:drawing>
@@ -14151,8 +14200,8 @@
           <w:lang w:eastAsia="fr-FR"/>
         </w:rPr>
       </w:pPr>
-      <w:commentRangeStart w:id="20"/>
-      <w:commentRangeStart w:id="21"/>
+      <w:commentRangeStart w:id="23"/>
+      <w:commentRangeStart w:id="24"/>
       <w:r>
         <w:rPr>
           <w:rFonts w:ascii="Times New Roman" w:eastAsia="Times New Roman" w:hAnsi="Times New Roman" w:cs="Times New Roman"/>
@@ -14214,7 +14263,7 @@
                       <a:tailEnd type="none" w="med" len="med"/>
                       <a:extLst>
                         <a:ext uri="{C807C97D-BFC1-408E-A445-0C87EB9F89A2}">
-                          <ask:lineSketchStyleProps xmlns:ask="http://schemas.microsoft.com/office/drawing/2018/sketchyshapes" sd="0">
+                          <ask:lineSketchStyleProps xmlns:ask="http://schemas.microsoft.com/office/drawing/2018/sketchyshapes" xmlns:w16sdtdh="http://schemas.microsoft.com/office/word/2020/wordml/sdtdatahash" xmlns:w16="http://schemas.microsoft.com/office/word/2018/wordml" xmlns:w16cid="http://schemas.microsoft.com/office/word/2016/wordml/cid" xmlns:w16cex="http://schemas.microsoft.com/office/word/2018/wordml/cex" xmlns:w="http://schemas.openxmlformats.org/wordprocessingml/2006/main" xmlns:w10="urn:schemas-microsoft-com:office:word" xmlns:v="urn:schemas-microsoft-com:vml" xmlns:o="urn:schemas-microsoft-com:office:office" xmlns:am3d="http://schemas.microsoft.com/office/drawing/2017/model3d" xmlns:aink="http://schemas.microsoft.com/office/drawing/2016/ink" xmlns:cx8="http://schemas.microsoft.com/office/drawing/2016/5/14/chartex" xmlns:cx7="http://schemas.microsoft.com/office/drawing/2016/5/13/chartex" xmlns:cx6="http://schemas.microsoft.com/office/drawing/2016/5/12/chartex" xmlns:cx5="http://schemas.microsoft.com/office/drawing/2016/5/11/chartex" xmlns:cx4="http://schemas.microsoft.com/office/drawing/2016/5/10/chartex" xmlns:cx3="http://schemas.microsoft.com/office/drawing/2016/5/9/chartex" xmlns:cx2="http://schemas.microsoft.com/office/drawing/2015/10/21/chartex" xmlns="" sd="0">
                             <a:custGeom>
                               <a:avLst/>
                               <a:gdLst/>
@@ -14246,12 +14295,12 @@
           </wp:anchor>
         </w:drawing>
       </w:r>
-      <w:commentRangeEnd w:id="20"/>
+      <w:commentRangeEnd w:id="23"/>
       <w:r>
         <w:rPr>
           <w:rStyle w:val="Marquedecommentaire"/>
         </w:rPr>
-        <w:commentReference w:id="20"/>
+        <w:commentReference w:id="23"/>
       </w:r>
       <w:r>
         <w:rPr>
@@ -14262,7 +14311,7 @@
         </w:rPr>
         <w:t xml:space="preserve">Lorsqu'il y a une erreur de saisie, </w:t>
       </w:r>
-      <w:bookmarkStart w:id="22" w:name="_Hlk188605195"/>
+      <w:bookmarkStart w:id="25" w:name="_Hlk188605195"/>
       <w:r>
         <w:rPr>
           <w:rFonts w:ascii="Times New Roman" w:eastAsia="Times New Roman" w:hAnsi="Times New Roman" w:cs="Times New Roman"/>
@@ -14308,7 +14357,7 @@
         </w:rPr>
         <w:t xml:space="preserve"> </w:t>
       </w:r>
-      <w:bookmarkEnd w:id="22"/>
+      <w:bookmarkEnd w:id="25"/>
       <w:r>
         <w:rPr>
           <w:rFonts w:ascii="Times New Roman" w:eastAsia="Times New Roman" w:hAnsi="Times New Roman" w:cs="Times New Roman"/>
@@ -14345,12 +14394,12 @@
         </w:rPr>
         <w:t xml:space="preserve">, comme par exemple l’absence du port d’exploitation, de métiers et/ou de zones de pêche lorsque le navire a été déclaré actif. </w:t>
       </w:r>
-      <w:commentRangeEnd w:id="21"/>
+      <w:commentRangeEnd w:id="24"/>
       <w:r>
         <w:rPr>
           <w:rStyle w:val="Marquedecommentaire"/>
         </w:rPr>
-        <w:commentReference w:id="21"/>
+        <w:commentReference w:id="24"/>
       </w:r>
     </w:p>
     <w:p>
@@ -14367,6 +14416,7 @@
       <w:r>
         <w:rPr>
           <w:noProof/>
+          <w:lang w:eastAsia="fr-FR"/>
         </w:rPr>
         <w:drawing>
           <wp:anchor distT="0" distB="0" distL="114300" distR="114300" simplePos="0" relativeHeight="251663360" behindDoc="1" locked="0" layoutInCell="1" allowOverlap="1" wp14:anchorId="1E6F78FF" wp14:editId="234997FF">
@@ -14740,7 +14790,7 @@
               </wp:inline>
             </w:drawing>
           </mc:Choice>
-          <mc:Fallback>
+          <mc:Fallback xmlns:w16sdtdh="http://schemas.microsoft.com/office/word/2020/wordml/sdtdatahash" xmlns:w16="http://schemas.microsoft.com/office/word/2018/wordml" xmlns:w16cid="http://schemas.microsoft.com/office/word/2016/wordml/cid" xmlns:w16cex="http://schemas.microsoft.com/office/word/2018/wordml/cex" xmlns:am3d="http://schemas.microsoft.com/office/drawing/2017/model3d" xmlns:aink="http://schemas.microsoft.com/office/drawing/2016/ink" xmlns:cx8="http://schemas.microsoft.com/office/drawing/2016/5/14/chartex" xmlns:cx7="http://schemas.microsoft.com/office/drawing/2016/5/13/chartex" xmlns:cx6="http://schemas.microsoft.com/office/drawing/2016/5/12/chartex" xmlns:cx5="http://schemas.microsoft.com/office/drawing/2016/5/11/chartex" xmlns:cx4="http://schemas.microsoft.com/office/drawing/2016/5/10/chartex" xmlns:cx3="http://schemas.microsoft.com/office/drawing/2016/5/9/chartex" xmlns:cx2="http://schemas.microsoft.com/office/drawing/2015/10/21/chartex">
             <w:pict>
               <v:rect w14:anchorId="4376B434" id="AutoShape 85" o:spid="_x0000_s1026" alt="deplier" href="/sih-public/sumaris/sumaris-doc/-/raw/master/user-manual/user-activity-calendar-manual/d%C3%A9pler_replier.png" target="&quot;_blank&quot;" style="width:24pt;height:24pt;visibility:visible;mso-wrap-style:square;mso-left-percent:-10001;mso-top-percent:-10001;mso-position-horizontal:absolute;mso-position-horizontal-relative:char;mso-position-vertical:absolute;mso-position-vertical-relative:line;mso-left-percent:-10001;mso-top-percent:-10001;v-text-anchor:top" o:gfxdata="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" o:button="t" filled="f" stroked="f">
                 <v:fill o:detectmouseclick="t"/>
@@ -15968,7 +16018,7 @@
               </wp:anchor>
             </w:drawing>
           </mc:Choice>
-          <mc:Fallback>
+          <mc:Fallback xmlns:w16sdtdh="http://schemas.microsoft.com/office/word/2020/wordml/sdtdatahash" xmlns:w16="http://schemas.microsoft.com/office/word/2018/wordml" xmlns:w16cid="http://schemas.microsoft.com/office/word/2016/wordml/cid" xmlns:w16cex="http://schemas.microsoft.com/office/word/2018/wordml/cex" xmlns:am3d="http://schemas.microsoft.com/office/drawing/2017/model3d" xmlns:aink="http://schemas.microsoft.com/office/drawing/2016/ink" xmlns:cx8="http://schemas.microsoft.com/office/drawing/2016/5/14/chartex" xmlns:cx7="http://schemas.microsoft.com/office/drawing/2016/5/13/chartex" xmlns:cx6="http://schemas.microsoft.com/office/drawing/2016/5/12/chartex" xmlns:cx5="http://schemas.microsoft.com/office/drawing/2016/5/11/chartex" xmlns:cx4="http://schemas.microsoft.com/office/drawing/2016/5/10/chartex" xmlns:cx3="http://schemas.microsoft.com/office/drawing/2016/5/9/chartex" xmlns:cx2="http://schemas.microsoft.com/office/drawing/2015/10/21/chartex">
             <w:pict>
               <v:roundrect w14:anchorId="3AFB41BB" id="Rectangle : coins arrondis 85" o:spid="_x0000_s1026" style="position:absolute;left:0;text-align:left;margin-left:315.6pt;margin-top:73.3pt;width:62.2pt;height:13.75pt;z-index:251727872;visibility:visible;mso-wrap-style:square;mso-width-percent:0;mso-height-percent:0;mso-wrap-distance-left:9pt;mso-wrap-distance-top:0;mso-wrap-distance-right:9pt;mso-wrap-distance-bottom:0;mso-position-horizontal:absolute;mso-position-horizontal-relative:text;mso-position-vertical:absolute;mso-position-vertical-relative:text;mso-width-percent:0;mso-height-percent:0;mso-width-relative:margin;mso-height-relative:margin;v-text-anchor:middle" arcsize="10923f" o:gfxdata="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" filled="f" strokecolor="red" strokeweight="1pt">
                 <v:stroke joinstyle="miter"/>
@@ -16059,7 +16109,7 @@
               </wp:anchor>
             </w:drawing>
           </mc:Choice>
-          <mc:Fallback>
+          <mc:Fallback xmlns:w16sdtdh="http://schemas.microsoft.com/office/word/2020/wordml/sdtdatahash" xmlns:w16="http://schemas.microsoft.com/office/word/2018/wordml" xmlns:w16cid="http://schemas.microsoft.com/office/word/2016/wordml/cid" xmlns:w16cex="http://schemas.microsoft.com/office/word/2018/wordml/cex" xmlns:am3d="http://schemas.microsoft.com/office/drawing/2017/model3d" xmlns:aink="http://schemas.microsoft.com/office/drawing/2016/ink" xmlns:cx8="http://schemas.microsoft.com/office/drawing/2016/5/14/chartex" xmlns:cx7="http://schemas.microsoft.com/office/drawing/2016/5/13/chartex" xmlns:cx6="http://schemas.microsoft.com/office/drawing/2016/5/12/chartex" xmlns:cx5="http://schemas.microsoft.com/office/drawing/2016/5/11/chartex" xmlns:cx4="http://schemas.microsoft.com/office/drawing/2016/5/10/chartex" xmlns:cx3="http://schemas.microsoft.com/office/drawing/2016/5/9/chartex" xmlns:cx2="http://schemas.microsoft.com/office/drawing/2015/10/21/chartex">
             <w:pict>
               <v:roundrect w14:anchorId="21F6E986" id="Rectangle : coins arrondis 84" o:spid="_x0000_s1027" style="position:absolute;left:0;text-align:left;margin-left:377.85pt;margin-top:37.15pt;width:77.25pt;height:16.7pt;z-index:251725824;visibility:visible;mso-wrap-style:square;mso-width-percent:0;mso-height-percent:0;mso-wrap-distance-left:9pt;mso-wrap-distance-top:0;mso-wrap-distance-right:9pt;mso-wrap-distance-bottom:0;mso-position-horizontal:absolute;mso-position-horizontal-relative:text;mso-position-vertical:absolute;mso-position-vertical-relative:text;mso-width-percent:0;mso-height-percent:0;mso-width-relative:margin;mso-height-relative:margin;v-text-anchor:middle" arcsize="10923f" o:gfxdata="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" filled="f" strokecolor="red" strokeweight="1pt">
                 <v:stroke joinstyle="miter"/>
@@ -16080,6 +16130,7 @@
       <w:r>
         <w:rPr>
           <w:noProof/>
+          <w:lang w:eastAsia="fr-FR"/>
         </w:rPr>
         <w:drawing>
           <wp:inline distT="0" distB="0" distL="0" distR="0" wp14:anchorId="4F158BDA" wp14:editId="51EEA65F">
@@ -16284,7 +16335,7 @@
               </wp:anchor>
             </w:drawing>
           </mc:Choice>
-          <mc:Fallback>
+          <mc:Fallback xmlns:w16sdtdh="http://schemas.microsoft.com/office/word/2020/wordml/sdtdatahash" xmlns:w16="http://schemas.microsoft.com/office/word/2018/wordml" xmlns:w16cid="http://schemas.microsoft.com/office/word/2016/wordml/cid" xmlns:w16cex="http://schemas.microsoft.com/office/word/2018/wordml/cex" xmlns:am3d="http://schemas.microsoft.com/office/drawing/2017/model3d" xmlns:aink="http://schemas.microsoft.com/office/drawing/2016/ink" xmlns:cx8="http://schemas.microsoft.com/office/drawing/2016/5/14/chartex" xmlns:cx7="http://schemas.microsoft.com/office/drawing/2016/5/13/chartex" xmlns:cx6="http://schemas.microsoft.com/office/drawing/2016/5/12/chartex" xmlns:cx5="http://schemas.microsoft.com/office/drawing/2016/5/11/chartex" xmlns:cx4="http://schemas.microsoft.com/office/drawing/2016/5/10/chartex" xmlns:cx3="http://schemas.microsoft.com/office/drawing/2016/5/9/chartex" xmlns:cx2="http://schemas.microsoft.com/office/drawing/2015/10/21/chartex">
             <w:pict>
               <v:roundrect w14:anchorId="5434D970" id="Rectangle : coins arrondis 86" o:spid="_x0000_s1028" style="position:absolute;left:0;text-align:left;margin-left:422.8pt;margin-top:6.85pt;width:28.2pt;height:12.1pt;z-index:251729920;visibility:visible;mso-wrap-style:square;mso-width-percent:0;mso-height-percent:0;mso-wrap-distance-left:9pt;mso-wrap-distance-top:0;mso-wrap-distance-right:9pt;mso-wrap-distance-bottom:0;mso-position-horizontal:absolute;mso-position-horizontal-relative:text;mso-position-vertical:absolute;mso-position-vertical-relative:text;mso-width-percent:0;mso-height-percent:0;mso-width-relative:margin;mso-height-relative:margin;v-text-anchor:middle" arcsize="10923f" o:gfxdata="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" filled="f" strokecolor="red" strokeweight="1pt">
                 <v:stroke joinstyle="miter"/>
@@ -16305,6 +16356,7 @@
       <w:r>
         <w:rPr>
           <w:noProof/>
+          <w:lang w:eastAsia="fr-FR"/>
         </w:rPr>
         <w:drawing>
           <wp:inline distT="0" distB="0" distL="0" distR="0" wp14:anchorId="5E4C0C6C" wp14:editId="21758415">
@@ -16432,6 +16484,7 @@
       <w:r>
         <w:rPr>
           <w:noProof/>
+          <w:lang w:eastAsia="fr-FR"/>
         </w:rPr>
         <w:drawing>
           <wp:inline distT="0" distB="0" distL="0" distR="0" wp14:anchorId="6B8F0565" wp14:editId="0EE29DBC">
@@ -16550,6 +16603,7 @@
       <w:r>
         <w:rPr>
           <w:noProof/>
+          <w:lang w:eastAsia="fr-FR"/>
         </w:rPr>
         <w:drawing>
           <wp:inline distT="0" distB="0" distL="0" distR="0" wp14:anchorId="0681FF1C" wp14:editId="29F6A1A9">
@@ -16785,7 +16839,7 @@
               </wp:anchor>
             </w:drawing>
           </mc:Choice>
-          <mc:Fallback>
+          <mc:Fallback xmlns:w16sdtdh="http://schemas.microsoft.com/office/word/2020/wordml/sdtdatahash" xmlns:w16="http://schemas.microsoft.com/office/word/2018/wordml" xmlns:w16cid="http://schemas.microsoft.com/office/word/2016/wordml/cid" xmlns:w16cex="http://schemas.microsoft.com/office/word/2018/wordml/cex" xmlns:am3d="http://schemas.microsoft.com/office/drawing/2017/model3d" xmlns:aink="http://schemas.microsoft.com/office/drawing/2016/ink" xmlns:cx8="http://schemas.microsoft.com/office/drawing/2016/5/14/chartex" xmlns:cx7="http://schemas.microsoft.com/office/drawing/2016/5/13/chartex" xmlns:cx6="http://schemas.microsoft.com/office/drawing/2016/5/12/chartex" xmlns:cx5="http://schemas.microsoft.com/office/drawing/2016/5/11/chartex" xmlns:cx4="http://schemas.microsoft.com/office/drawing/2016/5/10/chartex" xmlns:cx3="http://schemas.microsoft.com/office/drawing/2016/5/9/chartex" xmlns:cx2="http://schemas.microsoft.com/office/drawing/2015/10/21/chartex">
             <w:pict>
               <v:roundrect w14:anchorId="33A9968B" id="Rectangle : coins arrondis 83" o:spid="_x0000_s1029" style="position:absolute;left:0;text-align:left;margin-left:387.6pt;margin-top:25.9pt;width:49.35pt;height:12.1pt;z-index:251723776;visibility:visible;mso-wrap-style:square;mso-width-percent:0;mso-height-percent:0;mso-wrap-distance-left:9pt;mso-wrap-distance-top:0;mso-wrap-distance-right:9pt;mso-wrap-distance-bottom:0;mso-position-horizontal:absolute;mso-position-horizontal-relative:text;mso-position-vertical:absolute;mso-position-vertical-relative:text;mso-width-percent:0;mso-height-percent:0;mso-width-relative:margin;mso-height-relative:margin;v-text-anchor:middle" arcsize="10923f" o:gfxdata="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" filled="f" strokecolor="red" strokeweight="1pt">
                 <v:stroke joinstyle="miter"/>
@@ -16951,6 +17005,7 @@
       <w:r>
         <w:rPr>
           <w:noProof/>
+          <w:lang w:eastAsia="fr-FR"/>
         </w:rPr>
         <w:drawing>
           <wp:inline distT="0" distB="0" distL="0" distR="0" wp14:anchorId="544BB1D1" wp14:editId="49C94863">
@@ -17075,6 +17130,7 @@
       <w:r>
         <w:rPr>
           <w:noProof/>
+          <w:lang w:eastAsia="fr-FR"/>
         </w:rPr>
         <w:drawing>
           <wp:anchor distT="0" distB="0" distL="114300" distR="114300" simplePos="0" relativeHeight="251664384" behindDoc="1" locked="0" layoutInCell="1" allowOverlap="1" wp14:anchorId="53CB5C6B" wp14:editId="067CDCA4">
@@ -17228,7 +17284,7 @@
               </wp:anchor>
             </w:drawing>
           </mc:Choice>
-          <mc:Fallback>
+          <mc:Fallback xmlns:w16sdtdh="http://schemas.microsoft.com/office/word/2020/wordml/sdtdatahash" xmlns:w16="http://schemas.microsoft.com/office/word/2018/wordml" xmlns:w16cid="http://schemas.microsoft.com/office/word/2016/wordml/cid" xmlns:w16cex="http://schemas.microsoft.com/office/word/2018/wordml/cex" xmlns:am3d="http://schemas.microsoft.com/office/drawing/2017/model3d" xmlns:aink="http://schemas.microsoft.com/office/drawing/2016/ink" xmlns:cx8="http://schemas.microsoft.com/office/drawing/2016/5/14/chartex" xmlns:cx7="http://schemas.microsoft.com/office/drawing/2016/5/13/chartex" xmlns:cx6="http://schemas.microsoft.com/office/drawing/2016/5/12/chartex" xmlns:cx5="http://schemas.microsoft.com/office/drawing/2016/5/11/chartex" xmlns:cx4="http://schemas.microsoft.com/office/drawing/2016/5/10/chartex" xmlns:cx3="http://schemas.microsoft.com/office/drawing/2016/5/9/chartex" xmlns:cx2="http://schemas.microsoft.com/office/drawing/2015/10/21/chartex">
             <w:pict>
               <v:roundrect w14:anchorId="2A11C66A" id="Rectangle : coins arrondis 82" o:spid="_x0000_s1030" style="position:absolute;left:0;text-align:left;margin-left:39.75pt;margin-top:25.1pt;width:63.35pt;height:16.7pt;z-index:251721728;visibility:visible;mso-wrap-style:square;mso-width-percent:0;mso-height-percent:0;mso-wrap-distance-left:9pt;mso-wrap-distance-top:0;mso-wrap-distance-right:9pt;mso-wrap-distance-bottom:0;mso-position-horizontal:absolute;mso-position-horizontal-relative:text;mso-position-vertical:absolute;mso-position-vertical-relative:text;mso-width-percent:0;mso-height-percent:0;mso-width-relative:margin;mso-height-relative:margin;v-text-anchor:middle" arcsize="10923f" o:gfxdata="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" filled="f" strokecolor="red" strokeweight="1pt">
                 <v:stroke joinstyle="miter"/>
@@ -17255,6 +17311,7 @@
       <w:r>
         <w:rPr>
           <w:noProof/>
+          <w:lang w:eastAsia="fr-FR"/>
         </w:rPr>
         <w:lastRenderedPageBreak/>
         <w:drawing>
@@ -17393,7 +17450,7 @@
               </wp:anchor>
             </w:drawing>
           </mc:Choice>
-          <mc:Fallback>
+          <mc:Fallback xmlns:w16sdtdh="http://schemas.microsoft.com/office/word/2020/wordml/sdtdatahash" xmlns:w16="http://schemas.microsoft.com/office/word/2018/wordml" xmlns:w16cid="http://schemas.microsoft.com/office/word/2016/wordml/cid" xmlns:w16cex="http://schemas.microsoft.com/office/word/2018/wordml/cex" xmlns:am3d="http://schemas.microsoft.com/office/drawing/2017/model3d" xmlns:aink="http://schemas.microsoft.com/office/drawing/2016/ink" xmlns:cx8="http://schemas.microsoft.com/office/drawing/2016/5/14/chartex" xmlns:cx7="http://schemas.microsoft.com/office/drawing/2016/5/13/chartex" xmlns:cx6="http://schemas.microsoft.com/office/drawing/2016/5/12/chartex" xmlns:cx5="http://schemas.microsoft.com/office/drawing/2016/5/11/chartex" xmlns:cx4="http://schemas.microsoft.com/office/drawing/2016/5/10/chartex" xmlns:cx3="http://schemas.microsoft.com/office/drawing/2016/5/9/chartex" xmlns:cx2="http://schemas.microsoft.com/office/drawing/2015/10/21/chartex">
             <w:pict>
               <v:roundrect w14:anchorId="6B614329" id="Rectangle : coins arrondis 81" o:spid="_x0000_s1031" style="position:absolute;left:0;text-align:left;margin-left:405.6pt;margin-top:4.85pt;width:28.2pt;height:12.05pt;z-index:251719680;visibility:visible;mso-wrap-style:square;mso-width-percent:0;mso-height-percent:0;mso-wrap-distance-left:9pt;mso-wrap-distance-top:0;mso-wrap-distance-right:9pt;mso-wrap-distance-bottom:0;mso-position-horizontal:absolute;mso-position-horizontal-relative:text;mso-position-vertical:absolute;mso-position-vertical-relative:text;mso-width-percent:0;mso-height-percent:0;mso-width-relative:margin;mso-height-relative:margin;v-text-anchor:middle" arcsize="10923f" o:gfxdata="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" filled="f" strokecolor="red" strokeweight="1pt">
                 <v:stroke joinstyle="miter"/>
@@ -17414,6 +17471,7 @@
       <w:r>
         <w:rPr>
           <w:noProof/>
+          <w:lang w:eastAsia="fr-FR"/>
         </w:rPr>
         <w:drawing>
           <wp:anchor distT="0" distB="0" distL="114300" distR="114300" simplePos="0" relativeHeight="251698176" behindDoc="1" locked="0" layoutInCell="1" allowOverlap="1" wp14:anchorId="197E53D9" wp14:editId="7E61E3ED">
@@ -17675,7 +17733,7 @@
               </wp:anchor>
             </w:drawing>
           </mc:Choice>
-          <mc:Fallback>
+          <mc:Fallback xmlns:w16sdtdh="http://schemas.microsoft.com/office/word/2020/wordml/sdtdatahash" xmlns:w16="http://schemas.microsoft.com/office/word/2018/wordml" xmlns:w16cid="http://schemas.microsoft.com/office/word/2016/wordml/cid" xmlns:w16cex="http://schemas.microsoft.com/office/word/2018/wordml/cex" xmlns:am3d="http://schemas.microsoft.com/office/drawing/2017/model3d" xmlns:aink="http://schemas.microsoft.com/office/drawing/2016/ink" xmlns:cx8="http://schemas.microsoft.com/office/drawing/2016/5/14/chartex" xmlns:cx7="http://schemas.microsoft.com/office/drawing/2016/5/13/chartex" xmlns:cx6="http://schemas.microsoft.com/office/drawing/2016/5/12/chartex" xmlns:cx5="http://schemas.microsoft.com/office/drawing/2016/5/11/chartex" xmlns:cx4="http://schemas.microsoft.com/office/drawing/2016/5/10/chartex" xmlns:cx3="http://schemas.microsoft.com/office/drawing/2016/5/9/chartex" xmlns:cx2="http://schemas.microsoft.com/office/drawing/2015/10/21/chartex">
             <w:pict>
               <v:roundrect w14:anchorId="22A97B5C" id="Rectangle : coins arrondis 79" o:spid="_x0000_s1032" style="position:absolute;left:0;text-align:left;margin-left:179.8pt;margin-top:49.85pt;width:100.8pt;height:16.65pt;z-index:251717632;visibility:visible;mso-wrap-style:square;mso-width-percent:0;mso-height-percent:0;mso-wrap-distance-left:9pt;mso-wrap-distance-top:0;mso-wrap-distance-right:9pt;mso-wrap-distance-bottom:0;mso-position-horizontal:absolute;mso-position-horizontal-relative:text;mso-position-vertical:absolute;mso-position-vertical-relative:text;mso-width-percent:0;mso-height-percent:0;mso-width-relative:margin;mso-height-relative:margin;v-text-anchor:middle" arcsize="10923f" o:gfxdata="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" filled="f" strokecolor="red" strokeweight="1pt">
                 <v:stroke joinstyle="miter"/>
@@ -17696,6 +17754,7 @@
       <w:r>
         <w:rPr>
           <w:noProof/>
+          <w:lang w:eastAsia="fr-FR"/>
         </w:rPr>
         <w:drawing>
           <wp:anchor distT="0" distB="0" distL="114300" distR="114300" simplePos="0" relativeHeight="251655166" behindDoc="1" locked="0" layoutInCell="1" allowOverlap="1" wp14:anchorId="4704CAA2" wp14:editId="77573F9F">
@@ -17773,6 +17832,7 @@
       <w:r>
         <w:rPr>
           <w:noProof/>
+          <w:lang w:eastAsia="fr-FR"/>
         </w:rPr>
         <w:drawing>
           <wp:inline distT="0" distB="0" distL="0" distR="0" wp14:anchorId="51C44F3C" wp14:editId="29A4C25E">
@@ -17837,6 +17897,7 @@
       <w:r>
         <w:rPr>
           <w:noProof/>
+          <w:lang w:eastAsia="fr-FR"/>
         </w:rPr>
         <w:drawing>
           <wp:inline distT="0" distB="0" distL="0" distR="0" wp14:anchorId="65E2F407" wp14:editId="47FFB72D">
@@ -17916,7 +17977,7 @@
           <w:lang w:eastAsia="fr-FR"/>
         </w:rPr>
       </w:pPr>
-      <w:bookmarkStart w:id="23" w:name="_Hlk189575735"/>
+      <w:bookmarkStart w:id="26" w:name="_Hlk189575735"/>
       <w:r>
         <w:rPr>
           <w:rFonts w:ascii="Times New Roman" w:eastAsia="Times New Roman" w:hAnsi="Times New Roman" w:cs="Times New Roman"/>
@@ -17929,7 +17990,8 @@
         <w:t>Coupures du réseau</w:t>
       </w:r>
     </w:p>
-    <w:bookmarkEnd w:id="23"/>
+    <w:bookmarkEnd w:id="26"/>
+    <w:commentRangeStart w:id="27"/>
     <w:p>
       <w:pPr>
         <w:spacing w:before="100" w:beforeAutospacing="1" w:after="100" w:afterAutospacing="1" w:line="240" w:lineRule="auto"/>
@@ -17941,7 +18003,6 @@
           <w:lang w:eastAsia="fr-FR"/>
         </w:rPr>
       </w:pPr>
-      <w:commentRangeStart w:id="24"/>
       <w:r>
         <w:rPr>
           <w:rFonts w:ascii="Times New Roman" w:eastAsia="Times New Roman" w:hAnsi="Times New Roman" w:cs="Times New Roman"/>
@@ -18028,7 +18089,7 @@
               </wp:anchor>
             </w:drawing>
           </mc:Choice>
-          <mc:Fallback>
+          <mc:Fallback xmlns:w16sdtdh="http://schemas.microsoft.com/office/word/2020/wordml/sdtdatahash" xmlns:w16="http://schemas.microsoft.com/office/word/2018/wordml" xmlns:w16cid="http://schemas.microsoft.com/office/word/2016/wordml/cid" xmlns:w16cex="http://schemas.microsoft.com/office/word/2018/wordml/cex" xmlns:am3d="http://schemas.microsoft.com/office/drawing/2017/model3d" xmlns:aink="http://schemas.microsoft.com/office/drawing/2016/ink" xmlns:cx8="http://schemas.microsoft.com/office/drawing/2016/5/14/chartex" xmlns:cx7="http://schemas.microsoft.com/office/drawing/2016/5/13/chartex" xmlns:cx6="http://schemas.microsoft.com/office/drawing/2016/5/12/chartex" xmlns:cx5="http://schemas.microsoft.com/office/drawing/2016/5/11/chartex" xmlns:cx4="http://schemas.microsoft.com/office/drawing/2016/5/10/chartex" xmlns:cx3="http://schemas.microsoft.com/office/drawing/2016/5/9/chartex" xmlns:cx2="http://schemas.microsoft.com/office/drawing/2015/10/21/chartex">
             <w:pict>
               <v:roundrect w14:anchorId="0DD7619D" id="Rectangle : coins arrondis 75" o:spid="_x0000_s1033" style="position:absolute;left:0;text-align:left;margin-left:339.2pt;margin-top:27.8pt;width:40.3pt;height:12.65pt;z-index:251711488;visibility:visible;mso-wrap-style:square;mso-width-percent:0;mso-height-percent:0;mso-wrap-distance-left:9pt;mso-wrap-distance-top:0;mso-wrap-distance-right:9pt;mso-wrap-distance-bottom:0;mso-position-horizontal:absolute;mso-position-horizontal-relative:text;mso-position-vertical:absolute;mso-position-vertical-relative:text;mso-width-percent:0;mso-height-percent:0;mso-width-relative:margin;mso-height-relative:margin;v-text-anchor:middle" arcsize="10923f" o:gfxdata="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" filled="f" strokecolor="red" strokeweight="1pt">
                 <v:stroke joinstyle="miter"/>
@@ -18218,12 +18279,12 @@
         </w:rPr>
         <w:t xml:space="preserve">de consultation des calendriers apparaitra, filtres appliqués si sélectionnés en amont. </w:t>
       </w:r>
-      <w:commentRangeEnd w:id="24"/>
+      <w:commentRangeEnd w:id="27"/>
       <w:r>
         <w:rPr>
           <w:rStyle w:val="Marquedecommentaire"/>
         </w:rPr>
-        <w:commentReference w:id="24"/>
+        <w:commentReference w:id="27"/>
       </w:r>
     </w:p>
     <w:p>
@@ -18252,7 +18313,7 @@
           <w:lang w:eastAsia="fr-FR"/>
         </w:rPr>
       </w:pPr>
-      <w:bookmarkStart w:id="25" w:name="_Hlk189575978"/>
+      <w:bookmarkStart w:id="28" w:name="_Hlk189575978"/>
       <w:r>
         <w:rPr>
           <w:rFonts w:ascii="Times New Roman" w:eastAsia="Times New Roman" w:hAnsi="Times New Roman" w:cs="Times New Roman"/>
@@ -18276,8 +18337,8 @@
           <w:lang w:eastAsia="fr-FR"/>
         </w:rPr>
       </w:pPr>
-      <w:bookmarkStart w:id="26" w:name="_Hlk188880800"/>
-      <w:bookmarkEnd w:id="25"/>
+      <w:bookmarkStart w:id="29" w:name="_Hlk188880800"/>
+      <w:bookmarkEnd w:id="28"/>
       <w:r>
         <w:rPr>
           <w:rFonts w:ascii="Times New Roman" w:eastAsia="Times New Roman" w:hAnsi="Times New Roman" w:cs="Times New Roman"/>
@@ -18404,7 +18465,7 @@
         </w:rPr>
         <w:t xml:space="preserve"> </w:t>
       </w:r>
-      <w:bookmarkEnd w:id="26"/>
+      <w:bookmarkEnd w:id="29"/>
     </w:p>
     <w:p>
       <w:pPr>
@@ -18420,6 +18481,7 @@
       <w:r>
         <w:rPr>
           <w:noProof/>
+          <w:lang w:eastAsia="fr-FR"/>
         </w:rPr>
         <w:drawing>
           <wp:anchor distT="0" distB="0" distL="114300" distR="114300" simplePos="0" relativeHeight="251699200" behindDoc="1" locked="0" layoutInCell="1" allowOverlap="1" wp14:anchorId="72C52162" wp14:editId="442C831A">
@@ -18572,7 +18634,7 @@
               </wp:anchor>
             </w:drawing>
           </mc:Choice>
-          <mc:Fallback>
+          <mc:Fallback xmlns:w16sdtdh="http://schemas.microsoft.com/office/word/2020/wordml/sdtdatahash" xmlns:w16="http://schemas.microsoft.com/office/word/2018/wordml" xmlns:w16cid="http://schemas.microsoft.com/office/word/2016/wordml/cid" xmlns:w16cex="http://schemas.microsoft.com/office/word/2018/wordml/cex" xmlns:am3d="http://schemas.microsoft.com/office/drawing/2017/model3d" xmlns:aink="http://schemas.microsoft.com/office/drawing/2016/ink" xmlns:cx8="http://schemas.microsoft.com/office/drawing/2016/5/14/chartex" xmlns:cx7="http://schemas.microsoft.com/office/drawing/2016/5/13/chartex" xmlns:cx6="http://schemas.microsoft.com/office/drawing/2016/5/12/chartex" xmlns:cx5="http://schemas.microsoft.com/office/drawing/2016/5/11/chartex" xmlns:cx4="http://schemas.microsoft.com/office/drawing/2016/5/10/chartex" xmlns:cx3="http://schemas.microsoft.com/office/drawing/2016/5/9/chartex" xmlns:cx2="http://schemas.microsoft.com/office/drawing/2015/10/21/chartex">
             <w:pict>
               <v:roundrect w14:anchorId="6E78486A" id="Rectangle : coins arrondis 77" o:spid="_x0000_s1034" style="position:absolute;left:0;text-align:left;margin-left:59.8pt;margin-top:64.65pt;width:31.7pt;height:16.7pt;z-index:251713536;visibility:visible;mso-wrap-style:square;mso-width-percent:0;mso-height-percent:0;mso-wrap-distance-left:9pt;mso-wrap-distance-top:0;mso-wrap-distance-right:9pt;mso-wrap-distance-bottom:0;mso-position-horizontal:absolute;mso-position-horizontal-relative:text;mso-position-vertical:absolute;mso-position-vertical-relative:text;mso-width-percent:0;mso-height-percent:0;mso-width-relative:margin;mso-height-relative:margin;v-text-anchor:middle" arcsize="10923f" o:gfxdata="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" filled="f" strokecolor="red" strokeweight="1pt">
                 <v:stroke joinstyle="miter"/>
@@ -18645,7 +18707,7 @@
                       <a:tailEnd type="none" w="med" len="med"/>
                       <a:extLst>
                         <a:ext uri="{C807C97D-BFC1-408E-A445-0C87EB9F89A2}">
-                          <ask:lineSketchStyleProps xmlns:ask="http://schemas.microsoft.com/office/drawing/2018/sketchyshapes" sd="0">
+                          <ask:lineSketchStyleProps xmlns:ask="http://schemas.microsoft.com/office/drawing/2018/sketchyshapes" xmlns:w16sdtdh="http://schemas.microsoft.com/office/word/2020/wordml/sdtdatahash" xmlns:w16="http://schemas.microsoft.com/office/word/2018/wordml" xmlns:w16cid="http://schemas.microsoft.com/office/word/2016/wordml/cid" xmlns:w16cex="http://schemas.microsoft.com/office/word/2018/wordml/cex" xmlns:w="http://schemas.openxmlformats.org/wordprocessingml/2006/main" xmlns:w10="urn:schemas-microsoft-com:office:word" xmlns:v="urn:schemas-microsoft-com:vml" xmlns:o="urn:schemas-microsoft-com:office:office" xmlns:am3d="http://schemas.microsoft.com/office/drawing/2017/model3d" xmlns:aink="http://schemas.microsoft.com/office/drawing/2016/ink" xmlns:cx8="http://schemas.microsoft.com/office/drawing/2016/5/14/chartex" xmlns:cx7="http://schemas.microsoft.com/office/drawing/2016/5/13/chartex" xmlns:cx6="http://schemas.microsoft.com/office/drawing/2016/5/12/chartex" xmlns:cx5="http://schemas.microsoft.com/office/drawing/2016/5/11/chartex" xmlns:cx4="http://schemas.microsoft.com/office/drawing/2016/5/10/chartex" xmlns:cx3="http://schemas.microsoft.com/office/drawing/2016/5/9/chartex" xmlns:cx2="http://schemas.microsoft.com/office/drawing/2015/10/21/chartex" xmlns="" sd="0">
                             <a:custGeom>
                               <a:avLst/>
                               <a:gdLst/>
@@ -18829,7 +18891,7 @@
               </wp:anchor>
             </w:drawing>
           </mc:Choice>
-          <mc:Fallback>
+          <mc:Fallback xmlns:w16sdtdh="http://schemas.microsoft.com/office/word/2020/wordml/sdtdatahash" xmlns:w16="http://schemas.microsoft.com/office/word/2018/wordml" xmlns:w16cid="http://schemas.microsoft.com/office/word/2016/wordml/cid" xmlns:w16cex="http://schemas.microsoft.com/office/word/2018/wordml/cex" xmlns:am3d="http://schemas.microsoft.com/office/drawing/2017/model3d" xmlns:aink="http://schemas.microsoft.com/office/drawing/2016/ink" xmlns:cx8="http://schemas.microsoft.com/office/drawing/2016/5/14/chartex" xmlns:cx7="http://schemas.microsoft.com/office/drawing/2016/5/13/chartex" xmlns:cx6="http://schemas.microsoft.com/office/drawing/2016/5/12/chartex" xmlns:cx5="http://schemas.microsoft.com/office/drawing/2016/5/11/chartex" xmlns:cx4="http://schemas.microsoft.com/office/drawing/2016/5/10/chartex" xmlns:cx3="http://schemas.microsoft.com/office/drawing/2016/5/9/chartex" xmlns:cx2="http://schemas.microsoft.com/office/drawing/2015/10/21/chartex">
             <w:pict>
               <v:roundrect w14:anchorId="6B31675F" id="Rectangle : coins arrondis 78" o:spid="_x0000_s1035" style="position:absolute;left:0;text-align:left;margin-left:38.05pt;margin-top:15.9pt;width:75.75pt;height:13.15pt;z-index:251715584;visibility:visible;mso-wrap-style:square;mso-width-percent:0;mso-height-percent:0;mso-wrap-distance-left:9pt;mso-wrap-distance-top:0;mso-wrap-distance-right:9pt;mso-wrap-distance-bottom:0;mso-position-horizontal:absolute;mso-position-horizontal-relative:text;mso-position-vertical:absolute;mso-position-vertical-relative:text;mso-width-percent:0;mso-height-percent:0;mso-width-relative:margin;mso-height-relative:margin;v-text-anchor:middle" arcsize="10923f" o:gfxdata="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" filled="f" strokecolor="red" strokeweight="1pt">
                 <v:stroke joinstyle="miter"/>
@@ -18895,7 +18957,7 @@
           <w:lang w:eastAsia="fr-FR"/>
         </w:rPr>
       </w:pPr>
-      <w:commentRangeStart w:id="27"/>
+      <w:commentRangeStart w:id="30"/>
       <w:r>
         <w:rPr>
           <w:rFonts w:ascii="Times New Roman" w:eastAsia="Times New Roman" w:hAnsi="Times New Roman" w:cs="Times New Roman"/>
@@ -18918,12 +18980,12 @@
         </w:rPr>
         <w:t>B. : Ce manuel est également accessible dans cette section</w:t>
       </w:r>
-      <w:commentRangeEnd w:id="27"/>
+      <w:commentRangeEnd w:id="30"/>
       <w:r>
         <w:rPr>
           <w:rStyle w:val="Marquedecommentaire"/>
         </w:rPr>
-        <w:commentReference w:id="27"/>
+        <w:commentReference w:id="30"/>
       </w:r>
       <w:r>
         <w:rPr>
@@ -19118,6 +19180,7 @@
       <w:r>
         <w:rPr>
           <w:noProof/>
+          <w:lang w:eastAsia="fr-FR"/>
         </w:rPr>
         <w:lastRenderedPageBreak/>
         <w:drawing>
@@ -19183,8 +19246,8 @@
 </file>
 
 <file path=word/comments.xml><?xml version="1.0" encoding="utf-8"?>
-<w:comments xmlns:wpc="http://schemas.microsoft.com/office/word/2010/wordprocessingCanvas" xmlns:cx="http://schemas.microsoft.com/office/drawing/2014/chartex" xmlns:cx1="http://schemas.microsoft.com/office/drawing/2015/9/8/chartex" xmlns:cx2="http://schemas.microsoft.com/office/drawing/2015/10/21/chartex" xmlns:cx3="http://schemas.microsoft.com/office/drawing/2016/5/9/chartex" xmlns:cx4="http://schemas.microsoft.com/office/drawing/2016/5/10/chartex" xmlns:cx5="http://schemas.microsoft.com/office/drawing/2016/5/11/chartex" xmlns:cx6="http://schemas.microsoft.com/office/drawing/2016/5/12/chartex" xmlns:cx7="http://schemas.microsoft.com/office/drawing/2016/5/13/chartex" xmlns:cx8="http://schemas.microsoft.com/office/drawing/2016/5/14/chartex" xmlns:mc="http://schemas.openxmlformats.org/markup-compatibility/2006" xmlns:aink="http://schemas.microsoft.com/office/drawing/2016/ink" xmlns:am3d="http://schemas.microsoft.com/office/drawing/2017/model3d" xmlns:o="urn:schemas-microsoft-com:office:office" xmlns:r="http://schemas.openxmlformats.org/officeDocument/2006/relationships" xmlns:m="http://schemas.openxmlformats.org/officeDocument/2006/math" xmlns:v="urn:schemas-microsoft-com:vml" xmlns:wp14="http://schemas.microsoft.com/office/word/2010/wordprocessingDrawing" xmlns:wp="http://schemas.openxmlformats.org/drawingml/2006/wordprocessingDrawing" xmlns:w10="urn:schemas-microsoft-com:office:word" xmlns:w="http://schemas.openxmlformats.org/wordprocessingml/2006/main" xmlns:w14="http://schemas.microsoft.com/office/word/2010/wordml" xmlns:w15="http://schemas.microsoft.com/office/word/2012/wordml" xmlns:w16cex="http://schemas.microsoft.com/office/word/2018/wordml/cex" xmlns:w16cid="http://schemas.microsoft.com/office/word/2016/wordml/cid" xmlns:w16="http://schemas.microsoft.com/office/word/2018/wordml" xmlns:w16sdtdh="http://schemas.microsoft.com/office/word/2020/wordml/sdtdatahash" xmlns:w16se="http://schemas.microsoft.com/office/word/2015/wordml/symex" xmlns:wpg="http://schemas.microsoft.com/office/word/2010/wordprocessingGroup" xmlns:wpi="http://schemas.microsoft.com/office/word/2010/wordprocessingInk" xmlns:wne="http://schemas.microsoft.com/office/word/2006/wordml" xmlns:wps="http://schemas.microsoft.com/office/word/2010/wordprocessingShape" mc:Ignorable="w14 w15 w16se w16cid w16 w16cex w16sdtdh wp14">
-  <w:comment w:id="3" w:author="Vincent FACHERO, Ifremer Brest PDG-IRSI-ISI, 02 " w:date="2025-02-07T10:09:00Z" w:initials="VFIBPII0">
+<w:comments xmlns:wpc="http://schemas.microsoft.com/office/word/2010/wordprocessingCanvas" xmlns:cx="http://schemas.microsoft.com/office/drawing/2014/chartex" xmlns:cx1="http://schemas.microsoft.com/office/drawing/2015/9/8/chartex" xmlns:mc="http://schemas.openxmlformats.org/markup-compatibility/2006" xmlns:o="urn:schemas-microsoft-com:office:office" xmlns:r="http://schemas.openxmlformats.org/officeDocument/2006/relationships" xmlns:m="http://schemas.openxmlformats.org/officeDocument/2006/math" xmlns:v="urn:schemas-microsoft-com:vml" xmlns:wp14="http://schemas.microsoft.com/office/word/2010/wordprocessingDrawing" xmlns:wp="http://schemas.openxmlformats.org/drawingml/2006/wordprocessingDrawing" xmlns:w10="urn:schemas-microsoft-com:office:word" xmlns:w="http://schemas.openxmlformats.org/wordprocessingml/2006/main" xmlns:w14="http://schemas.microsoft.com/office/word/2010/wordml" xmlns:w15="http://schemas.microsoft.com/office/word/2012/wordml" xmlns:w16se="http://schemas.microsoft.com/office/word/2015/wordml/symex" xmlns:wpg="http://schemas.microsoft.com/office/word/2010/wordprocessingGroup" xmlns:wpi="http://schemas.microsoft.com/office/word/2010/wordprocessingInk" xmlns:wne="http://schemas.microsoft.com/office/word/2006/wordml" xmlns:wps="http://schemas.microsoft.com/office/word/2010/wordprocessingShape" mc:Ignorable="w14 w15 w16se wp14">
+  <w:comment w:id="1" w:author="Thierry Diffo" w:date="2025-02-07T11:22:00Z" w:initials="TD">
     <w:p>
       <w:pPr>
         <w:pStyle w:val="Commentaire"/>
@@ -19196,11 +19259,48 @@
         <w:annotationRef/>
       </w:r>
       <w:r>
+        <w:t>La documentation semble s'adresser principalement à des utilisateurs avertis. Peut-être pourrait-elle être enrichie par des explications destinées aux novices afin de faciliter leur prise en main du logiciel ?</w:t>
+      </w:r>
+    </w:p>
+    <w:p>
+      <w:pPr>
+        <w:pStyle w:val="Commentaire"/>
+      </w:pPr>
+    </w:p>
+    <w:p>
+      <w:pPr>
+        <w:pStyle w:val="Commentaire"/>
+      </w:pPr>
+      <w:r>
+        <w:t>Par ailleurs, la structure du d</w:t>
+      </w:r>
+      <w:r>
+        <w:t>ocument pourrait être optimisée :</w:t>
+      </w:r>
+      <w:bookmarkStart w:id="2" w:name="_GoBack"/>
+      <w:bookmarkEnd w:id="2"/>
+      <w:r>
+        <w:t xml:space="preserve"> actuellement, la configuration est abordée par fragments situés dans différentes parties du logiciel, ce qui peut rendre la compréhension plus difficile. Une approche plus systématique, en décrivant chaque fonctionnalité de manière organisée ou en proposant une procédure simplifiée d'utilisation, pourrait améliorer l’expérience utilisateur.</w:t>
+      </w:r>
+    </w:p>
+  </w:comment>
+  <w:comment w:id="5" w:author="Vincent FACHERO, Ifremer Brest PDG-IRSI-ISI, 02" w:date="2025-02-07T10:09:00Z" w:initials="VFIBPII0">
+    <w:p>
+      <w:pPr>
+        <w:pStyle w:val="Commentaire"/>
+      </w:pPr>
+      <w:r>
+        <w:rPr>
+          <w:rStyle w:val="Marquedecommentaire"/>
+        </w:rPr>
+        <w:annotationRef/>
+      </w:r>
+      <w:r>
         <w:t>Il manque des entêtes, pied de page et logos (voir la charte graphique avec Emilie).</w:t>
       </w:r>
     </w:p>
   </w:comment>
-  <w:comment w:id="1" w:author="Vincent FACHERO, Ifremer Brest PDG-IRSI-ISI, 02 " w:date="2025-02-06T22:59:00Z" w:initials="VFIBPII0">
+  <w:comment w:id="3" w:author="Vincent FACHERO, Ifremer Brest PDG-IRSI-ISI, 02" w:date="2025-02-06T22:59:00Z" w:initials="VFIBPII0">
     <w:p>
       <w:pPr>
         <w:pStyle w:val="Commentaire"/>
@@ -19222,7 +19322,7 @@
       </w:r>
     </w:p>
   </w:comment>
-  <w:comment w:id="2" w:author="Vincent FACHERO, Ifremer Brest PDG-IRSI-ISI, 02 " w:date="2025-02-07T10:09:00Z" w:initials="VFIBPII0">
+  <w:comment w:id="4" w:author="Vincent FACHERO, Ifremer Brest PDG-IRSI-ISI, 02" w:date="2025-02-07T10:09:00Z" w:initials="VFIBPII0">
     <w:p>
       <w:pPr>
         <w:pStyle w:val="Commentaire"/>
@@ -19238,7 +19338,7 @@
       </w:r>
     </w:p>
   </w:comment>
-  <w:comment w:id="6" w:author="Vincent FACHERO, Ifremer Brest PDG-IRSI-ISI, 02 " w:date="2025-02-06T22:56:00Z" w:initials="VFIBPII0">
+  <w:comment w:id="8" w:author="Vincent FACHERO, Ifremer Brest PDG-IRSI-ISI, 02" w:date="2025-02-06T22:56:00Z" w:initials="VFIBPII0">
     <w:p>
       <w:pPr>
         <w:pStyle w:val="Commentaire"/>
@@ -19274,7 +19374,7 @@
       </w:r>
     </w:p>
   </w:comment>
-  <w:comment w:id="8" w:author="Vincent FACHERO, Ifremer Brest PDG-IRSI-ISI, 02 " w:date="2025-02-06T22:58:00Z" w:initials="VFIBPII0">
+  <w:comment w:id="10" w:author="Vincent FACHERO, Ifremer Brest PDG-IRSI-ISI, 02" w:date="2025-02-06T22:58:00Z" w:initials="VFIBPII0">
     <w:p>
       <w:pPr>
         <w:pStyle w:val="Commentaire"/>
@@ -19290,7 +19390,7 @@
       </w:r>
     </w:p>
   </w:comment>
-  <w:comment w:id="10" w:author="Vincent FACHERO, Ifremer Brest PDG-IRSI-ISI, 02 " w:date="2025-02-07T09:18:00Z" w:initials="VFIBPII0">
+  <w:comment w:id="11" w:author="Thierry Diffo" w:date="2025-02-07T11:01:00Z" w:initials="TD">
     <w:p>
       <w:pPr>
         <w:pStyle w:val="Commentaire"/>
@@ -19302,6 +19402,22 @@
         <w:annotationRef/>
       </w:r>
       <w:r>
+        <w:t>À quoi sert cette option à la base ? et pourquoi la désactiver ?</w:t>
+      </w:r>
+    </w:p>
+  </w:comment>
+  <w:comment w:id="13" w:author="Vincent FACHERO, Ifremer Brest PDG-IRSI-ISI, 02" w:date="2025-02-07T09:18:00Z" w:initials="VFIBPII0">
+    <w:p>
+      <w:pPr>
+        <w:pStyle w:val="Commentaire"/>
+      </w:pPr>
+      <w:r>
+        <w:rPr>
+          <w:rStyle w:val="Marquedecommentaire"/>
+        </w:rPr>
+        <w:annotationRef/>
+      </w:r>
+      <w:r>
         <w:t>L’indexation ElastiSearch n’étant pas activée en exploitation (issue #</w:t>
       </w:r>
       <w:r>
@@ -19312,7 +19428,7 @@
       </w:r>
     </w:p>
   </w:comment>
-  <w:comment w:id="11" w:author="Vincent FACHERO, Ifremer Brest PDG-IRSI-ISI, 02 " w:date="2025-02-07T09:18:00Z" w:initials="VFIBPII0">
+  <w:comment w:id="14" w:author="Vincent FACHERO, Ifremer Brest PDG-IRSI-ISI, 02" w:date="2025-02-07T09:18:00Z" w:initials="VFIBPII0">
     <w:p>
       <w:pPr>
         <w:pStyle w:val="Commentaire"/>
@@ -19328,7 +19444,7 @@
       </w:r>
     </w:p>
   </w:comment>
-  <w:comment w:id="14" w:author="Vincent FACHERO, Ifremer Brest PDG-IRSI-ISI, 02 " w:date="2025-02-07T09:20:00Z" w:initials="VFIBPII0">
+  <w:comment w:id="17" w:author="Vincent FACHERO, Ifremer Brest PDG-IRSI-ISI, 02" w:date="2025-02-07T09:20:00Z" w:initials="VFIBPII0">
     <w:p>
       <w:pPr>
         <w:pStyle w:val="Commentaire"/>
@@ -19344,7 +19460,7 @@
       </w:r>
     </w:p>
   </w:comment>
-  <w:comment w:id="15" w:author="Vincent FACHERO, Ifremer Brest PDG-IRSI-ISI, 02 " w:date="2025-02-07T09:21:00Z" w:initials="VFIBPII0">
+  <w:comment w:id="18" w:author="Vincent FACHERO, Ifremer Brest PDG-IRSI-ISI, 02" w:date="2025-02-07T09:21:00Z" w:initials="VFIBPII0">
     <w:p>
       <w:pPr>
         <w:pStyle w:val="Commentaire"/>
@@ -19366,7 +19482,7 @@
       </w:r>
     </w:p>
   </w:comment>
-  <w:comment w:id="16" w:author="Vincent FACHERO, Ifremer Brest PDG-IRSI-ISI, 02 " w:date="2025-02-07T09:23:00Z" w:initials="VFIBPII0">
+  <w:comment w:id="19" w:author="Vincent FACHERO, Ifremer Brest PDG-IRSI-ISI, 02" w:date="2025-02-07T09:23:00Z" w:initials="VFIBPII0">
     <w:p>
       <w:pPr>
         <w:pStyle w:val="Commentaire"/>
@@ -19382,7 +19498,7 @@
       </w:r>
     </w:p>
   </w:comment>
-  <w:comment w:id="17" w:author="Vincent FACHERO, Ifremer Brest PDG-IRSI-ISI, 02 " w:date="2025-02-07T09:24:00Z" w:initials="VFIBPII0">
+  <w:comment w:id="20" w:author="Vincent FACHERO, Ifremer Brest PDG-IRSI-ISI, 02" w:date="2025-02-07T09:24:00Z" w:initials="VFIBPII0">
     <w:p>
       <w:pPr>
         <w:pStyle w:val="Commentaire"/>
@@ -19404,7 +19520,7 @@
       </w:r>
     </w:p>
   </w:comment>
-  <w:comment w:id="18" w:author="Vincent FACHERO, Ifremer Brest PDG-IRSI-ISI, 02 " w:date="2025-02-07T09:25:00Z" w:initials="VFIBPII0">
+  <w:comment w:id="21" w:author="Vincent FACHERO, Ifremer Brest PDG-IRSI-ISI, 02" w:date="2025-02-07T09:25:00Z" w:initials="VFIBPII0">
     <w:p>
       <w:pPr>
         <w:pStyle w:val="Commentaire"/>
@@ -19420,7 +19536,7 @@
       </w:r>
     </w:p>
   </w:comment>
-  <w:comment w:id="19" w:author="Vincent FACHERO, Ifremer Brest PDG-IRSI-ISI, 02 " w:date="2025-02-07T09:25:00Z" w:initials="VFIBPII0">
+  <w:comment w:id="22" w:author="Vincent FACHERO, Ifremer Brest PDG-IRSI-ISI, 02" w:date="2025-02-07T09:25:00Z" w:initials="VFIBPII0">
     <w:p>
       <w:pPr>
         <w:pStyle w:val="Commentaire"/>
@@ -19436,7 +19552,7 @@
       </w:r>
     </w:p>
   </w:comment>
-  <w:comment w:id="20" w:author="Vincent FACHERO, Ifremer Brest PDG-IRSI-ISI, 02 " w:date="2025-02-07T09:28:00Z" w:initials="VFIBPII0">
+  <w:comment w:id="23" w:author="Vincent FACHERO, Ifremer Brest PDG-IRSI-ISI, 02" w:date="2025-02-07T09:28:00Z" w:initials="VFIBPII0">
     <w:p>
       <w:pPr>
         <w:pStyle w:val="Commentaire"/>
@@ -19452,7 +19568,7 @@
       </w:r>
     </w:p>
   </w:comment>
-  <w:comment w:id="21" w:author="Vincent FACHERO, Ifremer Brest PDG-IRSI-ISI, 02 " w:date="2025-02-07T09:29:00Z" w:initials="VFIBPII0">
+  <w:comment w:id="24" w:author="Vincent FACHERO, Ifremer Brest PDG-IRSI-ISI, 02" w:date="2025-02-07T09:29:00Z" w:initials="VFIBPII0">
     <w:p>
       <w:pPr>
         <w:pStyle w:val="Commentaire"/>
@@ -19468,7 +19584,7 @@
       </w:r>
     </w:p>
   </w:comment>
-  <w:comment w:id="24" w:author="Vincent FACHERO, Ifremer Brest PDG-IRSI-ISI, 02 " w:date="2025-02-07T10:01:00Z" w:initials="VFIBPII0">
+  <w:comment w:id="27" w:author="Vincent FACHERO, Ifremer Brest PDG-IRSI-ISI, 02" w:date="2025-02-07T10:01:00Z" w:initials="VFIBPII0">
     <w:p>
       <w:pPr>
         <w:pStyle w:val="Commentaire"/>
@@ -19484,7 +19600,7 @@
       </w:r>
     </w:p>
   </w:comment>
-  <w:comment w:id="27" w:author="Vincent FACHERO, Ifremer Brest PDG-IRSI-ISI, 02 " w:date="2025-02-07T10:02:00Z" w:initials="VFIBPII0">
+  <w:comment w:id="30" w:author="Vincent FACHERO, Ifremer Brest PDG-IRSI-ISI, 02" w:date="2025-02-07T10:02:00Z" w:initials="VFIBPII0">
     <w:p>
       <w:pPr>
         <w:pStyle w:val="Commentaire"/>
@@ -19507,12 +19623,14 @@
 </file>
 
 <file path=word/commentsExtended.xml><?xml version="1.0" encoding="utf-8"?>
-<w15:commentsEx xmlns:wpc="http://schemas.microsoft.com/office/word/2010/wordprocessingCanvas" xmlns:cx="http://schemas.microsoft.com/office/drawing/2014/chartex" xmlns:cx1="http://schemas.microsoft.com/office/drawing/2015/9/8/chartex" xmlns:cx2="http://schemas.microsoft.com/office/drawing/2015/10/21/chartex" xmlns:cx3="http://schemas.microsoft.com/office/drawing/2016/5/9/chartex" xmlns:cx4="http://schemas.microsoft.com/office/drawing/2016/5/10/chartex" xmlns:cx5="http://schemas.microsoft.com/office/drawing/2016/5/11/chartex" xmlns:cx6="http://schemas.microsoft.com/office/drawing/2016/5/12/chartex" xmlns:cx7="http://schemas.microsoft.com/office/drawing/2016/5/13/chartex" xmlns:cx8="http://schemas.microsoft.com/office/drawing/2016/5/14/chartex" xmlns:mc="http://schemas.openxmlformats.org/markup-compatibility/2006" xmlns:aink="http://schemas.microsoft.com/office/drawing/2016/ink" xmlns:am3d="http://schemas.microsoft.com/office/drawing/2017/model3d" xmlns:o="urn:schemas-microsoft-com:office:office" xmlns:r="http://schemas.openxmlformats.org/officeDocument/2006/relationships" xmlns:m="http://schemas.openxmlformats.org/officeDocument/2006/math" xmlns:v="urn:schemas-microsoft-com:vml" xmlns:wp14="http://schemas.microsoft.com/office/word/2010/wordprocessingDrawing" xmlns:wp="http://schemas.openxmlformats.org/drawingml/2006/wordprocessingDrawing" xmlns:w10="urn:schemas-microsoft-com:office:word" xmlns:w="http://schemas.openxmlformats.org/wordprocessingml/2006/main" xmlns:w14="http://schemas.microsoft.com/office/word/2010/wordml" xmlns:w15="http://schemas.microsoft.com/office/word/2012/wordml" xmlns:w16cex="http://schemas.microsoft.com/office/word/2018/wordml/cex" xmlns:w16cid="http://schemas.microsoft.com/office/word/2016/wordml/cid" xmlns:w16="http://schemas.microsoft.com/office/word/2018/wordml" xmlns:w16sdtdh="http://schemas.microsoft.com/office/word/2020/wordml/sdtdatahash" xmlns:w16se="http://schemas.microsoft.com/office/word/2015/wordml/symex" xmlns:wpg="http://schemas.microsoft.com/office/word/2010/wordprocessingGroup" xmlns:wpi="http://schemas.microsoft.com/office/word/2010/wordprocessingInk" xmlns:wne="http://schemas.microsoft.com/office/word/2006/wordml" xmlns:wps="http://schemas.microsoft.com/office/word/2010/wordprocessingShape" mc:Ignorable="w14 w15 w16se w16cid w16 w16cex w16sdtdh wp14">
+<w15:commentsEx xmlns:wpc="http://schemas.microsoft.com/office/word/2010/wordprocessingCanvas" xmlns:cx="http://schemas.microsoft.com/office/drawing/2014/chartex" xmlns:cx1="http://schemas.microsoft.com/office/drawing/2015/9/8/chartex" xmlns:mc="http://schemas.openxmlformats.org/markup-compatibility/2006" xmlns:o="urn:schemas-microsoft-com:office:office" xmlns:r="http://schemas.openxmlformats.org/officeDocument/2006/relationships" xmlns:m="http://schemas.openxmlformats.org/officeDocument/2006/math" xmlns:v="urn:schemas-microsoft-com:vml" xmlns:wp14="http://schemas.microsoft.com/office/word/2010/wordprocessingDrawing" xmlns:wp="http://schemas.openxmlformats.org/drawingml/2006/wordprocessingDrawing" xmlns:w10="urn:schemas-microsoft-com:office:word" xmlns:w="http://schemas.openxmlformats.org/wordprocessingml/2006/main" xmlns:w14="http://schemas.microsoft.com/office/word/2010/wordml" xmlns:w15="http://schemas.microsoft.com/office/word/2012/wordml" xmlns:w16se="http://schemas.microsoft.com/office/word/2015/wordml/symex" xmlns:wpg="http://schemas.microsoft.com/office/word/2010/wordprocessingGroup" xmlns:wpi="http://schemas.microsoft.com/office/word/2010/wordprocessingInk" xmlns:wne="http://schemas.microsoft.com/office/word/2006/wordml" xmlns:wps="http://schemas.microsoft.com/office/word/2010/wordprocessingShape" mc:Ignorable="w14 w15 w16se wp14">
+  <w15:commentEx w15:paraId="19C914B3" w15:done="0"/>
   <w15:commentEx w15:paraId="2186DFC0" w15:done="0"/>
   <w15:commentEx w15:paraId="2E2B66D5" w15:done="0"/>
   <w15:commentEx w15:paraId="24BC82FA" w15:done="0"/>
   <w15:commentEx w15:paraId="2AAC0322" w15:done="0"/>
   <w15:commentEx w15:paraId="57662F23" w15:done="0"/>
+  <w15:commentEx w15:paraId="7C44DD64" w15:paraIdParent="57662F23" w15:done="0"/>
   <w15:commentEx w15:paraId="63FD4970" w15:done="0"/>
   <w15:commentEx w15:paraId="7A9F92F1" w15:done="0"/>
   <w15:commentEx w15:paraId="0BDC8BB4" w15:done="0"/>
@@ -19573,7 +19691,7 @@
 </file>
 
 <file path=word/numbering.xml><?xml version="1.0" encoding="utf-8"?>
-<w:numbering xmlns:wpc="http://schemas.microsoft.com/office/word/2010/wordprocessingCanvas" xmlns:cx="http://schemas.microsoft.com/office/drawing/2014/chartex" xmlns:cx1="http://schemas.microsoft.com/office/drawing/2015/9/8/chartex" xmlns:cx2="http://schemas.microsoft.com/office/drawing/2015/10/21/chartex" xmlns:cx3="http://schemas.microsoft.com/office/drawing/2016/5/9/chartex" xmlns:cx4="http://schemas.microsoft.com/office/drawing/2016/5/10/chartex" xmlns:cx5="http://schemas.microsoft.com/office/drawing/2016/5/11/chartex" xmlns:cx6="http://schemas.microsoft.com/office/drawing/2016/5/12/chartex" xmlns:cx7="http://schemas.microsoft.com/office/drawing/2016/5/13/chartex" xmlns:cx8="http://schemas.microsoft.com/office/drawing/2016/5/14/chartex" xmlns:mc="http://schemas.openxmlformats.org/markup-compatibility/2006" xmlns:aink="http://schemas.microsoft.com/office/drawing/2016/ink" xmlns:am3d="http://schemas.microsoft.com/office/drawing/2017/model3d" xmlns:o="urn:schemas-microsoft-com:office:office" xmlns:r="http://schemas.openxmlformats.org/officeDocument/2006/relationships" xmlns:m="http://schemas.openxmlformats.org/officeDocument/2006/math" xmlns:v="urn:schemas-microsoft-com:vml" xmlns:wp14="http://schemas.microsoft.com/office/word/2010/wordprocessingDrawing" xmlns:wp="http://schemas.openxmlformats.org/drawingml/2006/wordprocessingDrawing" xmlns:w10="urn:schemas-microsoft-com:office:word" xmlns:w="http://schemas.openxmlformats.org/wordprocessingml/2006/main" xmlns:w14="http://schemas.microsoft.com/office/word/2010/wordml" xmlns:w15="http://schemas.microsoft.com/office/word/2012/wordml" xmlns:w16cex="http://schemas.microsoft.com/office/word/2018/wordml/cex" xmlns:w16cid="http://schemas.microsoft.com/office/word/2016/wordml/cid" xmlns:w16="http://schemas.microsoft.com/office/word/2018/wordml" xmlns:w16sdtdh="http://schemas.microsoft.com/office/word/2020/wordml/sdtdatahash" xmlns:w16se="http://schemas.microsoft.com/office/word/2015/wordml/symex" xmlns:wpg="http://schemas.microsoft.com/office/word/2010/wordprocessingGroup" xmlns:wpi="http://schemas.microsoft.com/office/word/2010/wordprocessingInk" xmlns:wne="http://schemas.microsoft.com/office/word/2006/wordml" xmlns:wps="http://schemas.microsoft.com/office/word/2010/wordprocessingShape" mc:Ignorable="w14 w15 w16se w16cid w16 w16cex w16sdtdh wp14">
+<w:numbering xmlns:wpc="http://schemas.microsoft.com/office/word/2010/wordprocessingCanvas" xmlns:cx="http://schemas.microsoft.com/office/drawing/2014/chartex" xmlns:cx1="http://schemas.microsoft.com/office/drawing/2015/9/8/chartex" xmlns:mc="http://schemas.openxmlformats.org/markup-compatibility/2006" xmlns:o="urn:schemas-microsoft-com:office:office" xmlns:r="http://schemas.openxmlformats.org/officeDocument/2006/relationships" xmlns:m="http://schemas.openxmlformats.org/officeDocument/2006/math" xmlns:v="urn:schemas-microsoft-com:vml" xmlns:wp14="http://schemas.microsoft.com/office/word/2010/wordprocessingDrawing" xmlns:wp="http://schemas.openxmlformats.org/drawingml/2006/wordprocessingDrawing" xmlns:w10="urn:schemas-microsoft-com:office:word" xmlns:w="http://schemas.openxmlformats.org/wordprocessingml/2006/main" xmlns:w14="http://schemas.microsoft.com/office/word/2010/wordml" xmlns:w15="http://schemas.microsoft.com/office/word/2012/wordml" xmlns:w16se="http://schemas.microsoft.com/office/word/2015/wordml/symex" xmlns:wpg="http://schemas.microsoft.com/office/word/2010/wordprocessingGroup" xmlns:wpi="http://schemas.microsoft.com/office/word/2010/wordprocessingInk" xmlns:wne="http://schemas.microsoft.com/office/word/2006/wordml" xmlns:wps="http://schemas.microsoft.com/office/word/2010/wordprocessingShape" mc:Ignorable="w14 w15 w16se wp14">
   <w:abstractNum w:abstractNumId="0" w15:restartNumberingAfterBreak="0">
     <w:nsid w:val="007D612D"/>
     <w:multiLevelType w:val="hybridMultilevel"/>
@@ -21234,15 +21352,18 @@
 </file>
 
 <file path=word/people.xml><?xml version="1.0" encoding="utf-8"?>
-<w15:people xmlns:wpc="http://schemas.microsoft.com/office/word/2010/wordprocessingCanvas" xmlns:cx="http://schemas.microsoft.com/office/drawing/2014/chartex" xmlns:cx1="http://schemas.microsoft.com/office/drawing/2015/9/8/chartex" xmlns:cx2="http://schemas.microsoft.com/office/drawing/2015/10/21/chartex" xmlns:cx3="http://schemas.microsoft.com/office/drawing/2016/5/9/chartex" xmlns:cx4="http://schemas.microsoft.com/office/drawing/2016/5/10/chartex" xmlns:cx5="http://schemas.microsoft.com/office/drawing/2016/5/11/chartex" xmlns:cx6="http://schemas.microsoft.com/office/drawing/2016/5/12/chartex" xmlns:cx7="http://schemas.microsoft.com/office/drawing/2016/5/13/chartex" xmlns:cx8="http://schemas.microsoft.com/office/drawing/2016/5/14/chartex" xmlns:mc="http://schemas.openxmlformats.org/markup-compatibility/2006" xmlns:aink="http://schemas.microsoft.com/office/drawing/2016/ink" xmlns:am3d="http://schemas.microsoft.com/office/drawing/2017/model3d" xmlns:o="urn:schemas-microsoft-com:office:office" xmlns:r="http://schemas.openxmlformats.org/officeDocument/2006/relationships" xmlns:m="http://schemas.openxmlformats.org/officeDocument/2006/math" xmlns:v="urn:schemas-microsoft-com:vml" xmlns:wp14="http://schemas.microsoft.com/office/word/2010/wordprocessingDrawing" xmlns:wp="http://schemas.openxmlformats.org/drawingml/2006/wordprocessingDrawing" xmlns:w10="urn:schemas-microsoft-com:office:word" xmlns:w="http://schemas.openxmlformats.org/wordprocessingml/2006/main" xmlns:w14="http://schemas.microsoft.com/office/word/2010/wordml" xmlns:w15="http://schemas.microsoft.com/office/word/2012/wordml" xmlns:w16cex="http://schemas.microsoft.com/office/word/2018/wordml/cex" xmlns:w16cid="http://schemas.microsoft.com/office/word/2016/wordml/cid" xmlns:w16="http://schemas.microsoft.com/office/word/2018/wordml" xmlns:w16sdtdh="http://schemas.microsoft.com/office/word/2020/wordml/sdtdatahash" xmlns:w16se="http://schemas.microsoft.com/office/word/2015/wordml/symex" xmlns:wpg="http://schemas.microsoft.com/office/word/2010/wordprocessingGroup" xmlns:wpi="http://schemas.microsoft.com/office/word/2010/wordprocessingInk" xmlns:wne="http://schemas.microsoft.com/office/word/2006/wordml" xmlns:wps="http://schemas.microsoft.com/office/word/2010/wordprocessingShape" mc:Ignorable="w14 w15 w16se w16cid w16 w16cex w16sdtdh wp14">
-  <w15:person w15:author="Vincent FACHERO, Ifremer Brest PDG-IRSI-ISI, 02 ">
+<w15:people xmlns:wpc="http://schemas.microsoft.com/office/word/2010/wordprocessingCanvas" xmlns:cx="http://schemas.microsoft.com/office/drawing/2014/chartex" xmlns:cx1="http://schemas.microsoft.com/office/drawing/2015/9/8/chartex" xmlns:mc="http://schemas.openxmlformats.org/markup-compatibility/2006" xmlns:o="urn:schemas-microsoft-com:office:office" xmlns:r="http://schemas.openxmlformats.org/officeDocument/2006/relationships" xmlns:m="http://schemas.openxmlformats.org/officeDocument/2006/math" xmlns:v="urn:schemas-microsoft-com:vml" xmlns:wp14="http://schemas.microsoft.com/office/word/2010/wordprocessingDrawing" xmlns:wp="http://schemas.openxmlformats.org/drawingml/2006/wordprocessingDrawing" xmlns:w10="urn:schemas-microsoft-com:office:word" xmlns:w="http://schemas.openxmlformats.org/wordprocessingml/2006/main" xmlns:w14="http://schemas.microsoft.com/office/word/2010/wordml" xmlns:w15="http://schemas.microsoft.com/office/word/2012/wordml" xmlns:w16se="http://schemas.microsoft.com/office/word/2015/wordml/symex" xmlns:wpg="http://schemas.microsoft.com/office/word/2010/wordprocessingGroup" xmlns:wpi="http://schemas.microsoft.com/office/word/2010/wordprocessingInk" xmlns:wne="http://schemas.microsoft.com/office/word/2006/wordml" xmlns:wps="http://schemas.microsoft.com/office/word/2010/wordprocessingShape" mc:Ignorable="w14 w15 w16se wp14">
+  <w15:person w15:author="Thierry Diffo">
+    <w15:presenceInfo w15:providerId="AD" w15:userId="S-1-5-21-484763869-2077806209-682003330-6162"/>
+  </w15:person>
+  <w15:person w15:author="Vincent FACHERO, Ifremer Brest PDG-IRSI-ISI, 02">
     <w15:presenceInfo w15:providerId="AD" w15:userId="S-1-5-21-500109986-1412980772-1848903544-3209911"/>
   </w15:person>
 </w15:people>
 </file>
 
 <file path=word/styles.xml><?xml version="1.0" encoding="utf-8"?>
-<w:styles xmlns:mc="http://schemas.openxmlformats.org/markup-compatibility/2006" xmlns:r="http://schemas.openxmlformats.org/officeDocument/2006/relationships" xmlns:w="http://schemas.openxmlformats.org/wordprocessingml/2006/main" xmlns:w14="http://schemas.microsoft.com/office/word/2010/wordml" xmlns:w15="http://schemas.microsoft.com/office/word/2012/wordml" xmlns:w16cex="http://schemas.microsoft.com/office/word/2018/wordml/cex" xmlns:w16cid="http://schemas.microsoft.com/office/word/2016/wordml/cid" xmlns:w16="http://schemas.microsoft.com/office/word/2018/wordml" xmlns:w16sdtdh="http://schemas.microsoft.com/office/word/2020/wordml/sdtdatahash" xmlns:w16se="http://schemas.microsoft.com/office/word/2015/wordml/symex" mc:Ignorable="w14 w15 w16se w16cid w16 w16cex w16sdtdh">
+<w:styles xmlns:mc="http://schemas.openxmlformats.org/markup-compatibility/2006" xmlns:r="http://schemas.openxmlformats.org/officeDocument/2006/relationships" xmlns:w="http://schemas.openxmlformats.org/wordprocessingml/2006/main" xmlns:w14="http://schemas.microsoft.com/office/word/2010/wordml" xmlns:w15="http://schemas.microsoft.com/office/word/2012/wordml" xmlns:w16se="http://schemas.microsoft.com/office/word/2015/wordml/symex" mc:Ignorable="w14 w15 w16se">
   <w:docDefaults>
     <w:rPrDefault>
       <w:rPr>
@@ -21258,7 +21379,7 @@
       </w:pPr>
     </w:pPrDefault>
   </w:docDefaults>
-  <w:latentStyles w:defLockedState="0" w:defUIPriority="99" w:defSemiHidden="0" w:defUnhideWhenUsed="0" w:defQFormat="0" w:count="376">
+  <w:latentStyles w:defLockedState="0" w:defUIPriority="99" w:defSemiHidden="0" w:defUnhideWhenUsed="0" w:defQFormat="0" w:count="371">
     <w:lsdException w:name="Normal" w:uiPriority="0" w:qFormat="1"/>
     <w:lsdException w:name="heading 1" w:uiPriority="9" w:qFormat="1"/>
     <w:lsdException w:name="heading 2" w:semiHidden="1" w:uiPriority="9" w:unhideWhenUsed="1" w:qFormat="1"/>
@@ -21630,11 +21751,6 @@
     <w:lsdException w:name="List Table 5 Dark Accent 6" w:uiPriority="50"/>
     <w:lsdException w:name="List Table 6 Colorful Accent 6" w:uiPriority="51"/>
     <w:lsdException w:name="List Table 7 Colorful Accent 6" w:uiPriority="52"/>
-    <w:lsdException w:name="Mention" w:semiHidden="1" w:unhideWhenUsed="1"/>
-    <w:lsdException w:name="Smart Hyperlink" w:semiHidden="1" w:unhideWhenUsed="1"/>
-    <w:lsdException w:name="Hashtag" w:semiHidden="1" w:unhideWhenUsed="1"/>
-    <w:lsdException w:name="Unresolved Mention" w:semiHidden="1" w:unhideWhenUsed="1"/>
-    <w:lsdException w:name="Smart Link" w:semiHidden="1" w:unhideWhenUsed="1"/>
   </w:latentStyles>
   <w:style w:type="paragraph" w:default="1" w:styleId="Normal">
     <w:name w:val="Normal"/>
@@ -21707,7 +21823,7 @@
       <w:u w:val="single"/>
     </w:rPr>
   </w:style>
-  <w:style w:type="character" w:styleId="Mentionnonrsolue">
+  <w:style w:type="character" w:customStyle="1" w:styleId="UnresolvedMention">
     <w:name w:val="Unresolved Mention"/>
     <w:basedOn w:val="Policepardfaut"/>
     <w:uiPriority w:val="99"/>
@@ -21785,6 +21901,36 @@
       <w:bCs/>
       <w:sz w:val="20"/>
       <w:szCs w:val="20"/>
+    </w:rPr>
+  </w:style>
+  <w:style w:type="paragraph" w:styleId="Textedebulles">
+    <w:name w:val="Balloon Text"/>
+    <w:basedOn w:val="Normal"/>
+    <w:link w:val="TextedebullesCar"/>
+    <w:uiPriority w:val="99"/>
+    <w:semiHidden/>
+    <w:unhideWhenUsed/>
+    <w:rsid w:val="007B7B69"/>
+    <w:pPr>
+      <w:spacing w:after="0" w:line="240" w:lineRule="auto"/>
+    </w:pPr>
+    <w:rPr>
+      <w:rFonts w:ascii="Segoe UI" w:hAnsi="Segoe UI" w:cs="Segoe UI"/>
+      <w:sz w:val="18"/>
+      <w:szCs w:val="18"/>
+    </w:rPr>
+  </w:style>
+  <w:style w:type="character" w:customStyle="1" w:styleId="TextedebullesCar">
+    <w:name w:val="Texte de bulles Car"/>
+    <w:basedOn w:val="Policepardfaut"/>
+    <w:link w:val="Textedebulles"/>
+    <w:uiPriority w:val="99"/>
+    <w:semiHidden/>
+    <w:rsid w:val="007B7B69"/>
+    <w:rPr>
+      <w:rFonts w:ascii="Segoe UI" w:hAnsi="Segoe UI" w:cs="Segoe UI"/>
+      <w:sz w:val="18"/>
+      <w:szCs w:val="18"/>
     </w:rPr>
   </w:style>
 </w:styles>
@@ -22090,7 +22236,7 @@
 </file>
 
 <file path=customXml/itemProps1.xml><?xml version="1.0" encoding="utf-8"?>
-<ds:datastoreItem xmlns:ds="http://schemas.openxmlformats.org/officeDocument/2006/customXml" ds:itemID="{A606CE79-79C8-4935-B7DD-580188E8074B}">
+<ds:datastoreItem xmlns:ds="http://schemas.openxmlformats.org/officeDocument/2006/customXml" ds:itemID="{3D6700B7-8846-4DF7-92A8-B7AA72176CDD}">
   <ds:schemaRefs>
     <ds:schemaRef ds:uri="http://schemas.openxmlformats.org/officeDocument/2006/bibliography"/>
   </ds:schemaRefs>

</xml_diff>